<commit_message>
Update The Ripple Effect - SYSTEM REQUIREMENTS.docx
</commit_message>
<xml_diff>
--- a/Documentation/The Ripple Effect - SYSTEM REQUIREMENTS.docx
+++ b/Documentation/The Ripple Effect - SYSTEM REQUIREMENTS.docx
@@ -1,6 +1,6 @@
 
 <file path=word/document.xml><?xml version="1.0" encoding="utf-8"?>
-<w:document xmlns:wpc="http://schemas.microsoft.com/office/word/2010/wordprocessingCanvas" xmlns:cx="http://schemas.microsoft.com/office/drawing/2014/chartex" xmlns:cx1="http://schemas.microsoft.com/office/drawing/2015/9/8/chartex" xmlns:cx2="http://schemas.microsoft.com/office/drawing/2015/10/21/chartex" xmlns:cx3="http://schemas.microsoft.com/office/drawing/2016/5/9/chartex" xmlns:cx4="http://schemas.microsoft.com/office/drawing/2016/5/10/chartex" xmlns:cx5="http://schemas.microsoft.com/office/drawing/2016/5/11/chartex" xmlns:cx6="http://schemas.microsoft.com/office/drawing/2016/5/12/chartex" xmlns:cx7="http://schemas.microsoft.com/office/drawing/2016/5/13/chartex" xmlns:cx8="http://schemas.microsoft.com/office/drawing/2016/5/14/chartex" xmlns:mc="http://schemas.openxmlformats.org/markup-compatibility/2006" xmlns:aink="http://schemas.microsoft.com/office/drawing/2016/ink" xmlns:am3d="http://schemas.microsoft.com/office/drawing/2017/model3d" xmlns:o="urn:schemas-microsoft-com:office:office" xmlns:oel="http://schemas.microsoft.com/office/2019/extlst" xmlns:r="http://schemas.openxmlformats.org/officeDocument/2006/relationships" xmlns:m="http://schemas.openxmlformats.org/officeDocument/2006/math" xmlns:v="urn:schemas-microsoft-com:vml" xmlns:wp14="http://schemas.microsoft.com/office/word/2010/wordprocessingDrawing" xmlns:wp="http://schemas.openxmlformats.org/drawingml/2006/wordprocessingDrawing" xmlns:w10="urn:schemas-microsoft-com:office:word" xmlns:w="http://schemas.openxmlformats.org/wordprocessingml/2006/main" xmlns:w14="http://schemas.microsoft.com/office/word/2010/wordml" xmlns:w15="http://schemas.microsoft.com/office/word/2012/wordml" xmlns:w16cex="http://schemas.microsoft.com/office/word/2018/wordml/cex" xmlns:w16cid="http://schemas.microsoft.com/office/word/2016/wordml/cid" xmlns:w16="http://schemas.microsoft.com/office/word/2018/wordml" xmlns:w16du="http://schemas.microsoft.com/office/word/2023/wordml/word16du" xmlns:w16sdtdh="http://schemas.microsoft.com/office/word/2020/wordml/sdtdatahash" xmlns:w16se="http://schemas.microsoft.com/office/word/2015/wordml/symex" xmlns:wpg="http://schemas.microsoft.com/office/word/2010/wordprocessingGroup" xmlns:wpi="http://schemas.microsoft.com/office/word/2010/wordprocessingInk" xmlns:wne="http://schemas.microsoft.com/office/word/2006/wordml" xmlns:wps="http://schemas.microsoft.com/office/word/2010/wordprocessingShape" mc:Ignorable="w14 w15 w16se w16cid w16 w16cex w16sdtdh w16du wp14">
+<w:document xmlns:wpc="http://schemas.microsoft.com/office/word/2010/wordprocessingCanvas" xmlns:cx="http://schemas.microsoft.com/office/drawing/2014/chartex" xmlns:cx1="http://schemas.microsoft.com/office/drawing/2015/9/8/chartex" xmlns:cx2="http://schemas.microsoft.com/office/drawing/2015/10/21/chartex" xmlns:cx3="http://schemas.microsoft.com/office/drawing/2016/5/9/chartex" xmlns:cx4="http://schemas.microsoft.com/office/drawing/2016/5/10/chartex" xmlns:cx5="http://schemas.microsoft.com/office/drawing/2016/5/11/chartex" xmlns:cx6="http://schemas.microsoft.com/office/drawing/2016/5/12/chartex" xmlns:cx7="http://schemas.microsoft.com/office/drawing/2016/5/13/chartex" xmlns:cx8="http://schemas.microsoft.com/office/drawing/2016/5/14/chartex" xmlns:mc="http://schemas.openxmlformats.org/markup-compatibility/2006" xmlns:aink="http://schemas.microsoft.com/office/drawing/2016/ink" xmlns:am3d="http://schemas.microsoft.com/office/drawing/2017/model3d" xmlns:o="urn:schemas-microsoft-com:office:office" xmlns:oel="http://schemas.microsoft.com/office/2019/extlst" xmlns:r="http://schemas.openxmlformats.org/officeDocument/2006/relationships" xmlns:m="http://schemas.openxmlformats.org/officeDocument/2006/math" xmlns:v="urn:schemas-microsoft-com:vml" xmlns:wp14="http://schemas.microsoft.com/office/word/2010/wordprocessingDrawing" xmlns:wp="http://schemas.openxmlformats.org/drawingml/2006/wordprocessingDrawing" xmlns:w10="urn:schemas-microsoft-com:office:word" xmlns:w="http://schemas.openxmlformats.org/wordprocessingml/2006/main" xmlns:w14="http://schemas.microsoft.com/office/word/2010/wordml" xmlns:w15="http://schemas.microsoft.com/office/word/2012/wordml" xmlns:w16cex="http://schemas.microsoft.com/office/word/2018/wordml/cex" xmlns:w16cid="http://schemas.microsoft.com/office/word/2016/wordml/cid" xmlns:w16="http://schemas.microsoft.com/office/word/2018/wordml" xmlns:w16du="http://schemas.microsoft.com/office/word/2023/wordml/word16du" xmlns:w16sdtdh="http://schemas.microsoft.com/office/word/2020/wordml/sdtdatahash" xmlns:w16sdtfl="http://schemas.microsoft.com/office/word/2024/wordml/sdtformatlock" xmlns:w16se="http://schemas.microsoft.com/office/word/2015/wordml/symex" xmlns:wpg="http://schemas.microsoft.com/office/word/2010/wordprocessingGroup" xmlns:wpi="http://schemas.microsoft.com/office/word/2010/wordprocessingInk" xmlns:wne="http://schemas.microsoft.com/office/word/2006/wordml" xmlns:wps="http://schemas.microsoft.com/office/word/2010/wordprocessingShape" mc:Ignorable="w14 w15 w16se w16cid w16 w16cex w16sdtdh w16sdtfl w16du wp14">
   <w:body>
     <w:p>
       <w:pPr>
@@ -62,12 +62,14 @@
     <w:p>
       <w:pPr>
         <w:rPr>
+          <w:color w:val="2E74B5" w:themeColor="accent5" w:themeShade="BF"/>
           <w:sz w:val="23"/>
           <w:szCs w:val="23"/>
         </w:rPr>
       </w:pPr>
       <w:r>
         <w:rPr>
+          <w:color w:val="2E74B5" w:themeColor="accent5" w:themeShade="BF"/>
           <w:sz w:val="23"/>
           <w:szCs w:val="23"/>
         </w:rPr>
@@ -121,11 +123,13 @@
       <w:pPr>
         <w:jc w:val="both"/>
         <w:rPr>
-          <w:lang w:val="en-US"/>
-        </w:rPr>
-      </w:pPr>
-      <w:r>
-        <w:rPr>
+          <w:color w:val="2E74B5" w:themeColor="accent5" w:themeShade="BF"/>
+          <w:lang w:val="en-US"/>
+        </w:rPr>
+      </w:pPr>
+      <w:r>
+        <w:rPr>
+          <w:color w:val="2E74B5" w:themeColor="accent5" w:themeShade="BF"/>
           <w:lang w:val="en-US"/>
         </w:rPr>
         <w:t xml:space="preserve">In your business case you specified a few objectives.  These were real-world issues that your software intervention will address.  In this section you need to stipulate what you will do in your software to address these objectives.  E.g. the following objectives were stated in the business case:  </w:t>
@@ -135,6 +139,7 @@
       <w:pPr>
         <w:jc w:val="both"/>
         <w:rPr>
+          <w:color w:val="2E74B5" w:themeColor="accent5" w:themeShade="BF"/>
           <w:lang w:val="en-US"/>
         </w:rPr>
       </w:pPr>
@@ -148,11 +153,13 @@
         </w:numPr>
         <w:jc w:val="both"/>
         <w:rPr>
-          <w:lang w:val="en-US"/>
-        </w:rPr>
-      </w:pPr>
-      <w:r>
-        <w:rPr>
+          <w:color w:val="2E74B5" w:themeColor="accent5" w:themeShade="BF"/>
+          <w:lang w:val="en-US"/>
+        </w:rPr>
+      </w:pPr>
+      <w:r>
+        <w:rPr>
+          <w:color w:val="2E74B5" w:themeColor="accent5" w:themeShade="BF"/>
           <w:lang w:val="en-US"/>
         </w:rPr>
         <w:t>Replace the paper-based note-taking system used by healthcare workers with a digital alternative.</w:t>
@@ -167,11 +174,13 @@
         </w:numPr>
         <w:jc w:val="both"/>
         <w:rPr>
-          <w:lang w:val="en-US"/>
-        </w:rPr>
-      </w:pPr>
-      <w:r>
-        <w:rPr>
+          <w:color w:val="2E74B5" w:themeColor="accent5" w:themeShade="BF"/>
+          <w:lang w:val="en-US"/>
+        </w:rPr>
+      </w:pPr>
+      <w:r>
+        <w:rPr>
+          <w:color w:val="2E74B5" w:themeColor="accent5" w:themeShade="BF"/>
           <w:lang w:val="en-US"/>
         </w:rPr>
         <w:t>Ensure that notes cannot get lost, by providing an off-line saving system.</w:t>
@@ -186,11 +195,13 @@
         </w:numPr>
         <w:jc w:val="both"/>
         <w:rPr>
-          <w:lang w:val="en-US"/>
-        </w:rPr>
-      </w:pPr>
-      <w:r>
-        <w:rPr>
+          <w:color w:val="2E74B5" w:themeColor="accent5" w:themeShade="BF"/>
+          <w:lang w:val="en-US"/>
+        </w:rPr>
+      </w:pPr>
+      <w:r>
+        <w:rPr>
+          <w:color w:val="2E74B5" w:themeColor="accent5" w:themeShade="BF"/>
           <w:lang w:val="en-US"/>
         </w:rPr>
         <w:t>Provide a central means by which to search through historic notes.</w:t>
@@ -200,19 +211,22 @@
       <w:pPr>
         <w:jc w:val="both"/>
         <w:rPr>
-          <w:lang w:val="en-US"/>
-        </w:rPr>
-      </w:pPr>
-    </w:p>
-    <w:p>
-      <w:pPr>
-        <w:jc w:val="both"/>
-        <w:rPr>
-          <w:lang w:val="en-US"/>
-        </w:rPr>
-      </w:pPr>
-      <w:r>
-        <w:rPr>
+          <w:color w:val="2E74B5" w:themeColor="accent5" w:themeShade="BF"/>
+          <w:lang w:val="en-US"/>
+        </w:rPr>
+      </w:pPr>
+    </w:p>
+    <w:p>
+      <w:pPr>
+        <w:jc w:val="both"/>
+        <w:rPr>
+          <w:color w:val="2E74B5" w:themeColor="accent5" w:themeShade="BF"/>
+          <w:lang w:val="en-US"/>
+        </w:rPr>
+      </w:pPr>
+      <w:r>
+        <w:rPr>
+          <w:color w:val="2E74B5" w:themeColor="accent5" w:themeShade="BF"/>
           <w:lang w:val="en-US"/>
         </w:rPr>
         <w:t>These objectives can then be discussed as follows in this section:</w:t>
@@ -222,20 +236,23 @@
       <w:pPr>
         <w:jc w:val="both"/>
         <w:rPr>
-          <w:lang w:val="en-US"/>
-        </w:rPr>
-      </w:pPr>
-    </w:p>
-    <w:p>
-      <w:pPr>
-        <w:jc w:val="both"/>
-        <w:rPr>
+          <w:color w:val="2E74B5" w:themeColor="accent5" w:themeShade="BF"/>
+          <w:lang w:val="en-US"/>
+        </w:rPr>
+      </w:pPr>
+    </w:p>
+    <w:p>
+      <w:pPr>
+        <w:jc w:val="both"/>
+        <w:rPr>
+          <w:color w:val="2E74B5" w:themeColor="accent5" w:themeShade="BF"/>
           <w:lang w:val="en-US"/>
         </w:rPr>
       </w:pPr>
       <w:proofErr w:type="gramStart"/>
       <w:r>
         <w:rPr>
+          <w:color w:val="2E74B5" w:themeColor="accent5" w:themeShade="BF"/>
           <w:lang w:val="en-US"/>
         </w:rPr>
         <w:t>In order to</w:t>
@@ -243,28 +260,48 @@
       <w:proofErr w:type="gramEnd"/>
       <w:r>
         <w:rPr>
-          <w:lang w:val="en-US"/>
-        </w:rPr>
-        <w:t xml:space="preserve"> the replace the paper-based note-taking system used by healthcare workers, an Android-based mobile application will be developed.  Android was chosen as it is the most widely used mobile operating system under the target group of healthcare workers.  A mobile application will ensure that the healthcare workers have access to the system wherever they may be working from on any given day.</w:t>
-      </w:r>
-    </w:p>
-    <w:p>
-      <w:pPr>
-        <w:jc w:val="both"/>
-        <w:rPr>
-          <w:lang w:val="en-US"/>
-        </w:rPr>
-      </w:pPr>
-    </w:p>
-    <w:p>
-      <w:pPr>
-        <w:jc w:val="both"/>
-        <w:rPr>
-          <w:lang w:val="en-US"/>
-        </w:rPr>
-      </w:pPr>
-      <w:r>
-        <w:rPr>
+          <w:color w:val="2E74B5" w:themeColor="accent5" w:themeShade="BF"/>
+          <w:lang w:val="en-US"/>
+        </w:rPr>
+        <w:t xml:space="preserve"> </w:t>
+      </w:r>
+      <w:proofErr w:type="gramStart"/>
+      <w:r>
+        <w:rPr>
+          <w:color w:val="2E74B5" w:themeColor="accent5" w:themeShade="BF"/>
+          <w:lang w:val="en-US"/>
+        </w:rPr>
+        <w:t>the replace</w:t>
+      </w:r>
+      <w:proofErr w:type="gramEnd"/>
+      <w:r>
+        <w:rPr>
+          <w:color w:val="2E74B5" w:themeColor="accent5" w:themeShade="BF"/>
+          <w:lang w:val="en-US"/>
+        </w:rPr>
+        <w:t xml:space="preserve"> the paper-based note-taking system used by healthcare workers, an Android-based mobile application will be developed.  Android was chosen as it is the most widely used mobile operating system under the target group of healthcare workers.  A mobile application will ensure that the healthcare workers have access to the system wherever they may be working from on any given day.</w:t>
+      </w:r>
+    </w:p>
+    <w:p>
+      <w:pPr>
+        <w:jc w:val="both"/>
+        <w:rPr>
+          <w:color w:val="2E74B5" w:themeColor="accent5" w:themeShade="BF"/>
+          <w:lang w:val="en-US"/>
+        </w:rPr>
+      </w:pPr>
+    </w:p>
+    <w:p>
+      <w:pPr>
+        <w:jc w:val="both"/>
+        <w:rPr>
+          <w:color w:val="2E74B5" w:themeColor="accent5" w:themeShade="BF"/>
+          <w:lang w:val="en-US"/>
+        </w:rPr>
+      </w:pPr>
+      <w:r>
+        <w:rPr>
+          <w:color w:val="2E74B5" w:themeColor="accent5" w:themeShade="BF"/>
           <w:lang w:val="en-US"/>
         </w:rPr>
         <w:t>Because of the mobile nature of the work of these healthcare workers, they frequently lose their notes.  A mobile application will be able to address this issue by saving the notes on the device itself.  Since the healthcare workers may be travelling in areas with little or no access to network connectivity, it is essential to save offline copies of any notes made.  Whenever the healthcare worker moves into an area with connectivity, the local notes will sync to a central server.  This also ensures that if a healthcare worker loses their phone, they do not lose their notes.</w:t>
@@ -274,25 +311,29 @@
       <w:pPr>
         <w:jc w:val="both"/>
         <w:rPr>
-          <w:lang w:val="en-US"/>
-        </w:rPr>
-      </w:pPr>
-    </w:p>
-    <w:p>
-      <w:pPr>
-        <w:jc w:val="both"/>
-        <w:rPr>
-          <w:lang w:val="en-US"/>
-        </w:rPr>
-      </w:pPr>
-      <w:r>
-        <w:rPr>
+          <w:color w:val="2E74B5" w:themeColor="accent5" w:themeShade="BF"/>
+          <w:lang w:val="en-US"/>
+        </w:rPr>
+      </w:pPr>
+    </w:p>
+    <w:p>
+      <w:pPr>
+        <w:jc w:val="both"/>
+        <w:rPr>
+          <w:color w:val="2E74B5" w:themeColor="accent5" w:themeShade="BF"/>
+          <w:lang w:val="en-US"/>
+        </w:rPr>
+      </w:pPr>
+      <w:r>
+        <w:rPr>
+          <w:color w:val="2E74B5" w:themeColor="accent5" w:themeShade="BF"/>
           <w:lang w:val="en-US"/>
         </w:rPr>
         <w:t xml:space="preserve">Currently, </w:t>
       </w:r>
       <w:r>
         <w:rPr>
+          <w:color w:val="2E74B5" w:themeColor="accent5" w:themeShade="BF"/>
           <w:lang w:val="en-US"/>
         </w:rPr>
         <w:t>if a healthcare worker needs to search through their notes, they need to search through a stack of papers.  If they need to give their manager access to their notes, it involves the manager rummaging through the same stack of notes.  A digital application will allow the notes to be easily searchable through a web-based interface.  A web-based interface was chosen for this aspect of the solution as the healthcare workers frequently check their notes only when they are back in the office.  This also allows the office-bound managers to easily access the notes of individual healthcare workers to search for trends.</w:t>
@@ -366,12 +407,14 @@
       <w:pPr>
         <w:jc w:val="both"/>
         <w:rPr>
+          <w:color w:val="2E74B5" w:themeColor="accent5" w:themeShade="BF"/>
           <w:sz w:val="23"/>
           <w:szCs w:val="23"/>
         </w:rPr>
       </w:pPr>
       <w:r>
         <w:rPr>
+          <w:color w:val="2E74B5" w:themeColor="accent5" w:themeShade="BF"/>
           <w:sz w:val="23"/>
           <w:szCs w:val="23"/>
         </w:rPr>
@@ -417,12 +460,14 @@
       <w:pPr>
         <w:jc w:val="both"/>
         <w:rPr>
+          <w:color w:val="2E74B5" w:themeColor="accent5" w:themeShade="BF"/>
           <w:sz w:val="23"/>
           <w:szCs w:val="23"/>
         </w:rPr>
       </w:pPr>
       <w:r>
         <w:rPr>
+          <w:color w:val="2E74B5" w:themeColor="accent5" w:themeShade="BF"/>
           <w:sz w:val="23"/>
           <w:szCs w:val="23"/>
         </w:rPr>
@@ -430,6 +475,7 @@
       </w:r>
       <w:r>
         <w:rPr>
+          <w:color w:val="2E74B5" w:themeColor="accent5" w:themeShade="BF"/>
           <w:sz w:val="23"/>
           <w:szCs w:val="23"/>
         </w:rPr>
@@ -437,6 +483,7 @@
       </w:r>
       <w:r>
         <w:rPr>
+          <w:color w:val="2E74B5" w:themeColor="accent5" w:themeShade="BF"/>
           <w:sz w:val="23"/>
           <w:szCs w:val="23"/>
         </w:rPr>
@@ -444,6 +491,7 @@
       </w:r>
       <w:r>
         <w:rPr>
+          <w:color w:val="2E74B5" w:themeColor="accent5" w:themeShade="BF"/>
           <w:sz w:val="23"/>
           <w:szCs w:val="23"/>
         </w:rPr>
@@ -489,12 +537,14 @@
       <w:pPr>
         <w:jc w:val="both"/>
         <w:rPr>
+          <w:color w:val="2E74B5" w:themeColor="accent5" w:themeShade="BF"/>
           <w:sz w:val="23"/>
           <w:szCs w:val="23"/>
         </w:rPr>
       </w:pPr>
       <w:r>
         <w:rPr>
+          <w:color w:val="2E74B5" w:themeColor="accent5" w:themeShade="BF"/>
           <w:sz w:val="23"/>
           <w:szCs w:val="23"/>
         </w:rPr>
@@ -538,12 +588,14 @@
       <w:pPr>
         <w:jc w:val="both"/>
         <w:rPr>
+          <w:color w:val="2E74B5" w:themeColor="accent5" w:themeShade="BF"/>
           <w:sz w:val="23"/>
           <w:szCs w:val="23"/>
         </w:rPr>
       </w:pPr>
       <w:r>
         <w:rPr>
+          <w:color w:val="2E74B5" w:themeColor="accent5" w:themeShade="BF"/>
           <w:sz w:val="23"/>
           <w:szCs w:val="23"/>
         </w:rPr>
@@ -551,6 +603,7 @@
       </w:r>
       <w:r>
         <w:rPr>
+          <w:color w:val="2E74B5" w:themeColor="accent5" w:themeShade="BF"/>
           <w:sz w:val="23"/>
           <w:szCs w:val="23"/>
         </w:rPr>
@@ -558,6 +611,7 @@
       </w:r>
       <w:r>
         <w:rPr>
+          <w:color w:val="2E74B5" w:themeColor="accent5" w:themeShade="BF"/>
           <w:sz w:val="23"/>
           <w:szCs w:val="23"/>
         </w:rPr>
@@ -626,11 +680,13 @@
       <w:pPr>
         <w:jc w:val="both"/>
         <w:rPr>
-          <w:lang w:val="en-US"/>
-        </w:rPr>
-      </w:pPr>
-      <w:r>
-        <w:rPr>
+          <w:color w:val="2E74B5" w:themeColor="accent5" w:themeShade="BF"/>
+          <w:lang w:val="en-US"/>
+        </w:rPr>
+      </w:pPr>
+      <w:r>
+        <w:rPr>
+          <w:color w:val="2E74B5" w:themeColor="accent5" w:themeShade="BF"/>
           <w:lang w:val="en-US"/>
         </w:rPr>
         <w:t>Business requirements, also known as stakeholder requirements specifications (</w:t>
@@ -638,6 +694,7 @@
       <w:proofErr w:type="spellStart"/>
       <w:r>
         <w:rPr>
+          <w:color w:val="2E74B5" w:themeColor="accent5" w:themeShade="BF"/>
           <w:lang w:val="en-US"/>
         </w:rPr>
         <w:t>StRS</w:t>
@@ -645,34 +702,32 @@
       <w:proofErr w:type="spellEnd"/>
       <w:r>
         <w:rPr>
-          <w:lang w:val="en-US"/>
-        </w:rPr>
-        <w:t>), describe the characteristics of a proposed system from the viewpoint of the system's end user</w:t>
-      </w:r>
-      <w:r>
-        <w:rPr>
-          <w:lang w:val="en-US"/>
-        </w:rPr>
-        <w:t>.  In this case, the system has two end-user types, namely healthcare workers and managers.  These two user types might have different needs from the system, e.g.:</w:t>
-      </w:r>
-    </w:p>
-    <w:p>
-      <w:pPr>
-        <w:jc w:val="both"/>
-        <w:rPr>
-          <w:lang w:val="en-US"/>
-        </w:rPr>
-      </w:pPr>
-    </w:p>
-    <w:p>
-      <w:pPr>
-        <w:jc w:val="both"/>
-        <w:rPr>
-          <w:lang w:val="en-US"/>
-        </w:rPr>
-      </w:pPr>
-      <w:r>
-        <w:rPr>
+          <w:color w:val="2E74B5" w:themeColor="accent5" w:themeShade="BF"/>
+          <w:lang w:val="en-US"/>
+        </w:rPr>
+        <w:t>), describe the characteristics of a proposed system from the viewpoint of the system's end user.  In this case, the system has two end-user types, namely healthcare workers and managers.  These two user types might have different needs from the system, e.g.:</w:t>
+      </w:r>
+    </w:p>
+    <w:p>
+      <w:pPr>
+        <w:jc w:val="both"/>
+        <w:rPr>
+          <w:color w:val="2E74B5" w:themeColor="accent5" w:themeShade="BF"/>
+          <w:lang w:val="en-US"/>
+        </w:rPr>
+      </w:pPr>
+    </w:p>
+    <w:p>
+      <w:pPr>
+        <w:jc w:val="both"/>
+        <w:rPr>
+          <w:color w:val="2E74B5" w:themeColor="accent5" w:themeShade="BF"/>
+          <w:lang w:val="en-US"/>
+        </w:rPr>
+      </w:pPr>
+      <w:r>
+        <w:rPr>
+          <w:color w:val="2E74B5" w:themeColor="accent5" w:themeShade="BF"/>
           <w:lang w:val="en-US"/>
         </w:rPr>
         <w:t xml:space="preserve">Healthcare workers require a system that is dependable and always available.  It should have an easy-to-use interface to facilitate simplified </w:t>
@@ -680,18 +735,21 @@
       <w:proofErr w:type="gramStart"/>
       <w:r>
         <w:rPr>
+          <w:color w:val="2E74B5" w:themeColor="accent5" w:themeShade="BF"/>
           <w:lang w:val="en-US"/>
         </w:rPr>
         <w:t>note</w:t>
       </w:r>
       <w:r>
         <w:rPr>
+          <w:color w:val="2E74B5" w:themeColor="accent5" w:themeShade="BF"/>
           <w:lang w:val="en-US"/>
         </w:rPr>
         <w:t>-</w:t>
       </w:r>
       <w:r>
         <w:rPr>
+          <w:color w:val="2E74B5" w:themeColor="accent5" w:themeShade="BF"/>
           <w:lang w:val="en-US"/>
         </w:rPr>
         <w:t>taking</w:t>
@@ -699,6 +757,7 @@
       <w:proofErr w:type="gramEnd"/>
       <w:r>
         <w:rPr>
+          <w:color w:val="2E74B5" w:themeColor="accent5" w:themeShade="BF"/>
           <w:lang w:val="en-US"/>
         </w:rPr>
         <w:t xml:space="preserve"> while the Healthcare workers are travelling.</w:t>
@@ -716,35 +775,41 @@
       <w:pPr>
         <w:jc w:val="both"/>
         <w:rPr>
-          <w:lang w:val="en-US"/>
-        </w:rPr>
-      </w:pPr>
-      <w:r>
-        <w:rPr>
+          <w:color w:val="2E74B5" w:themeColor="accent5" w:themeShade="BF"/>
+          <w:lang w:val="en-US"/>
+        </w:rPr>
+      </w:pPr>
+      <w:r>
+        <w:rPr>
+          <w:color w:val="2E74B5" w:themeColor="accent5" w:themeShade="BF"/>
           <w:lang w:val="en-US"/>
         </w:rPr>
         <w:t xml:space="preserve">Managers require centralized access to the </w:t>
       </w:r>
       <w:r>
         <w:rPr>
+          <w:color w:val="2E74B5" w:themeColor="accent5" w:themeShade="BF"/>
           <w:lang w:val="en-US"/>
         </w:rPr>
         <w:t>healthcare workers’ note</w:t>
       </w:r>
       <w:r>
         <w:rPr>
+          <w:color w:val="2E74B5" w:themeColor="accent5" w:themeShade="BF"/>
           <w:lang w:val="en-US"/>
         </w:rPr>
         <w:t>s.  The search interface should be clutter</w:t>
       </w:r>
       <w:r>
         <w:rPr>
+          <w:color w:val="2E74B5" w:themeColor="accent5" w:themeShade="BF"/>
           <w:lang w:val="en-US"/>
         </w:rPr>
         <w:t>-free and allow notes to be searchable according to key</w:t>
       </w:r>
       <w:r>
         <w:rPr>
+          <w:color w:val="2E74B5" w:themeColor="accent5" w:themeShade="BF"/>
           <w:lang w:val="en-US"/>
         </w:rPr>
         <w:t>words and filtered according to date ranges.</w:t>
@@ -867,11 +932,13 @@
       <w:pPr>
         <w:jc w:val="both"/>
         <w:rPr>
-          <w:lang w:val="en-US"/>
-        </w:rPr>
-      </w:pPr>
-      <w:r>
-        <w:rPr>
+          <w:color w:val="2E74B5" w:themeColor="accent5" w:themeShade="BF"/>
+          <w:lang w:val="en-US"/>
+        </w:rPr>
+      </w:pPr>
+      <w:r>
+        <w:rPr>
+          <w:color w:val="2E74B5" w:themeColor="accent5" w:themeShade="BF"/>
           <w:lang w:val="en-US"/>
         </w:rPr>
         <w:t xml:space="preserve">State which hardware and software tools will be used both in developing the application and in its use, </w:t>
@@ -879,6 +946,7 @@
       <w:proofErr w:type="spellStart"/>
       <w:r>
         <w:rPr>
+          <w:color w:val="2E74B5" w:themeColor="accent5" w:themeShade="BF"/>
           <w:lang w:val="en-US"/>
         </w:rPr>
         <w:t>e.g</w:t>
@@ -886,6 +954,7 @@
       <w:proofErr w:type="spellEnd"/>
       <w:r>
         <w:rPr>
+          <w:color w:val="2E74B5" w:themeColor="accent5" w:themeShade="BF"/>
           <w:lang w:val="en-US"/>
         </w:rPr>
         <w:t>:</w:t>
@@ -934,11 +1003,13 @@
         </w:numPr>
         <w:jc w:val="both"/>
         <w:rPr>
-          <w:lang w:val="en-US"/>
-        </w:rPr>
-      </w:pPr>
-      <w:r>
-        <w:rPr>
+          <w:color w:val="2E74B5" w:themeColor="accent5" w:themeShade="BF"/>
+          <w:lang w:val="en-US"/>
+        </w:rPr>
+      </w:pPr>
+      <w:r>
+        <w:rPr>
+          <w:color w:val="2E74B5" w:themeColor="accent5" w:themeShade="BF"/>
           <w:lang w:val="en-US"/>
         </w:rPr>
         <w:t>The mobile application will be developed using Android Studio.</w:t>
@@ -953,23 +1024,27 @@
         </w:numPr>
         <w:jc w:val="both"/>
         <w:rPr>
-          <w:lang w:val="en-US"/>
-        </w:rPr>
-      </w:pPr>
-      <w:r>
-        <w:rPr>
+          <w:color w:val="2E74B5" w:themeColor="accent5" w:themeShade="BF"/>
+          <w:lang w:val="en-US"/>
+        </w:rPr>
+      </w:pPr>
+      <w:r>
+        <w:rPr>
+          <w:color w:val="2E74B5" w:themeColor="accent5" w:themeShade="BF"/>
           <w:lang w:val="en-US"/>
         </w:rPr>
         <w:t>The web application will be developed using Microsoft Visual Studio 20</w:t>
       </w:r>
       <w:r>
         <w:rPr>
+          <w:color w:val="2E74B5" w:themeColor="accent5" w:themeShade="BF"/>
           <w:lang w:val="en-US"/>
         </w:rPr>
         <w:t>22</w:t>
       </w:r>
       <w:r>
         <w:rPr>
+          <w:color w:val="2E74B5" w:themeColor="accent5" w:themeShade="BF"/>
           <w:lang w:val="en-US"/>
         </w:rPr>
         <w:t>.</w:t>
@@ -984,11 +1059,13 @@
         </w:numPr>
         <w:jc w:val="both"/>
         <w:rPr>
-          <w:lang w:val="en-US"/>
-        </w:rPr>
-      </w:pPr>
-      <w:r>
-        <w:rPr>
+          <w:color w:val="2E74B5" w:themeColor="accent5" w:themeShade="BF"/>
+          <w:lang w:val="en-US"/>
+        </w:rPr>
+      </w:pPr>
+      <w:r>
+        <w:rPr>
+          <w:color w:val="2E74B5" w:themeColor="accent5" w:themeShade="BF"/>
           <w:lang w:val="en-US"/>
         </w:rPr>
         <w:t xml:space="preserve">The mobile application will use </w:t>
@@ -996,6 +1073,7 @@
       <w:proofErr w:type="spellStart"/>
       <w:r>
         <w:rPr>
+          <w:color w:val="2E74B5" w:themeColor="accent5" w:themeShade="BF"/>
           <w:lang w:val="en-US"/>
         </w:rPr>
         <w:t>Sqlite</w:t>
@@ -1003,6 +1081,7 @@
       <w:proofErr w:type="spellEnd"/>
       <w:r>
         <w:rPr>
+          <w:color w:val="2E74B5" w:themeColor="accent5" w:themeShade="BF"/>
           <w:lang w:val="en-US"/>
         </w:rPr>
         <w:t xml:space="preserve"> as its local storage medium.</w:t>
@@ -1017,23 +1096,27 @@
         </w:numPr>
         <w:jc w:val="both"/>
         <w:rPr>
-          <w:lang w:val="en-US"/>
-        </w:rPr>
-      </w:pPr>
-      <w:r>
-        <w:rPr>
+          <w:color w:val="2E74B5" w:themeColor="accent5" w:themeShade="BF"/>
+          <w:lang w:val="en-US"/>
+        </w:rPr>
+      </w:pPr>
+      <w:r>
+        <w:rPr>
+          <w:color w:val="2E74B5" w:themeColor="accent5" w:themeShade="BF"/>
           <w:lang w:val="en-US"/>
         </w:rPr>
         <w:t>Microsoft SQL Server 20</w:t>
       </w:r>
       <w:r>
         <w:rPr>
+          <w:color w:val="2E74B5" w:themeColor="accent5" w:themeShade="BF"/>
           <w:lang w:val="en-US"/>
         </w:rPr>
         <w:t>22</w:t>
       </w:r>
       <w:r>
         <w:rPr>
+          <w:color w:val="2E74B5" w:themeColor="accent5" w:themeShade="BF"/>
           <w:lang w:val="en-US"/>
         </w:rPr>
         <w:t xml:space="preserve"> will be used as the shared online database.</w:t>
@@ -1048,23 +1131,27 @@
         </w:numPr>
         <w:jc w:val="both"/>
         <w:rPr>
-          <w:lang w:val="en-US"/>
-        </w:rPr>
-      </w:pPr>
-      <w:r>
-        <w:rPr>
+          <w:color w:val="2E74B5" w:themeColor="accent5" w:themeShade="BF"/>
+          <w:lang w:val="en-US"/>
+        </w:rPr>
+      </w:pPr>
+      <w:r>
+        <w:rPr>
+          <w:color w:val="2E74B5" w:themeColor="accent5" w:themeShade="BF"/>
           <w:lang w:val="en-US"/>
         </w:rPr>
         <w:t>Connectivity between the app, the web interface and the shared database will be facilitated by developing a WCF Web service in Microsoft Visual Studio 20</w:t>
       </w:r>
       <w:r>
         <w:rPr>
+          <w:color w:val="2E74B5" w:themeColor="accent5" w:themeShade="BF"/>
           <w:lang w:val="en-US"/>
         </w:rPr>
         <w:t>22</w:t>
       </w:r>
       <w:r>
         <w:rPr>
+          <w:color w:val="2E74B5" w:themeColor="accent5" w:themeShade="BF"/>
           <w:lang w:val="en-US"/>
         </w:rPr>
         <w:t>.</w:t>
@@ -1079,17 +1166,20 @@
         </w:numPr>
         <w:jc w:val="both"/>
         <w:rPr>
-          <w:lang w:val="en-US"/>
-        </w:rPr>
-      </w:pPr>
-      <w:r>
-        <w:rPr>
+          <w:color w:val="2E74B5" w:themeColor="accent5" w:themeShade="BF"/>
+          <w:lang w:val="en-US"/>
+        </w:rPr>
+      </w:pPr>
+      <w:r>
+        <w:rPr>
+          <w:color w:val="2E74B5" w:themeColor="accent5" w:themeShade="BF"/>
           <w:lang w:val="en-US"/>
         </w:rPr>
         <w:t xml:space="preserve">The mobile application requires a phone running (at least) Android </w:t>
       </w:r>
       <w:r>
         <w:rPr>
+          <w:color w:val="2E74B5" w:themeColor="accent5" w:themeShade="BF"/>
           <w:lang w:val="en-US"/>
         </w:rPr>
         <w:t>12 (Snow Cone).</w:t>
@@ -1104,11 +1194,13 @@
         </w:numPr>
         <w:jc w:val="both"/>
         <w:rPr>
-          <w:lang w:val="en-US"/>
-        </w:rPr>
-      </w:pPr>
-      <w:r>
-        <w:rPr>
+          <w:color w:val="2E74B5" w:themeColor="accent5" w:themeShade="BF"/>
+          <w:lang w:val="en-US"/>
+        </w:rPr>
+      </w:pPr>
+      <w:r>
+        <w:rPr>
+          <w:color w:val="2E74B5" w:themeColor="accent5" w:themeShade="BF"/>
           <w:lang w:val="en-US"/>
         </w:rPr>
         <w:t>The web application will run in any browser but will be optimized for Google Chrome.</w:t>
@@ -1144,6 +1236,7 @@
       <w:pPr>
         <w:jc w:val="both"/>
         <w:rPr>
+          <w:color w:val="2E74B5" w:themeColor="accent5" w:themeShade="BF"/>
           <w:lang w:val="en-US"/>
         </w:rPr>
       </w:pPr>
@@ -1157,23 +1250,27 @@
         </w:numPr>
         <w:jc w:val="both"/>
         <w:rPr>
-          <w:lang w:val="en-US"/>
-        </w:rPr>
-      </w:pPr>
-      <w:r>
-        <w:rPr>
+          <w:color w:val="2E74B5" w:themeColor="accent5" w:themeShade="BF"/>
+          <w:lang w:val="en-US"/>
+        </w:rPr>
+      </w:pPr>
+      <w:r>
+        <w:rPr>
+          <w:color w:val="2E74B5" w:themeColor="accent5" w:themeShade="BF"/>
           <w:lang w:val="en-US"/>
         </w:rPr>
         <w:t xml:space="preserve">The mobile application requires a mobile phone with at least 1Gb or RAM, capable of running Android </w:t>
       </w:r>
       <w:r>
         <w:rPr>
+          <w:color w:val="2E74B5" w:themeColor="accent5" w:themeShade="BF"/>
           <w:lang w:val="en-US"/>
         </w:rPr>
         <w:t>12</w:t>
       </w:r>
       <w:r>
         <w:rPr>
+          <w:color w:val="2E74B5" w:themeColor="accent5" w:themeShade="BF"/>
           <w:lang w:val="en-US"/>
         </w:rPr>
         <w:t>.</w:t>
@@ -1188,11 +1285,13 @@
         </w:numPr>
         <w:jc w:val="both"/>
         <w:rPr>
-          <w:lang w:val="en-US"/>
-        </w:rPr>
-      </w:pPr>
-      <w:r>
-        <w:rPr>
+          <w:color w:val="2E74B5" w:themeColor="accent5" w:themeShade="BF"/>
+          <w:lang w:val="en-US"/>
+        </w:rPr>
+      </w:pPr>
+      <w:r>
+        <w:rPr>
+          <w:color w:val="2E74B5" w:themeColor="accent5" w:themeShade="BF"/>
           <w:lang w:val="en-US"/>
         </w:rPr>
         <w:t>The web application may be opened on any device with a web browser.</w:t>
@@ -1207,11 +1306,13 @@
         </w:numPr>
         <w:jc w:val="both"/>
         <w:rPr>
-          <w:lang w:val="en-US"/>
-        </w:rPr>
-      </w:pPr>
-      <w:r>
-        <w:rPr>
+          <w:color w:val="2E74B5" w:themeColor="accent5" w:themeShade="BF"/>
+          <w:lang w:val="en-US"/>
+        </w:rPr>
+      </w:pPr>
+      <w:r>
+        <w:rPr>
+          <w:color w:val="2E74B5" w:themeColor="accent5" w:themeShade="BF"/>
           <w:lang w:val="en-US"/>
         </w:rPr>
         <w:t>The web application and SQL Server will be hosted on a shared web server.</w:t>
@@ -1277,11 +1378,13 @@
     <w:p>
       <w:pPr>
         <w:rPr>
-          <w:lang w:val="en-US"/>
-        </w:rPr>
-      </w:pPr>
-      <w:r>
-        <w:rPr>
+          <w:color w:val="2E74B5" w:themeColor="accent5" w:themeShade="BF"/>
+          <w:lang w:val="en-US"/>
+        </w:rPr>
+      </w:pPr>
+      <w:r>
+        <w:rPr>
+          <w:color w:val="2E74B5" w:themeColor="accent5" w:themeShade="BF"/>
           <w:lang w:val="en-US"/>
         </w:rPr>
         <w:t>In this section, discuss any constraints that there might be on the system development and / or deployment process.  This can include things such as security, interface and performance constraints.</w:t>
@@ -1319,23 +1422,27 @@
     <w:p>
       <w:pPr>
         <w:rPr>
-          <w:lang w:val="en-US"/>
-        </w:rPr>
-      </w:pPr>
-      <w:r>
-        <w:rPr>
+          <w:color w:val="2E74B5" w:themeColor="accent5" w:themeShade="BF"/>
+          <w:lang w:val="en-US"/>
+        </w:rPr>
+      </w:pPr>
+      <w:r>
+        <w:rPr>
+          <w:color w:val="2E74B5" w:themeColor="accent5" w:themeShade="BF"/>
           <w:lang w:val="en-US"/>
         </w:rPr>
         <w:t xml:space="preserve">Discuss any issues related to the security of the </w:t>
       </w:r>
       <w:r>
         <w:rPr>
+          <w:color w:val="2E74B5" w:themeColor="accent5" w:themeShade="BF"/>
           <w:lang w:val="en-US"/>
         </w:rPr>
         <w:t>proposed</w:t>
       </w:r>
       <w:r>
         <w:rPr>
+          <w:color w:val="2E74B5" w:themeColor="accent5" w:themeShade="BF"/>
           <w:lang w:val="en-US"/>
         </w:rPr>
         <w:t xml:space="preserve"> system, e.g.</w:t>
@@ -1344,19 +1451,22 @@
     <w:p>
       <w:pPr>
         <w:rPr>
-          <w:lang w:val="en-US"/>
-        </w:rPr>
-      </w:pPr>
-    </w:p>
-    <w:p>
-      <w:pPr>
-        <w:jc w:val="both"/>
-        <w:rPr>
-          <w:lang w:val="en-US"/>
-        </w:rPr>
-      </w:pPr>
-      <w:r>
-        <w:rPr>
+          <w:color w:val="2E74B5" w:themeColor="accent5" w:themeShade="BF"/>
+          <w:lang w:val="en-US"/>
+        </w:rPr>
+      </w:pPr>
+    </w:p>
+    <w:p>
+      <w:pPr>
+        <w:jc w:val="both"/>
+        <w:rPr>
+          <w:color w:val="2E74B5" w:themeColor="accent5" w:themeShade="BF"/>
+          <w:lang w:val="en-US"/>
+        </w:rPr>
+      </w:pPr>
+      <w:r>
+        <w:rPr>
+          <w:color w:val="2E74B5" w:themeColor="accent5" w:themeShade="BF"/>
           <w:lang w:val="en-US"/>
         </w:rPr>
         <w:t>The notes taken by the healthcare workers might be of a sensitive nature, as they contain information regarding patients seen by the healthcare workers.  Therefore, care must be taken to encrypt the notes both on the phone and the server and to ensure that users should provide a username and password when accessing the system.  The username and password should also be encrypted.</w:t>
@@ -1443,11 +1553,13 @@
     <w:p>
       <w:pPr>
         <w:rPr>
-          <w:lang w:val="en-US"/>
-        </w:rPr>
-      </w:pPr>
-      <w:r>
-        <w:rPr>
+          <w:color w:val="2E74B5" w:themeColor="accent5" w:themeShade="BF"/>
+          <w:lang w:val="en-US"/>
+        </w:rPr>
+      </w:pPr>
+      <w:r>
+        <w:rPr>
+          <w:color w:val="2E74B5" w:themeColor="accent5" w:themeShade="BF"/>
           <w:lang w:val="en-US"/>
         </w:rPr>
         <w:t>Discuss any issue related to the interface of the proposed system, e.g.</w:t>
@@ -1456,19 +1568,22 @@
     <w:p>
       <w:pPr>
         <w:rPr>
-          <w:lang w:val="en-US"/>
-        </w:rPr>
-      </w:pPr>
-    </w:p>
-    <w:p>
-      <w:pPr>
-        <w:jc w:val="both"/>
-        <w:rPr>
-          <w:lang w:val="en-US"/>
-        </w:rPr>
-      </w:pPr>
-      <w:r>
-        <w:rPr>
+          <w:color w:val="2E74B5" w:themeColor="accent5" w:themeShade="BF"/>
+          <w:lang w:val="en-US"/>
+        </w:rPr>
+      </w:pPr>
+    </w:p>
+    <w:p>
+      <w:pPr>
+        <w:jc w:val="both"/>
+        <w:rPr>
+          <w:color w:val="2E74B5" w:themeColor="accent5" w:themeShade="BF"/>
+          <w:lang w:val="en-US"/>
+        </w:rPr>
+      </w:pPr>
+      <w:r>
+        <w:rPr>
+          <w:color w:val="2E74B5" w:themeColor="accent5" w:themeShade="BF"/>
           <w:lang w:val="en-US"/>
         </w:rPr>
         <w:t>The mobile interface needs to be user-friendly as it may be used by health care workers who are not technically savvy.  The web interface should be responsive so that users have the choice to view the pages on a desktop, tablet or phone.</w:t>
@@ -1517,6 +1632,7 @@
       </w:pPr>
       <w:r>
         <w:rPr>
+          <w:color w:val="2E74B5" w:themeColor="accent5" w:themeShade="BF"/>
           <w:lang w:val="en-US"/>
         </w:rPr>
         <w:t>The system should be optimized to ensure that searches through the web interface are fast and efficient.  The mobile application should be optimized for use on low end mobile devices with low memory capacity and older processors.</w:t>
@@ -1562,32 +1678,16 @@
       <w:pPr>
         <w:jc w:val="both"/>
         <w:rPr>
-          <w:lang w:val="en-US"/>
-        </w:rPr>
-      </w:pPr>
-      <w:r>
-        <w:rPr>
-          <w:lang w:val="en-US"/>
-        </w:rPr>
-        <w:t>The purpose of a use case diagram in UML is to demonstrate the different ways that a user might interact with a system.</w:t>
-      </w:r>
-      <w:r>
-        <w:rPr>
-          <w:lang w:val="en-US"/>
-        </w:rPr>
-        <w:t xml:space="preserve">  A</w:t>
-      </w:r>
-      <w:r>
-        <w:rPr>
-          <w:lang w:val="en-US"/>
-        </w:rPr>
-        <w:t xml:space="preserve"> use case diagram can summarize the details of your system's users (also known as actors) and their interactions with the system.</w:t>
-      </w:r>
-      <w:r>
-        <w:rPr>
-          <w:lang w:val="en-US"/>
-        </w:rPr>
-        <w:t xml:space="preserve">  </w:t>
+          <w:color w:val="2E74B5" w:themeColor="accent5" w:themeShade="BF"/>
+          <w:lang w:val="en-US"/>
+        </w:rPr>
+      </w:pPr>
+      <w:r>
+        <w:rPr>
+          <w:color w:val="2E74B5" w:themeColor="accent5" w:themeShade="BF"/>
+          <w:lang w:val="en-US"/>
+        </w:rPr>
+        <w:t xml:space="preserve">The purpose of a use case diagram in UML is to demonstrate the different ways that a user might interact with a system.  A use case diagram can summarize the details of your system's users (also known as actors) and their interactions with the system.  </w:t>
       </w:r>
     </w:p>
     <w:p>
@@ -1606,6 +1706,7 @@
           <w:bCs/>
           <w:i/>
           <w:iCs/>
+          <w:color w:val="2E74B5" w:themeColor="accent5" w:themeShade="BF"/>
           <w:lang w:val="en-US"/>
         </w:rPr>
       </w:pPr>
@@ -1615,6 +1716,7 @@
           <w:bCs/>
           <w:i/>
           <w:iCs/>
+          <w:color w:val="2E74B5" w:themeColor="accent5" w:themeShade="BF"/>
           <w:lang w:val="en-US"/>
         </w:rPr>
         <w:t>Example:</w:t>
@@ -1624,31 +1726,36 @@
       <w:pPr>
         <w:jc w:val="both"/>
         <w:rPr>
-          <w:lang w:val="en-US"/>
-        </w:rPr>
-      </w:pPr>
-    </w:p>
-    <w:p>
-      <w:pPr>
-        <w:jc w:val="both"/>
-        <w:rPr>
-          <w:lang w:val="en-US"/>
-        </w:rPr>
-      </w:pPr>
-      <w:r>
-        <w:rPr>
+          <w:color w:val="2E74B5" w:themeColor="accent5" w:themeShade="BF"/>
+          <w:lang w:val="en-US"/>
+        </w:rPr>
+      </w:pPr>
+    </w:p>
+    <w:p>
+      <w:pPr>
+        <w:jc w:val="both"/>
+        <w:rPr>
+          <w:color w:val="2E74B5" w:themeColor="accent5" w:themeShade="BF"/>
+          <w:lang w:val="en-US"/>
+        </w:rPr>
+      </w:pPr>
+      <w:r>
+        <w:rPr>
+          <w:color w:val="2E74B5" w:themeColor="accent5" w:themeShade="BF"/>
           <w:lang w:val="en-US"/>
         </w:rPr>
         <w:t>Figure 1</w:t>
       </w:r>
       <w:r>
         <w:rPr>
+          <w:color w:val="2E74B5" w:themeColor="accent5" w:themeShade="BF"/>
           <w:lang w:val="en-US"/>
         </w:rPr>
         <w:t>.1</w:t>
       </w:r>
       <w:r>
         <w:rPr>
+          <w:color w:val="2E74B5" w:themeColor="accent5" w:themeShade="BF"/>
           <w:lang w:val="en-US"/>
         </w:rPr>
         <w:t xml:space="preserve"> presents a high-level use case diagram of the proposed system and its users.</w:t>
@@ -1723,27 +1830,14 @@
       <w:r>
         <w:t xml:space="preserve">Figure </w:t>
       </w:r>
-      <w:r>
-        <w:fldChar w:fldCharType="begin"/>
-      </w:r>
-      <w:r>
-        <w:instrText xml:space="preserve"> SEQ Figure \* ARABIC </w:instrText>
-      </w:r>
-      <w:r>
-        <w:fldChar w:fldCharType="separate"/>
-      </w:r>
-      <w:r>
-        <w:rPr>
-          <w:noProof/>
-        </w:rPr>
-        <w:t>1</w:t>
-      </w:r>
-      <w:r>
-        <w:rPr>
-          <w:noProof/>
-        </w:rPr>
-        <w:fldChar w:fldCharType="end"/>
-      </w:r>
+      <w:fldSimple w:instr=" SEQ Figure \* ARABIC ">
+        <w:r>
+          <w:rPr>
+            <w:noProof/>
+          </w:rPr>
+          <w:t>1</w:t>
+        </w:r>
+      </w:fldSimple>
       <w:r>
         <w:rPr>
           <w:noProof/>
@@ -1798,83 +1892,97 @@
       <w:pPr>
         <w:jc w:val="both"/>
         <w:rPr>
-          <w:lang w:val="en-US"/>
-        </w:rPr>
-      </w:pPr>
-      <w:r>
-        <w:rPr>
+          <w:color w:val="2E74B5" w:themeColor="accent5" w:themeShade="BF"/>
+          <w:lang w:val="en-US"/>
+        </w:rPr>
+      </w:pPr>
+      <w:r>
+        <w:rPr>
+          <w:color w:val="2E74B5" w:themeColor="accent5" w:themeShade="BF"/>
           <w:lang w:val="en-US"/>
         </w:rPr>
         <w:t xml:space="preserve">This section should present </w:t>
       </w:r>
       <w:r>
         <w:rPr>
+          <w:color w:val="2E74B5" w:themeColor="accent5" w:themeShade="BF"/>
           <w:lang w:val="en-US"/>
         </w:rPr>
         <w:t>your (planned)</w:t>
       </w:r>
       <w:r>
         <w:rPr>
+          <w:color w:val="2E74B5" w:themeColor="accent5" w:themeShade="BF"/>
           <w:lang w:val="en-US"/>
         </w:rPr>
         <w:t xml:space="preserve"> UML </w:t>
       </w:r>
       <w:r>
         <w:rPr>
+          <w:color w:val="2E74B5" w:themeColor="accent5" w:themeShade="BF"/>
           <w:lang w:val="en-US"/>
         </w:rPr>
         <w:t>c</w:t>
       </w:r>
       <w:r>
         <w:rPr>
+          <w:color w:val="2E74B5" w:themeColor="accent5" w:themeShade="BF"/>
           <w:lang w:val="en-US"/>
         </w:rPr>
         <w:t xml:space="preserve">lass </w:t>
       </w:r>
       <w:r>
         <w:rPr>
+          <w:color w:val="2E74B5" w:themeColor="accent5" w:themeShade="BF"/>
           <w:lang w:val="en-US"/>
         </w:rPr>
         <w:t>m</w:t>
       </w:r>
       <w:r>
         <w:rPr>
+          <w:color w:val="2E74B5" w:themeColor="accent5" w:themeShade="BF"/>
           <w:lang w:val="en-US"/>
         </w:rPr>
         <w:t>odel.  If you have not yet started your system development, you may draw the diagram using a stand-alone tool, such as Visio.  Alternatively, if you have already started development</w:t>
       </w:r>
       <w:r>
         <w:rPr>
+          <w:color w:val="2E74B5" w:themeColor="accent5" w:themeShade="BF"/>
           <w:lang w:val="en-US"/>
         </w:rPr>
         <w:t>,</w:t>
       </w:r>
       <w:r>
         <w:rPr>
+          <w:color w:val="2E74B5" w:themeColor="accent5" w:themeShade="BF"/>
           <w:lang w:val="en-US"/>
         </w:rPr>
         <w:t xml:space="preserve"> you may use the class diagram created for you by tools such as Visual Studio.</w:t>
       </w:r>
       <w:r>
         <w:rPr>
+          <w:color w:val="2E74B5" w:themeColor="accent5" w:themeShade="BF"/>
           <w:lang w:val="en-US"/>
         </w:rPr>
         <w:t xml:space="preserve">  This does not need to be the final version of your UML class model</w:t>
       </w:r>
       <w:r>
         <w:rPr>
+          <w:color w:val="2E74B5" w:themeColor="accent5" w:themeShade="BF"/>
           <w:lang w:val="en-US"/>
         </w:rPr>
         <w:t xml:space="preserve"> as you’ll be able to update the diagram in your final, combined report at the end of the semester</w:t>
       </w:r>
       <w:r>
         <w:rPr>
+          <w:color w:val="2E74B5" w:themeColor="accent5" w:themeShade="BF"/>
           <w:lang w:val="en-US"/>
         </w:rPr>
         <w:t>.</w:t>
       </w:r>
       <w:r>
         <w:rPr>
+          <w:color w:val="2E74B5" w:themeColor="accent5" w:themeShade="BF"/>
           <w:lang w:val="en-US"/>
         </w:rPr>
         <w:t xml:space="preserve">  The number of classes in your diagram tends to align with the number of tables in your database.</w:t>
@@ -1883,6 +1991,7 @@
     <w:p>
       <w:pPr>
         <w:rPr>
+          <w:color w:val="2E74B5" w:themeColor="accent5" w:themeShade="BF"/>
           <w:sz w:val="28"/>
           <w:szCs w:val="28"/>
           <w:lang w:val="en-US"/>
@@ -1896,6 +2005,7 @@
           <w:bCs/>
           <w:i/>
           <w:iCs/>
+          <w:color w:val="2E74B5" w:themeColor="accent5" w:themeShade="BF"/>
           <w:lang w:val="en-US"/>
         </w:rPr>
       </w:pPr>
@@ -1905,6 +2015,7 @@
           <w:bCs/>
           <w:i/>
           <w:iCs/>
+          <w:color w:val="2E74B5" w:themeColor="accent5" w:themeShade="BF"/>
           <w:lang w:val="en-US"/>
         </w:rPr>
         <w:t>Example:</w:t>
@@ -1913,30 +2024,35 @@
     <w:p>
       <w:pPr>
         <w:rPr>
-          <w:lang w:val="en-US"/>
-        </w:rPr>
-      </w:pPr>
-    </w:p>
-    <w:p>
-      <w:pPr>
-        <w:rPr>
-          <w:lang w:val="en-US"/>
-        </w:rPr>
-      </w:pPr>
-      <w:r>
-        <w:rPr>
+          <w:color w:val="2E74B5" w:themeColor="accent5" w:themeShade="BF"/>
+          <w:lang w:val="en-US"/>
+        </w:rPr>
+      </w:pPr>
+    </w:p>
+    <w:p>
+      <w:pPr>
+        <w:rPr>
+          <w:color w:val="2E74B5" w:themeColor="accent5" w:themeShade="BF"/>
+          <w:lang w:val="en-US"/>
+        </w:rPr>
+      </w:pPr>
+      <w:r>
+        <w:rPr>
+          <w:color w:val="2E74B5" w:themeColor="accent5" w:themeShade="BF"/>
           <w:lang w:val="en-US"/>
         </w:rPr>
         <w:t>Figure 1.</w:t>
       </w:r>
       <w:r>
         <w:rPr>
+          <w:color w:val="2E74B5" w:themeColor="accent5" w:themeShade="BF"/>
           <w:lang w:val="en-US"/>
         </w:rPr>
         <w:t>2</w:t>
       </w:r>
       <w:r>
         <w:rPr>
+          <w:color w:val="2E74B5" w:themeColor="accent5" w:themeShade="BF"/>
           <w:lang w:val="en-US"/>
         </w:rPr>
         <w:t xml:space="preserve"> represents the UML class diagram of the YOURPLANNEDSYSTEMNAME system.</w:t>
@@ -2021,27 +2137,14 @@
       <w:r>
         <w:fldChar w:fldCharType="end"/>
       </w:r>
-      <w:r>
-        <w:fldChar w:fldCharType="begin"/>
-      </w:r>
-      <w:r>
-        <w:instrText xml:space="preserve"> SEQ Figure \* ARABIC \s 1 </w:instrText>
-      </w:r>
-      <w:r>
-        <w:fldChar w:fldCharType="separate"/>
-      </w:r>
-      <w:r>
-        <w:rPr>
-          <w:noProof/>
-        </w:rPr>
-        <w:t>1</w:t>
-      </w:r>
-      <w:r>
-        <w:rPr>
-          <w:noProof/>
-        </w:rPr>
-        <w:fldChar w:fldCharType="end"/>
-      </w:r>
+      <w:fldSimple w:instr=" SEQ Figure \* ARABIC \s 1 ">
+        <w:r>
+          <w:rPr>
+            <w:noProof/>
+          </w:rPr>
+          <w:t>1</w:t>
+        </w:r>
+      </w:fldSimple>
       <w:r>
         <w:t>.</w:t>
       </w:r>
@@ -2123,107 +2226,111 @@
       <w:pPr>
         <w:jc w:val="both"/>
         <w:rPr>
-          <w:lang w:val="en-US"/>
-        </w:rPr>
-      </w:pPr>
-      <w:r>
-        <w:rPr>
+          <w:color w:val="2E74B5" w:themeColor="accent5" w:themeShade="BF"/>
+          <w:lang w:val="en-US"/>
+        </w:rPr>
+      </w:pPr>
+      <w:r>
+        <w:rPr>
+          <w:color w:val="2E74B5" w:themeColor="accent5" w:themeShade="BF"/>
           <w:lang w:val="en-US"/>
         </w:rPr>
         <w:t xml:space="preserve">This section should present the </w:t>
       </w:r>
       <w:r>
         <w:rPr>
+          <w:color w:val="2E74B5" w:themeColor="accent5" w:themeShade="BF"/>
           <w:lang w:val="en-US"/>
         </w:rPr>
         <w:t>(planned)</w:t>
       </w:r>
       <w:r>
         <w:rPr>
+          <w:color w:val="2E74B5" w:themeColor="accent5" w:themeShade="BF"/>
           <w:lang w:val="en-US"/>
         </w:rPr>
         <w:t xml:space="preserve"> version of your relational database model.  If you have not yet started designing your database, you may draw the diagram using a stand-alone tool, such as Visio.  Alternatively, if you have already started the design</w:t>
       </w:r>
       <w:r>
         <w:rPr>
+          <w:color w:val="2E74B5" w:themeColor="accent5" w:themeShade="BF"/>
           <w:lang w:val="en-US"/>
         </w:rPr>
         <w:t>,</w:t>
       </w:r>
       <w:r>
         <w:rPr>
+          <w:color w:val="2E74B5" w:themeColor="accent5" w:themeShade="BF"/>
           <w:lang w:val="en-US"/>
         </w:rPr>
         <w:t xml:space="preserve"> you may use the ERD created for you by tools such as SQL Server Management Studio.</w:t>
       </w:r>
       <w:r>
         <w:rPr>
+          <w:color w:val="2E74B5" w:themeColor="accent5" w:themeShade="BF"/>
           <w:lang w:val="en-US"/>
         </w:rPr>
         <w:t xml:space="preserve">  This does not need to be the final version of your relational database model</w:t>
       </w:r>
       <w:r>
         <w:rPr>
+          <w:color w:val="2E74B5" w:themeColor="accent5" w:themeShade="BF"/>
           <w:lang w:val="en-US"/>
         </w:rPr>
         <w:t xml:space="preserve"> as you’ll be able to update the diagram in your final, combined report at the end of the semester</w:t>
       </w:r>
       <w:r>
         <w:rPr>
+          <w:color w:val="2E74B5" w:themeColor="accent5" w:themeShade="BF"/>
           <w:lang w:val="en-US"/>
         </w:rPr>
         <w:t>.</w:t>
       </w:r>
       <w:r>
         <w:rPr>
-          <w:lang w:val="en-US"/>
-        </w:rPr>
-        <w:t xml:space="preserve">  </w:t>
-      </w:r>
-      <w:r>
-        <w:rPr>
-          <w:lang w:val="en-US"/>
-        </w:rPr>
-        <w:t>Remember,</w:t>
-      </w:r>
-      <w:r>
-        <w:rPr>
-          <w:lang w:val="en-US"/>
-        </w:rPr>
-        <w:t xml:space="preserve"> it needs to have the absolute minimum of the equivalent of </w:t>
-      </w:r>
-      <w:r>
-        <w:rPr>
+          <w:color w:val="2E74B5" w:themeColor="accent5" w:themeShade="BF"/>
+          <w:lang w:val="en-US"/>
+        </w:rPr>
+        <w:t xml:space="preserve">  Remember, it needs to have the absolute minimum of the equivalent of </w:t>
+      </w:r>
+      <w:r>
+        <w:rPr>
+          <w:color w:val="2E74B5" w:themeColor="accent5" w:themeShade="BF"/>
           <w:lang w:val="en-US"/>
         </w:rPr>
         <w:t>10</w:t>
       </w:r>
       <w:r>
         <w:rPr>
+          <w:color w:val="2E74B5" w:themeColor="accent5" w:themeShade="BF"/>
           <w:lang w:val="en-US"/>
         </w:rPr>
         <w:t xml:space="preserve"> tables. Groups of </w:t>
       </w:r>
       <w:r>
         <w:rPr>
+          <w:color w:val="2E74B5" w:themeColor="accent5" w:themeShade="BF"/>
           <w:lang w:val="en-US"/>
         </w:rPr>
         <w:t>three</w:t>
       </w:r>
       <w:r>
         <w:rPr>
+          <w:color w:val="2E74B5" w:themeColor="accent5" w:themeShade="BF"/>
           <w:lang w:val="en-US"/>
         </w:rPr>
         <w:t xml:space="preserve"> students will need at least </w:t>
       </w:r>
       <w:r>
         <w:rPr>
+          <w:color w:val="2E74B5" w:themeColor="accent5" w:themeShade="BF"/>
           <w:lang w:val="en-US"/>
         </w:rPr>
         <w:t>14</w:t>
       </w:r>
       <w:r>
         <w:rPr>
+          <w:color w:val="2E74B5" w:themeColor="accent5" w:themeShade="BF"/>
           <w:lang w:val="en-US"/>
         </w:rPr>
         <w:t xml:space="preserve"> tables.</w:t>
@@ -2267,6 +2374,7 @@
           <w:bCs/>
           <w:i/>
           <w:iCs/>
+          <w:color w:val="2E74B5" w:themeColor="accent5" w:themeShade="BF"/>
           <w:lang w:val="en-US"/>
         </w:rPr>
       </w:pPr>
@@ -2276,6 +2384,7 @@
           <w:bCs/>
           <w:i/>
           <w:iCs/>
+          <w:color w:val="2E74B5" w:themeColor="accent5" w:themeShade="BF"/>
           <w:lang w:val="en-US"/>
         </w:rPr>
         <w:lastRenderedPageBreak/>
@@ -2285,30 +2394,35 @@
     <w:p>
       <w:pPr>
         <w:rPr>
-          <w:lang w:val="en-US"/>
-        </w:rPr>
-      </w:pPr>
-    </w:p>
-    <w:p>
-      <w:pPr>
-        <w:rPr>
-          <w:lang w:val="en-US"/>
-        </w:rPr>
-      </w:pPr>
-      <w:r>
-        <w:rPr>
+          <w:color w:val="2E74B5" w:themeColor="accent5" w:themeShade="BF"/>
+          <w:lang w:val="en-US"/>
+        </w:rPr>
+      </w:pPr>
+    </w:p>
+    <w:p>
+      <w:pPr>
+        <w:rPr>
+          <w:color w:val="2E74B5" w:themeColor="accent5" w:themeShade="BF"/>
+          <w:lang w:val="en-US"/>
+        </w:rPr>
+      </w:pPr>
+      <w:r>
+        <w:rPr>
+          <w:color w:val="2E74B5" w:themeColor="accent5" w:themeShade="BF"/>
           <w:lang w:val="en-US"/>
         </w:rPr>
         <w:t>Figure 1.</w:t>
       </w:r>
       <w:r>
         <w:rPr>
+          <w:color w:val="2E74B5" w:themeColor="accent5" w:themeShade="BF"/>
           <w:lang w:val="en-US"/>
         </w:rPr>
         <w:t>3</w:t>
       </w:r>
       <w:r>
         <w:rPr>
+          <w:color w:val="2E74B5" w:themeColor="accent5" w:themeShade="BF"/>
           <w:lang w:val="en-US"/>
         </w:rPr>
         <w:t xml:space="preserve"> represents the entity relationship diagram of the YOURPLANNEDSYSTEMNAME system.</w:t>
@@ -2317,6 +2431,7 @@
     <w:p>
       <w:pPr>
         <w:rPr>
+          <w:color w:val="2E74B5" w:themeColor="accent5" w:themeShade="BF"/>
           <w:sz w:val="23"/>
           <w:szCs w:val="23"/>
         </w:rPr>
@@ -2456,89 +2571,97 @@
       <w:pPr>
         <w:jc w:val="both"/>
         <w:rPr>
-          <w:lang w:val="en-US"/>
-        </w:rPr>
-      </w:pPr>
-      <w:r>
-        <w:rPr>
-          <w:lang w:val="en-US"/>
-        </w:rPr>
-        <w:t xml:space="preserve">This section should present </w:t>
-      </w:r>
-      <w:r>
-        <w:rPr>
-          <w:lang w:val="en-US"/>
-        </w:rPr>
-        <w:t xml:space="preserve">the user interface designs of at least </w:t>
-      </w:r>
-      <w:r>
-        <w:rPr>
+          <w:color w:val="2E74B5" w:themeColor="accent5" w:themeShade="BF"/>
+          <w:lang w:val="en-US"/>
+        </w:rPr>
+      </w:pPr>
+      <w:r>
+        <w:rPr>
+          <w:color w:val="2E74B5" w:themeColor="accent5" w:themeShade="BF"/>
+          <w:lang w:val="en-US"/>
+        </w:rPr>
+        <w:t xml:space="preserve">This section should present the user interface designs of at least </w:t>
+      </w:r>
+      <w:r>
+        <w:rPr>
+          <w:color w:val="2E74B5" w:themeColor="accent5" w:themeShade="BF"/>
           <w:lang w:val="en-US"/>
         </w:rPr>
         <w:t>8</w:t>
       </w:r>
       <w:r>
         <w:rPr>
+          <w:color w:val="2E74B5" w:themeColor="accent5" w:themeShade="BF"/>
           <w:lang w:val="en-US"/>
         </w:rPr>
         <w:t xml:space="preserve"> screens from your proposed system</w:t>
       </w:r>
       <w:r>
         <w:rPr>
+          <w:color w:val="2E74B5" w:themeColor="accent5" w:themeShade="BF"/>
           <w:lang w:val="en-US"/>
         </w:rPr>
         <w:t xml:space="preserve"> (</w:t>
       </w:r>
       <w:r>
         <w:rPr>
+          <w:color w:val="2E74B5" w:themeColor="accent5" w:themeShade="BF"/>
           <w:lang w:val="en-US"/>
         </w:rPr>
         <w:t>10</w:t>
       </w:r>
       <w:r>
         <w:rPr>
+          <w:color w:val="2E74B5" w:themeColor="accent5" w:themeShade="BF"/>
           <w:lang w:val="en-US"/>
         </w:rPr>
         <w:t xml:space="preserve"> for groups of 3)</w:t>
       </w:r>
       <w:r>
         <w:rPr>
+          <w:color w:val="2E74B5" w:themeColor="accent5" w:themeShade="BF"/>
           <w:lang w:val="en-US"/>
         </w:rPr>
         <w:t xml:space="preserve">.  </w:t>
       </w:r>
       <w:r>
         <w:rPr>
+          <w:color w:val="2E74B5" w:themeColor="accent5" w:themeShade="BF"/>
           <w:lang w:val="en-US"/>
         </w:rPr>
         <w:t xml:space="preserve">If you have a system which is more graphically driven (like a game), you can substitute screens with the designs of individual components.  </w:t>
       </w:r>
       <w:r>
         <w:rPr>
+          <w:color w:val="2E74B5" w:themeColor="accent5" w:themeShade="BF"/>
           <w:lang w:val="en-US"/>
         </w:rPr>
         <w:t>If you have not yet started on your system development, you may use stand-alone tools such as Visio to create simple versions of your planned screens.  These can be in the form of low fidelity wireframes.  Alternatively, if you have already started system development, you may take screenshots of the screens you have already completed.  For each screen</w:t>
       </w:r>
       <w:r>
         <w:rPr>
+          <w:color w:val="2E74B5" w:themeColor="accent5" w:themeShade="BF"/>
           <w:lang w:val="en-US"/>
         </w:rPr>
         <w:t xml:space="preserve">(or component) </w:t>
       </w:r>
       <w:r>
         <w:rPr>
+          <w:color w:val="2E74B5" w:themeColor="accent5" w:themeShade="BF"/>
           <w:lang w:val="en-US"/>
         </w:rPr>
         <w:t>you are required to provide a description of the functionality.</w:t>
       </w:r>
       <w:r>
         <w:rPr>
+          <w:color w:val="2E74B5" w:themeColor="accent5" w:themeShade="BF"/>
           <w:lang w:val="en-US"/>
         </w:rPr>
         <w:t xml:space="preserve">  These do not need to be the final versions of these screens</w:t>
       </w:r>
       <w:r>
         <w:rPr>
+          <w:color w:val="2E74B5" w:themeColor="accent5" w:themeShade="BF"/>
           <w:lang w:val="en-US"/>
         </w:rPr>
         <w:t xml:space="preserve"> as you’ll be able to update the screens in the final, combined report at the end of the semester.</w:t>
@@ -2574,6 +2697,7 @@
           <w:bCs/>
           <w:i/>
           <w:iCs/>
+          <w:color w:val="2E74B5" w:themeColor="accent5" w:themeShade="BF"/>
           <w:lang w:val="en-US"/>
         </w:rPr>
       </w:pPr>
@@ -2583,6 +2707,7 @@
           <w:bCs/>
           <w:i/>
           <w:iCs/>
+          <w:color w:val="2E74B5" w:themeColor="accent5" w:themeShade="BF"/>
           <w:lang w:val="en-US"/>
         </w:rPr>
         <w:t>Example:</w:t>
@@ -2591,38 +2716,86 @@
     <w:p>
       <w:pPr>
         <w:rPr>
-          <w:lang w:val="en-US"/>
-        </w:rPr>
-      </w:pPr>
-    </w:p>
-    <w:p>
-      <w:pPr>
-        <w:jc w:val="both"/>
-        <w:rPr>
-          <w:lang w:val="en-US"/>
-        </w:rPr>
-      </w:pPr>
-      <w:r>
-        <w:rPr>
+          <w:color w:val="2E74B5" w:themeColor="accent5" w:themeShade="BF"/>
+          <w:lang w:val="en-US"/>
+        </w:rPr>
+      </w:pPr>
+    </w:p>
+    <w:p>
+      <w:pPr>
+        <w:jc w:val="both"/>
+        <w:rPr>
+          <w:color w:val="2E74B5" w:themeColor="accent5" w:themeShade="BF"/>
+          <w:lang w:val="en-US"/>
+        </w:rPr>
+      </w:pPr>
+      <w:r>
+        <w:rPr>
+          <w:color w:val="2E74B5" w:themeColor="accent5" w:themeShade="BF"/>
           <w:lang w:val="en-US"/>
         </w:rPr>
         <w:t>Figure 1.</w:t>
       </w:r>
       <w:r>
         <w:rPr>
+          <w:color w:val="2E74B5" w:themeColor="accent5" w:themeShade="BF"/>
           <w:lang w:val="en-US"/>
         </w:rPr>
         <w:t>4</w:t>
       </w:r>
       <w:r>
         <w:rPr>
-          <w:lang w:val="en-US"/>
-        </w:rPr>
-        <w:t xml:space="preserve"> represents the login screen of the YOURPLANNEDSYSTEMNAME system.  The screen requires that a user enter their email address (as a username) and a password.  Upon successful login, the user will be redirected to the system’s landing page.  The screen also provides the user with an option to use </w:t>
+          <w:color w:val="2E74B5" w:themeColor="accent5" w:themeShade="BF"/>
+          <w:lang w:val="en-US"/>
+        </w:rPr>
+        <w:t xml:space="preserve"> represents the login screen of the YOUR</w:t>
+      </w:r>
+      <w:r>
+        <w:rPr>
+          <w:color w:val="2E74B5" w:themeColor="accent5" w:themeShade="BF"/>
+          <w:lang w:val="en-US"/>
+        </w:rPr>
+        <w:t xml:space="preserve"> </w:t>
+      </w:r>
+      <w:r>
+        <w:rPr>
+          <w:color w:val="2E74B5" w:themeColor="accent5" w:themeShade="BF"/>
+          <w:lang w:val="en-US"/>
+        </w:rPr>
+        <w:t>PLANNED</w:t>
+      </w:r>
+      <w:r>
+        <w:rPr>
+          <w:color w:val="2E74B5" w:themeColor="accent5" w:themeShade="BF"/>
+          <w:lang w:val="en-US"/>
+        </w:rPr>
+        <w:t xml:space="preserve"> </w:t>
+      </w:r>
+      <w:r>
+        <w:rPr>
+          <w:color w:val="2E74B5" w:themeColor="accent5" w:themeShade="BF"/>
+          <w:lang w:val="en-US"/>
+        </w:rPr>
+        <w:t>SYSTEM</w:t>
+      </w:r>
+      <w:r>
+        <w:rPr>
+          <w:color w:val="2E74B5" w:themeColor="accent5" w:themeShade="BF"/>
+          <w:lang w:val="en-US"/>
+        </w:rPr>
+        <w:t xml:space="preserve"> </w:t>
+      </w:r>
+      <w:r>
+        <w:rPr>
+          <w:color w:val="2E74B5" w:themeColor="accent5" w:themeShade="BF"/>
+          <w:lang w:val="en-US"/>
+        </w:rPr>
+        <w:t xml:space="preserve">NAME system.  The screen requires that a user enter their email address (as a username) and a password.  Upon successful login, the user will be redirected to the system’s landing page.  The screen also provides the user with an option to use </w:t>
       </w:r>
       <w:proofErr w:type="gramStart"/>
       <w:r>
         <w:rPr>
+          <w:color w:val="2E74B5" w:themeColor="accent5" w:themeShade="BF"/>
           <w:lang w:val="en-US"/>
         </w:rPr>
         <w:t>in the event that</w:t>
@@ -2630,6 +2803,7 @@
       <w:proofErr w:type="gramEnd"/>
       <w:r>
         <w:rPr>
+          <w:color w:val="2E74B5" w:themeColor="accent5" w:themeShade="BF"/>
           <w:lang w:val="en-US"/>
         </w:rPr>
         <w:t xml:space="preserve"> they have forgotten their password.</w:t>
@@ -2765,7 +2939,7 @@
 </file>
 
 <file path=word/numbering.xml><?xml version="1.0" encoding="utf-8"?>
-<w:numbering xmlns:wpc="http://schemas.microsoft.com/office/word/2010/wordprocessingCanvas" xmlns:cx="http://schemas.microsoft.com/office/drawing/2014/chartex" xmlns:cx1="http://schemas.microsoft.com/office/drawing/2015/9/8/chartex" xmlns:cx2="http://schemas.microsoft.com/office/drawing/2015/10/21/chartex" xmlns:cx3="http://schemas.microsoft.com/office/drawing/2016/5/9/chartex" xmlns:cx4="http://schemas.microsoft.com/office/drawing/2016/5/10/chartex" xmlns:cx5="http://schemas.microsoft.com/office/drawing/2016/5/11/chartex" xmlns:cx6="http://schemas.microsoft.com/office/drawing/2016/5/12/chartex" xmlns:cx7="http://schemas.microsoft.com/office/drawing/2016/5/13/chartex" xmlns:cx8="http://schemas.microsoft.com/office/drawing/2016/5/14/chartex" xmlns:mc="http://schemas.openxmlformats.org/markup-compatibility/2006" xmlns:aink="http://schemas.microsoft.com/office/drawing/2016/ink" xmlns:am3d="http://schemas.microsoft.com/office/drawing/2017/model3d" xmlns:o="urn:schemas-microsoft-com:office:office" xmlns:oel="http://schemas.microsoft.com/office/2019/extlst" xmlns:r="http://schemas.openxmlformats.org/officeDocument/2006/relationships" xmlns:m="http://schemas.openxmlformats.org/officeDocument/2006/math" xmlns:v="urn:schemas-microsoft-com:vml" xmlns:wp14="http://schemas.microsoft.com/office/word/2010/wordprocessingDrawing" xmlns:wp="http://schemas.openxmlformats.org/drawingml/2006/wordprocessingDrawing" xmlns:w10="urn:schemas-microsoft-com:office:word" xmlns:w="http://schemas.openxmlformats.org/wordprocessingml/2006/main" xmlns:w14="http://schemas.microsoft.com/office/word/2010/wordml" xmlns:w15="http://schemas.microsoft.com/office/word/2012/wordml" xmlns:w16cex="http://schemas.microsoft.com/office/word/2018/wordml/cex" xmlns:w16cid="http://schemas.microsoft.com/office/word/2016/wordml/cid" xmlns:w16="http://schemas.microsoft.com/office/word/2018/wordml" xmlns:w16du="http://schemas.microsoft.com/office/word/2023/wordml/word16du" xmlns:w16sdtdh="http://schemas.microsoft.com/office/word/2020/wordml/sdtdatahash" xmlns:w16se="http://schemas.microsoft.com/office/word/2015/wordml/symex" xmlns:wpg="http://schemas.microsoft.com/office/word/2010/wordprocessingGroup" xmlns:wpi="http://schemas.microsoft.com/office/word/2010/wordprocessingInk" xmlns:wne="http://schemas.microsoft.com/office/word/2006/wordml" xmlns:wps="http://schemas.microsoft.com/office/word/2010/wordprocessingShape" mc:Ignorable="w14 w15 w16se w16cid w16 w16cex w16sdtdh w16du wp14">
+<w:numbering xmlns:wpc="http://schemas.microsoft.com/office/word/2010/wordprocessingCanvas" xmlns:cx="http://schemas.microsoft.com/office/drawing/2014/chartex" xmlns:cx1="http://schemas.microsoft.com/office/drawing/2015/9/8/chartex" xmlns:cx2="http://schemas.microsoft.com/office/drawing/2015/10/21/chartex" xmlns:cx3="http://schemas.microsoft.com/office/drawing/2016/5/9/chartex" xmlns:cx4="http://schemas.microsoft.com/office/drawing/2016/5/10/chartex" xmlns:cx5="http://schemas.microsoft.com/office/drawing/2016/5/11/chartex" xmlns:cx6="http://schemas.microsoft.com/office/drawing/2016/5/12/chartex" xmlns:cx7="http://schemas.microsoft.com/office/drawing/2016/5/13/chartex" xmlns:cx8="http://schemas.microsoft.com/office/drawing/2016/5/14/chartex" xmlns:mc="http://schemas.openxmlformats.org/markup-compatibility/2006" xmlns:aink="http://schemas.microsoft.com/office/drawing/2016/ink" xmlns:am3d="http://schemas.microsoft.com/office/drawing/2017/model3d" xmlns:o="urn:schemas-microsoft-com:office:office" xmlns:oel="http://schemas.microsoft.com/office/2019/extlst" xmlns:r="http://schemas.openxmlformats.org/officeDocument/2006/relationships" xmlns:m="http://schemas.openxmlformats.org/officeDocument/2006/math" xmlns:v="urn:schemas-microsoft-com:vml" xmlns:wp14="http://schemas.microsoft.com/office/word/2010/wordprocessingDrawing" xmlns:wp="http://schemas.openxmlformats.org/drawingml/2006/wordprocessingDrawing" xmlns:w10="urn:schemas-microsoft-com:office:word" xmlns:w="http://schemas.openxmlformats.org/wordprocessingml/2006/main" xmlns:w14="http://schemas.microsoft.com/office/word/2010/wordml" xmlns:w15="http://schemas.microsoft.com/office/word/2012/wordml" xmlns:w16cex="http://schemas.microsoft.com/office/word/2018/wordml/cex" xmlns:w16cid="http://schemas.microsoft.com/office/word/2016/wordml/cid" xmlns:w16="http://schemas.microsoft.com/office/word/2018/wordml" xmlns:w16du="http://schemas.microsoft.com/office/word/2023/wordml/word16du" xmlns:w16sdtdh="http://schemas.microsoft.com/office/word/2020/wordml/sdtdatahash" xmlns:w16sdtfl="http://schemas.microsoft.com/office/word/2024/wordml/sdtformatlock" xmlns:w16se="http://schemas.microsoft.com/office/word/2015/wordml/symex" xmlns:wpg="http://schemas.microsoft.com/office/word/2010/wordprocessingGroup" xmlns:wpi="http://schemas.microsoft.com/office/word/2010/wordprocessingInk" xmlns:wne="http://schemas.microsoft.com/office/word/2006/wordml" xmlns:wps="http://schemas.microsoft.com/office/word/2010/wordprocessingShape" mc:Ignorable="w14 w15 w16se w16cid w16 w16cex w16sdtdh w16sdtfl w16du wp14">
   <w:abstractNum w:abstractNumId="0" w15:restartNumberingAfterBreak="0">
     <w:nsid w:val="07600B59"/>
     <w:multiLevelType w:val="hybridMultilevel"/>
@@ -3582,7 +3756,7 @@
 </file>
 
 <file path=word/styles.xml><?xml version="1.0" encoding="utf-8"?>
-<w:styles xmlns:mc="http://schemas.openxmlformats.org/markup-compatibility/2006" xmlns:r="http://schemas.openxmlformats.org/officeDocument/2006/relationships" xmlns:w="http://schemas.openxmlformats.org/wordprocessingml/2006/main" xmlns:w14="http://schemas.microsoft.com/office/word/2010/wordml" xmlns:w15="http://schemas.microsoft.com/office/word/2012/wordml" xmlns:w16cex="http://schemas.microsoft.com/office/word/2018/wordml/cex" xmlns:w16cid="http://schemas.microsoft.com/office/word/2016/wordml/cid" xmlns:w16="http://schemas.microsoft.com/office/word/2018/wordml" xmlns:w16du="http://schemas.microsoft.com/office/word/2023/wordml/word16du" xmlns:w16sdtdh="http://schemas.microsoft.com/office/word/2020/wordml/sdtdatahash" xmlns:w16se="http://schemas.microsoft.com/office/word/2015/wordml/symex" mc:Ignorable="w14 w15 w16se w16cid w16 w16cex w16sdtdh w16du">
+<w:styles xmlns:mc="http://schemas.openxmlformats.org/markup-compatibility/2006" xmlns:r="http://schemas.openxmlformats.org/officeDocument/2006/relationships" xmlns:w="http://schemas.openxmlformats.org/wordprocessingml/2006/main" xmlns:w14="http://schemas.microsoft.com/office/word/2010/wordml" xmlns:w15="http://schemas.microsoft.com/office/word/2012/wordml" xmlns:w16cex="http://schemas.microsoft.com/office/word/2018/wordml/cex" xmlns:w16cid="http://schemas.microsoft.com/office/word/2016/wordml/cid" xmlns:w16="http://schemas.microsoft.com/office/word/2018/wordml" xmlns:w16du="http://schemas.microsoft.com/office/word/2023/wordml/word16du" xmlns:w16sdtdh="http://schemas.microsoft.com/office/word/2020/wordml/sdtdatahash" xmlns:w16sdtfl="http://schemas.microsoft.com/office/word/2024/wordml/sdtformatlock" xmlns:w16se="http://schemas.microsoft.com/office/word/2015/wordml/symex" mc:Ignorable="w14 w15 w16se w16cid w16 w16cex w16sdtdh w16sdtfl w16du">
   <w:docDefaults>
     <w:rPrDefault>
       <w:rPr>

</xml_diff>

<commit_message>
Updated 1.1 Plan to Address Objectives
Will come back to this
</commit_message>
<xml_diff>
--- a/Documentation/The Ripple Effect - SYSTEM REQUIREMENTS.docx
+++ b/Documentation/The Ripple Effect - SYSTEM REQUIREMENTS.docx
@@ -1,6 +1,6 @@
 
 <file path=word/document.xml><?xml version="1.0" encoding="utf-8"?>
-<w:document xmlns:wpc="http://schemas.microsoft.com/office/word/2010/wordprocessingCanvas" xmlns:cx="http://schemas.microsoft.com/office/drawing/2014/chartex" xmlns:cx1="http://schemas.microsoft.com/office/drawing/2015/9/8/chartex" xmlns:cx2="http://schemas.microsoft.com/office/drawing/2015/10/21/chartex" xmlns:cx3="http://schemas.microsoft.com/office/drawing/2016/5/9/chartex" xmlns:cx4="http://schemas.microsoft.com/office/drawing/2016/5/10/chartex" xmlns:cx5="http://schemas.microsoft.com/office/drawing/2016/5/11/chartex" xmlns:cx6="http://schemas.microsoft.com/office/drawing/2016/5/12/chartex" xmlns:cx7="http://schemas.microsoft.com/office/drawing/2016/5/13/chartex" xmlns:cx8="http://schemas.microsoft.com/office/drawing/2016/5/14/chartex" xmlns:mc="http://schemas.openxmlformats.org/markup-compatibility/2006" xmlns:aink="http://schemas.microsoft.com/office/drawing/2016/ink" xmlns:am3d="http://schemas.microsoft.com/office/drawing/2017/model3d" xmlns:o="urn:schemas-microsoft-com:office:office" xmlns:oel="http://schemas.microsoft.com/office/2019/extlst" xmlns:r="http://schemas.openxmlformats.org/officeDocument/2006/relationships" xmlns:m="http://schemas.openxmlformats.org/officeDocument/2006/math" xmlns:v="urn:schemas-microsoft-com:vml" xmlns:wp14="http://schemas.microsoft.com/office/word/2010/wordprocessingDrawing" xmlns:wp="http://schemas.openxmlformats.org/drawingml/2006/wordprocessingDrawing" xmlns:w10="urn:schemas-microsoft-com:office:word" xmlns:w="http://schemas.openxmlformats.org/wordprocessingml/2006/main" xmlns:w14="http://schemas.microsoft.com/office/word/2010/wordml" xmlns:w15="http://schemas.microsoft.com/office/word/2012/wordml" xmlns:w16cex="http://schemas.microsoft.com/office/word/2018/wordml/cex" xmlns:w16cid="http://schemas.microsoft.com/office/word/2016/wordml/cid" xmlns:w16="http://schemas.microsoft.com/office/word/2018/wordml" xmlns:w16du="http://schemas.microsoft.com/office/word/2023/wordml/word16du" xmlns:w16sdtdh="http://schemas.microsoft.com/office/word/2020/wordml/sdtdatahash" xmlns:w16sdtfl="http://schemas.microsoft.com/office/word/2024/wordml/sdtformatlock" xmlns:w16se="http://schemas.microsoft.com/office/word/2015/wordml/symex" xmlns:wpg="http://schemas.microsoft.com/office/word/2010/wordprocessingGroup" xmlns:wpi="http://schemas.microsoft.com/office/word/2010/wordprocessingInk" xmlns:wne="http://schemas.microsoft.com/office/word/2006/wordml" xmlns:wps="http://schemas.microsoft.com/office/word/2010/wordprocessingShape" mc:Ignorable="w14 w15 w16se w16cid w16 w16cex w16sdtdh w16sdtfl w16du wp14">
+<w:document xmlns:wpc="http://schemas.microsoft.com/office/word/2010/wordprocessingCanvas" xmlns:cx="http://schemas.microsoft.com/office/drawing/2014/chartex" xmlns:cx1="http://schemas.microsoft.com/office/drawing/2015/9/8/chartex" xmlns:cx2="http://schemas.microsoft.com/office/drawing/2015/10/21/chartex" xmlns:cx3="http://schemas.microsoft.com/office/drawing/2016/5/9/chartex" xmlns:cx4="http://schemas.microsoft.com/office/drawing/2016/5/10/chartex" xmlns:cx5="http://schemas.microsoft.com/office/drawing/2016/5/11/chartex" xmlns:cx6="http://schemas.microsoft.com/office/drawing/2016/5/12/chartex" xmlns:cx7="http://schemas.microsoft.com/office/drawing/2016/5/13/chartex" xmlns:cx8="http://schemas.microsoft.com/office/drawing/2016/5/14/chartex" xmlns:mc="http://schemas.openxmlformats.org/markup-compatibility/2006" xmlns:aink="http://schemas.microsoft.com/office/drawing/2016/ink" xmlns:am3d="http://schemas.microsoft.com/office/drawing/2017/model3d" xmlns:o="urn:schemas-microsoft-com:office:office" xmlns:r="http://schemas.openxmlformats.org/officeDocument/2006/relationships" xmlns:m="http://schemas.openxmlformats.org/officeDocument/2006/math" xmlns:v="urn:schemas-microsoft-com:vml" xmlns:wp14="http://schemas.microsoft.com/office/word/2010/wordprocessingDrawing" xmlns:wp="http://schemas.openxmlformats.org/drawingml/2006/wordprocessingDrawing" xmlns:w10="urn:schemas-microsoft-com:office:word" xmlns:w="http://schemas.openxmlformats.org/wordprocessingml/2006/main" xmlns:w14="http://schemas.microsoft.com/office/word/2010/wordml" xmlns:w15="http://schemas.microsoft.com/office/word/2012/wordml" xmlns:w16cid="http://schemas.microsoft.com/office/word/2016/wordml/cid" xmlns:w16se="http://schemas.microsoft.com/office/word/2015/wordml/symex" xmlns:wpg="http://schemas.microsoft.com/office/word/2010/wordprocessingGroup" xmlns:wpi="http://schemas.microsoft.com/office/word/2010/wordprocessingInk" xmlns:wne="http://schemas.microsoft.com/office/word/2006/wordml" xmlns:wps="http://schemas.microsoft.com/office/word/2010/wordprocessingShape" mc:Ignorable="w14 w15 w16se w16cid wp14">
   <w:body>
     <w:sdt>
       <w:sdtPr>
@@ -1551,23 +1551,7 @@
           <w:color w:val="2E74B5" w:themeColor="accent5" w:themeShade="BF"/>
           <w:lang w:val="en-US"/>
         </w:rPr>
-        <w:t xml:space="preserve">In your business case you specified a few objectives.  These were real-world issues that your software intervention will address.  In this section you need to stipulate what you will do </w:t>
-      </w:r>
-      <w:proofErr w:type="gramStart"/>
-      <w:r>
-        <w:rPr>
-          <w:color w:val="2E74B5" w:themeColor="accent5" w:themeShade="BF"/>
-          <w:lang w:val="en-US"/>
-        </w:rPr>
-        <w:t>in</w:t>
-      </w:r>
-      <w:proofErr w:type="gramEnd"/>
-      <w:r>
-        <w:rPr>
-          <w:color w:val="2E74B5" w:themeColor="accent5" w:themeShade="BF"/>
-          <w:lang w:val="en-US"/>
-        </w:rPr>
-        <w:t xml:space="preserve"> your software to address these objectives.  E.g. the following objectives were stated in the business case:  </w:t>
+        <w:t xml:space="preserve">In your business case you specified a few objectives.  These were real-world issues that your software intervention will address.  In this section you need to stipulate what you will do in your software to address these objectives.  E.g. the following objectives were stated in the business case:  </w:t>
       </w:r>
     </w:p>
     <w:p>
@@ -1618,23 +1602,7 @@
           <w:color w:val="2E74B5" w:themeColor="accent5" w:themeShade="BF"/>
           <w:lang w:val="en-US"/>
         </w:rPr>
-        <w:t xml:space="preserve">Ensure that notes cannot get </w:t>
-      </w:r>
-      <w:proofErr w:type="gramStart"/>
-      <w:r>
-        <w:rPr>
-          <w:color w:val="2E74B5" w:themeColor="accent5" w:themeShade="BF"/>
-          <w:lang w:val="en-US"/>
-        </w:rPr>
-        <w:t>lost,</w:t>
-      </w:r>
-      <w:proofErr w:type="gramEnd"/>
-      <w:r>
-        <w:rPr>
-          <w:color w:val="2E74B5" w:themeColor="accent5" w:themeShade="BF"/>
-          <w:lang w:val="en-US"/>
-        </w:rPr>
-        <w:t xml:space="preserve"> by providing an off-line saving system.</w:t>
+        <w:t>Ensure that notes cannot get lost, by providing an off-line saving system.</w:t>
       </w:r>
     </w:p>
     <w:p>
@@ -1700,37 +1668,12 @@
           <w:lang w:val="en-US"/>
         </w:rPr>
       </w:pPr>
-      <w:proofErr w:type="gramStart"/>
-      <w:r>
-        <w:rPr>
-          <w:color w:val="2E74B5" w:themeColor="accent5" w:themeShade="BF"/>
-          <w:lang w:val="en-US"/>
-        </w:rPr>
-        <w:t>In order to</w:t>
-      </w:r>
-      <w:proofErr w:type="gramEnd"/>
-      <w:r>
-        <w:rPr>
-          <w:color w:val="2E74B5" w:themeColor="accent5" w:themeShade="BF"/>
-          <w:lang w:val="en-US"/>
-        </w:rPr>
-        <w:t xml:space="preserve"> </w:t>
-      </w:r>
-      <w:proofErr w:type="gramStart"/>
-      <w:r>
-        <w:rPr>
-          <w:color w:val="2E74B5" w:themeColor="accent5" w:themeShade="BF"/>
-          <w:lang w:val="en-US"/>
-        </w:rPr>
-        <w:t>the replace</w:t>
-      </w:r>
-      <w:proofErr w:type="gramEnd"/>
-      <w:r>
-        <w:rPr>
-          <w:color w:val="2E74B5" w:themeColor="accent5" w:themeShade="BF"/>
-          <w:lang w:val="en-US"/>
-        </w:rPr>
-        <w:t xml:space="preserve"> the paper-based note-taking system used by healthcare workers, an Android-based mobile application will be developed.  Android was chosen as it is the most widely used mobile operating system under the target group of healthcare workers.  A mobile application will ensure that the healthcare workers have access to the system wherever they may be working from on any given day.</w:t>
+      <w:r>
+        <w:rPr>
+          <w:color w:val="2E74B5" w:themeColor="accent5" w:themeShade="BF"/>
+          <w:lang w:val="en-US"/>
+        </w:rPr>
+        <w:t>In order to the replace the paper-based note-taking system used by healthcare workers, an Android-based mobile application will be developed.  Android was chosen as it is the most widely used mobile operating system under the target group of healthcare workers.  A mobile application will ensure that the healthcare workers have access to the system wherever they may be working from on any given day.</w:t>
       </w:r>
     </w:p>
     <w:p>
@@ -1810,6 +1753,379 @@
           <w:lang w:val="en-US"/>
         </w:rPr>
       </w:pPr>
+      <w:r>
+        <w:rPr>
+          <w:lang w:val="en-US"/>
+        </w:rPr>
+        <w:t xml:space="preserve">In our business case, we dissected our identified problem of pool maintenance into different sub-problems that were categorized based on the user that they affected. </w:t>
+      </w:r>
+    </w:p>
+    <w:p>
+      <w:pPr>
+        <w:rPr>
+          <w:lang w:val="en-US"/>
+        </w:rPr>
+      </w:pPr>
+      <w:r>
+        <w:rPr>
+          <w:lang w:val="en-US"/>
+        </w:rPr>
+        <w:t>For the individual pool owner t</w:t>
+      </w:r>
+      <w:r>
+        <w:rPr>
+          <w:lang w:val="en-US"/>
+        </w:rPr>
+        <w:t>hese are</w:t>
+      </w:r>
+      <w:r>
+        <w:rPr>
+          <w:lang w:val="en-US"/>
+        </w:rPr>
+        <w:t>:</w:t>
+      </w:r>
+    </w:p>
+    <w:p>
+      <w:pPr>
+        <w:pStyle w:val="ListParagraph"/>
+        <w:numPr>
+          <w:ilvl w:val="0"/>
+          <w:numId w:val="8"/>
+        </w:numPr>
+        <w:rPr>
+          <w:lang w:val="en-US"/>
+        </w:rPr>
+      </w:pPr>
+      <w:r>
+        <w:rPr>
+          <w:lang w:val="en-US"/>
+        </w:rPr>
+        <w:t>Uneducated pool care often leads to wasting resources such as water.</w:t>
+      </w:r>
+    </w:p>
+    <w:p>
+      <w:pPr>
+        <w:pStyle w:val="ListParagraph"/>
+        <w:numPr>
+          <w:ilvl w:val="0"/>
+          <w:numId w:val="8"/>
+        </w:numPr>
+        <w:rPr>
+          <w:lang w:val="en-US"/>
+        </w:rPr>
+      </w:pPr>
+      <w:r>
+        <w:rPr>
+          <w:lang w:val="en-US"/>
+        </w:rPr>
+        <w:lastRenderedPageBreak/>
+        <w:t>Manual record-keeping is tedious and time-consuming.</w:t>
+      </w:r>
+    </w:p>
+    <w:p>
+      <w:pPr>
+        <w:pStyle w:val="ListParagraph"/>
+        <w:numPr>
+          <w:ilvl w:val="0"/>
+          <w:numId w:val="8"/>
+        </w:numPr>
+        <w:rPr>
+          <w:lang w:val="en-US"/>
+        </w:rPr>
+      </w:pPr>
+      <w:r>
+        <w:rPr>
+          <w:lang w:val="en-US"/>
+        </w:rPr>
+        <w:t>Securing a trustable service provider that completes the required task is difficult in a fragmented market.</w:t>
+      </w:r>
+    </w:p>
+    <w:p>
+      <w:pPr>
+        <w:rPr>
+          <w:lang w:val="en-US"/>
+        </w:rPr>
+      </w:pPr>
+      <w:r>
+        <w:rPr>
+          <w:lang w:val="en-US"/>
+        </w:rPr>
+        <w:t>For pool service providers these are:</w:t>
+      </w:r>
+    </w:p>
+    <w:p>
+      <w:pPr>
+        <w:pStyle w:val="ListParagraph"/>
+        <w:numPr>
+          <w:ilvl w:val="0"/>
+          <w:numId w:val="9"/>
+        </w:numPr>
+        <w:rPr>
+          <w:lang w:val="en-US"/>
+        </w:rPr>
+      </w:pPr>
+      <w:r>
+        <w:rPr>
+          <w:lang w:val="en-US"/>
+        </w:rPr>
+        <w:t>Managing clients is often a disjointed task requiring multiple applications to complete a single workflow</w:t>
+      </w:r>
+    </w:p>
+    <w:p>
+      <w:pPr>
+        <w:pStyle w:val="ListParagraph"/>
+        <w:numPr>
+          <w:ilvl w:val="0"/>
+          <w:numId w:val="9"/>
+        </w:numPr>
+        <w:rPr>
+          <w:lang w:val="en-US"/>
+        </w:rPr>
+      </w:pPr>
+      <w:r>
+        <w:rPr>
+          <w:lang w:val="en-US"/>
+        </w:rPr>
+        <w:t>Expanding as a professional entity can be difficult if the correct clients are not approached in the correct manner.</w:t>
+      </w:r>
+    </w:p>
+    <w:p>
+      <w:pPr>
+        <w:rPr>
+          <w:lang w:val="en-US"/>
+        </w:rPr>
+      </w:pPr>
+    </w:p>
+    <w:p>
+      <w:pPr>
+        <w:rPr>
+          <w:lang w:val="en-US"/>
+        </w:rPr>
+      </w:pPr>
+      <w:r>
+        <w:rPr>
+          <w:i/>
+          <w:lang w:val="en-US"/>
+        </w:rPr>
+        <w:t>SplashScreen</w:t>
+      </w:r>
+      <w:r>
+        <w:rPr>
+          <w:lang w:val="en-US"/>
+        </w:rPr>
+        <w:t xml:space="preserve">, is an android application aims to simplify pool maintenance. Through giving our new users a guided walkthrough of both how to use the app and general insights on pool maintenance, we solve the issue of uneducated pool care. This will be in the form of </w:t>
+      </w:r>
+      <w:r>
+        <w:rPr>
+          <w:lang w:val="en-US"/>
+        </w:rPr>
+        <w:t>walkthrough screens, similar to tutorials and video resources found online.</w:t>
+      </w:r>
+    </w:p>
+    <w:p>
+      <w:pPr>
+        <w:rPr>
+          <w:lang w:val="en-US"/>
+        </w:rPr>
+      </w:pPr>
+    </w:p>
+    <w:p>
+      <w:pPr>
+        <w:rPr>
+          <w:lang w:val="en-US"/>
+        </w:rPr>
+      </w:pPr>
+      <w:r>
+        <w:rPr>
+          <w:lang w:val="en-US"/>
+        </w:rPr>
+        <w:t>Our system will offer users the ability to move away from manual record-keeping through a personalized pool input and calculator system. This system will be enhanced with real-time data collected from various application programming interfaces sources such as the local weather, municipality water restriction and the load shedding timeline to equip pool owners and service providers with verified information to make informed decisions.</w:t>
+      </w:r>
+    </w:p>
+    <w:p>
+      <w:pPr>
+        <w:rPr>
+          <w:lang w:val="en-US"/>
+        </w:rPr>
+      </w:pPr>
+    </w:p>
+    <w:p>
+      <w:pPr>
+        <w:rPr>
+          <w:lang w:val="en-US"/>
+        </w:rPr>
+      </w:pPr>
+      <w:r>
+        <w:rPr>
+          <w:lang w:val="en-US"/>
+        </w:rPr>
+        <w:t xml:space="preserve">The marketplace serves as a two-way link between the service provider and the service consumer. While individuals are not required to request a service or buy a product from a marketplace business, </w:t>
+      </w:r>
+      <w:r>
+        <w:rPr>
+          <w:i/>
+          <w:lang w:val="en-US"/>
+        </w:rPr>
+        <w:t>SplashScreen</w:t>
+      </w:r>
+      <w:r>
+        <w:rPr>
+          <w:i/>
+          <w:lang w:val="en-US"/>
+        </w:rPr>
+        <w:t xml:space="preserve">, </w:t>
+      </w:r>
+      <w:r>
+        <w:rPr>
+          <w:lang w:val="en-US"/>
+        </w:rPr>
+        <w:t xml:space="preserve">gives them a direct </w:t>
+      </w:r>
+      <w:r>
+        <w:rPr>
+          <w:lang w:val="en-US"/>
+        </w:rPr>
+        <w:t xml:space="preserve">verified </w:t>
+      </w:r>
+      <w:r>
+        <w:rPr>
+          <w:lang w:val="en-US"/>
+        </w:rPr>
+        <w:t>link to the source</w:t>
+      </w:r>
+      <w:r>
+        <w:rPr>
+          <w:lang w:val="en-US"/>
+        </w:rPr>
+        <w:t xml:space="preserve">. When businesses request registration for a business account, our team will first verify their </w:t>
+      </w:r>
+      <w:r>
+        <w:rPr>
+          <w:lang w:val="en-US"/>
+        </w:rPr>
+        <w:t>legitimacy as well as allocate a non-biased review based on current public company data. Once verified and registered, a business will be able to search through the client pool in the form of current individuals on the platform who agreed to have their profile public. This approach solves both the sub-problems of an unverified marketplace for pool owners and the difficulty of attaining clients for service providers.</w:t>
+      </w:r>
+    </w:p>
+    <w:p>
+      <w:pPr>
+        <w:rPr>
+          <w:lang w:val="en-US"/>
+        </w:rPr>
+      </w:pPr>
+    </w:p>
+    <w:p>
+      <w:pPr>
+        <w:rPr>
+          <w:lang w:val="en-US"/>
+        </w:rPr>
+      </w:pPr>
+      <w:r>
+        <w:rPr>
+          <w:lang w:val="en-US"/>
+        </w:rPr>
+        <w:t xml:space="preserve">Another major issue we identified is the disjointed task of managing clients for service providers. We define this as the requirement of multiple avenues to complete a single client job: </w:t>
+      </w:r>
+    </w:p>
+    <w:p>
+      <w:pPr>
+        <w:pStyle w:val="ListParagraph"/>
+        <w:numPr>
+          <w:ilvl w:val="0"/>
+          <w:numId w:val="10"/>
+        </w:numPr>
+        <w:rPr>
+          <w:lang w:val="en-US"/>
+        </w:rPr>
+      </w:pPr>
+      <w:r>
+        <w:rPr>
+          <w:lang w:val="en-US"/>
+        </w:rPr>
+        <w:t>First securing a client through a communication channel</w:t>
+      </w:r>
+    </w:p>
+    <w:p>
+      <w:pPr>
+        <w:pStyle w:val="ListParagraph"/>
+        <w:numPr>
+          <w:ilvl w:val="0"/>
+          <w:numId w:val="10"/>
+        </w:numPr>
+        <w:rPr>
+          <w:lang w:val="en-US"/>
+        </w:rPr>
+      </w:pPr>
+      <w:r>
+        <w:rPr>
+          <w:lang w:val="en-US"/>
+        </w:rPr>
+        <w:t>L</w:t>
+      </w:r>
+      <w:r>
+        <w:rPr>
+          <w:lang w:val="en-US"/>
+        </w:rPr>
+        <w:t>ogging the required services for the respective pool of the client</w:t>
+      </w:r>
+    </w:p>
+    <w:p>
+      <w:pPr>
+        <w:pStyle w:val="ListParagraph"/>
+        <w:numPr>
+          <w:ilvl w:val="0"/>
+          <w:numId w:val="10"/>
+        </w:numPr>
+        <w:rPr>
+          <w:lang w:val="en-US"/>
+        </w:rPr>
+      </w:pPr>
+      <w:r>
+        <w:rPr>
+          <w:lang w:val="en-US"/>
+        </w:rPr>
+        <w:t>G</w:t>
+      </w:r>
+      <w:r>
+        <w:rPr>
+          <w:lang w:val="en-US"/>
+        </w:rPr>
+        <w:t>enerating a report of the history of services provided.</w:t>
+      </w:r>
+    </w:p>
+    <w:p>
+      <w:pPr>
+        <w:rPr>
+          <w:lang w:val="en-US"/>
+        </w:rPr>
+      </w:pPr>
+      <w:r>
+        <w:rPr>
+          <w:lang w:val="en-US"/>
+        </w:rPr>
+        <w:t xml:space="preserve">This is multiplied by several clients which can be inefficient to continue executing. </w:t>
+      </w:r>
+      <w:r>
+        <w:rPr>
+          <w:i/>
+          <w:lang w:val="en-US"/>
+        </w:rPr>
+        <w:t>SplashScreen</w:t>
+      </w:r>
+      <w:r>
+        <w:rPr>
+          <w:lang w:val="en-US"/>
+        </w:rPr>
+        <w:t>’s marketplace allows businesses to sift through the general public towards their target market. They can then leave notes for the client based on services provided. This will generate an automatic history report on the previous operations.</w:t>
+      </w:r>
+      <w:bookmarkStart w:id="2" w:name="_GoBack"/>
+      <w:bookmarkEnd w:id="2"/>
+    </w:p>
+    <w:p>
+      <w:pPr>
+        <w:rPr>
+          <w:lang w:val="en-US"/>
+        </w:rPr>
+      </w:pPr>
     </w:p>
     <w:p>
       <w:pPr>
@@ -1826,7 +2142,7 @@
           <w:lang w:val="en-US"/>
         </w:rPr>
       </w:pPr>
-      <w:bookmarkStart w:id="2" w:name="_Toc207787817"/>
+      <w:bookmarkStart w:id="3" w:name="_Toc207787817"/>
       <w:r>
         <w:rPr>
           <w:sz w:val="36"/>
@@ -1834,7 +2150,6 @@
           <w:u w:val="single"/>
           <w:lang w:val="en-US"/>
         </w:rPr>
-        <w:lastRenderedPageBreak/>
         <w:t xml:space="preserve">1.2 Project </w:t>
       </w:r>
       <w:r>
@@ -1846,7 +2161,7 @@
         </w:rPr>
         <w:t>scope</w:t>
       </w:r>
-      <w:bookmarkEnd w:id="2"/>
+      <w:bookmarkEnd w:id="3"/>
     </w:p>
     <w:p>
       <w:pPr>
@@ -1888,7 +2203,16 @@
           <w:sz w:val="23"/>
           <w:szCs w:val="23"/>
         </w:rPr>
-        <w:t xml:space="preserve"> view of data requirements.  This should include a discussion on the information, functional and communication scope of the intended system.  The scope of a project is very important as it sets the expectations of the project.  Be realistic when setting your scope.</w:t>
+        <w:t xml:space="preserve"> view of data requirements.  This should include a discussion on the information, functional and communication scope of the intended system.  The scope of a </w:t>
+      </w:r>
+      <w:r>
+        <w:rPr>
+          <w:color w:val="2E74B5" w:themeColor="accent5" w:themeShade="BF"/>
+          <w:sz w:val="23"/>
+          <w:szCs w:val="23"/>
+        </w:rPr>
+        <w:lastRenderedPageBreak/>
+        <w:t>project is very important as it sets the expectations of the project.  Be realistic when setting your scope.</w:t>
       </w:r>
     </w:p>
     <w:p>
@@ -1908,7 +2232,7 @@
           <w:u w:val="single"/>
         </w:rPr>
       </w:pPr>
-      <w:bookmarkStart w:id="3" w:name="_Toc207787818"/>
+      <w:bookmarkStart w:id="4" w:name="_Toc207787818"/>
       <w:r>
         <w:rPr>
           <w:sz w:val="28"/>
@@ -1917,7 +2241,7 @@
         </w:rPr>
         <w:t>1.2.1 Information scope</w:t>
       </w:r>
-      <w:bookmarkEnd w:id="3"/>
+      <w:bookmarkEnd w:id="4"/>
     </w:p>
     <w:p>
       <w:pPr>
@@ -2152,7 +2476,7 @@
           <w:u w:val="single"/>
         </w:rPr>
       </w:pPr>
-      <w:bookmarkStart w:id="4" w:name="_Toc207787819"/>
+      <w:bookmarkStart w:id="5" w:name="_Toc207787819"/>
       <w:r>
         <w:rPr>
           <w:sz w:val="28"/>
@@ -2161,7 +2485,7 @@
         </w:rPr>
         <w:t>1.2.2 Functional scope</w:t>
       </w:r>
-      <w:bookmarkEnd w:id="4"/>
+      <w:bookmarkEnd w:id="5"/>
     </w:p>
     <w:p>
       <w:pPr>
@@ -2301,7 +2625,7 @@
           <w:u w:val="single"/>
         </w:rPr>
       </w:pPr>
-      <w:bookmarkStart w:id="5" w:name="_Toc207787820"/>
+      <w:bookmarkStart w:id="6" w:name="_Toc207787820"/>
       <w:r>
         <w:rPr>
           <w:sz w:val="28"/>
@@ -2310,7 +2634,7 @@
         </w:rPr>
         <w:t>1.2.3 Communication scope</w:t>
       </w:r>
-      <w:bookmarkEnd w:id="5"/>
+      <w:bookmarkEnd w:id="6"/>
     </w:p>
     <w:p>
       <w:pPr>
@@ -2387,7 +2711,7 @@
           <w:lang w:val="en-US"/>
         </w:rPr>
       </w:pPr>
-      <w:bookmarkStart w:id="6" w:name="_Toc207787821"/>
+      <w:bookmarkStart w:id="7" w:name="_Toc207787821"/>
       <w:r>
         <w:rPr>
           <w:sz w:val="36"/>
@@ -2406,76 +2730,79 @@
         </w:rPr>
         <w:t>Business requirements</w:t>
       </w:r>
-      <w:bookmarkEnd w:id="6"/>
-    </w:p>
-    <w:p>
-      <w:pPr>
-        <w:rPr>
-          <w:lang w:val="en-US"/>
-        </w:rPr>
-      </w:pPr>
-    </w:p>
-    <w:p>
-      <w:r>
-        <w:rPr>
-          <w:lang w:val="en-US"/>
-        </w:rPr>
+      <w:bookmarkEnd w:id="7"/>
+    </w:p>
+    <w:p>
+      <w:pPr>
+        <w:rPr>
+          <w:lang w:val="en-US"/>
+        </w:rPr>
+      </w:pPr>
+    </w:p>
+    <w:p>
+      <w:r>
+        <w:rPr>
+          <w:lang w:val="en-US"/>
+        </w:rPr>
+        <w:t>Business requirements, stakeholder requirements specifications,</w:t>
+      </w:r>
+      <w:r>
+        <w:rPr>
+          <w:lang w:val="en-US"/>
+        </w:rPr>
+        <w:t xml:space="preserve"> defines the </w:t>
+      </w:r>
+      <w:r>
+        <w:rPr>
+          <w:lang w:val="en-US"/>
+        </w:rPr>
+        <w:t xml:space="preserve">characteristics </w:t>
+      </w:r>
+      <w:r>
+        <w:rPr>
+          <w:lang w:val="en-US"/>
+        </w:rPr>
+        <w:t xml:space="preserve">and expectations </w:t>
+      </w:r>
+      <w:r>
+        <w:rPr>
+          <w:lang w:val="en-US"/>
+        </w:rPr>
+        <w:t xml:space="preserve">of a proposed system from the </w:t>
+      </w:r>
+      <w:r>
+        <w:rPr>
+          <w:lang w:val="en-US"/>
+        </w:rPr>
+        <w:t xml:space="preserve">perspective </w:t>
+      </w:r>
+      <w:r>
+        <w:rPr>
+          <w:lang w:val="en-US"/>
+        </w:rPr>
+        <w:t>of the system's end user</w:t>
+      </w:r>
+      <w:r>
+        <w:rPr>
+          <w:lang w:val="en-US"/>
+        </w:rPr>
+        <w:t>s.</w:t>
+      </w:r>
+      <w:r>
+        <w:t xml:space="preserve"> For SplashScreen, there are </w:t>
+      </w:r>
+      <w:r>
+        <w:t>two primary user types</w:t>
+      </w:r>
+      <w:r>
+        <w:t>: pool owners and service providers. Each</w:t>
+      </w:r>
+      <w:r>
+        <w:t xml:space="preserve"> of </w:t>
+      </w:r>
+      <w:r>
         <w:lastRenderedPageBreak/>
-        <w:t>Business requirements, stakeholder requirements specifications,</w:t>
-      </w:r>
-      <w:r>
-        <w:rPr>
-          <w:lang w:val="en-US"/>
-        </w:rPr>
-        <w:t xml:space="preserve"> defines the </w:t>
-      </w:r>
-      <w:r>
-        <w:rPr>
-          <w:lang w:val="en-US"/>
-        </w:rPr>
-        <w:t xml:space="preserve">characteristics </w:t>
-      </w:r>
-      <w:r>
-        <w:rPr>
-          <w:lang w:val="en-US"/>
-        </w:rPr>
-        <w:t xml:space="preserve">and expectations </w:t>
-      </w:r>
-      <w:r>
-        <w:rPr>
-          <w:lang w:val="en-US"/>
-        </w:rPr>
-        <w:t xml:space="preserve">of a proposed system from the </w:t>
-      </w:r>
-      <w:r>
-        <w:rPr>
-          <w:lang w:val="en-US"/>
-        </w:rPr>
-        <w:t xml:space="preserve">perspective </w:t>
-      </w:r>
-      <w:r>
-        <w:rPr>
-          <w:lang w:val="en-US"/>
-        </w:rPr>
-        <w:t>of the system's end user</w:t>
-      </w:r>
-      <w:r>
-        <w:rPr>
-          <w:lang w:val="en-US"/>
-        </w:rPr>
-        <w:t>s.</w:t>
-      </w:r>
-      <w:r>
-        <w:t xml:space="preserve"> For SplashScreen, there are </w:t>
-      </w:r>
-      <w:r>
-        <w:t>two primary user types</w:t>
-      </w:r>
-      <w:r>
-        <w:t>: pool owners and service providers. Each</w:t>
-      </w:r>
-      <w:r>
-        <w:t xml:space="preserve"> of the</w:t>
+        <w:t>the</w:t>
       </w:r>
       <w:r>
         <w:t xml:space="preserve"> user type</w:t>
@@ -2516,7 +2843,7 @@
           <w:lang w:val="en-US"/>
         </w:rPr>
       </w:pPr>
-      <w:bookmarkStart w:id="7" w:name="_Toc207787822"/>
+      <w:bookmarkStart w:id="8" w:name="_Toc207787822"/>
       <w:r>
         <w:rPr>
           <w:sz w:val="36"/>
@@ -2535,7 +2862,7 @@
         </w:rPr>
         <w:t>Hardware and Software Requirements</w:t>
       </w:r>
-      <w:bookmarkEnd w:id="7"/>
+      <w:bookmarkEnd w:id="8"/>
     </w:p>
     <w:p>
       <w:pPr>
@@ -2598,7 +2925,7 @@
           <w:lang w:val="en-US"/>
         </w:rPr>
       </w:pPr>
-      <w:bookmarkStart w:id="8" w:name="_Toc207787823"/>
+      <w:bookmarkStart w:id="9" w:name="_Toc207787823"/>
       <w:r>
         <w:rPr>
           <w:sz w:val="28"/>
@@ -2608,7 +2935,7 @@
         </w:rPr>
         <w:t>1.4.1 Software Requirements</w:t>
       </w:r>
-      <w:bookmarkEnd w:id="8"/>
+      <w:bookmarkEnd w:id="9"/>
     </w:p>
     <w:p>
       <w:pPr>
@@ -2743,23 +3070,7 @@
           <w:color w:val="2E74B5" w:themeColor="accent5" w:themeShade="BF"/>
           <w:lang w:val="en-US"/>
         </w:rPr>
-        <w:t xml:space="preserve"> will be used as </w:t>
-      </w:r>
-      <w:proofErr w:type="gramStart"/>
-      <w:r>
-        <w:rPr>
-          <w:color w:val="2E74B5" w:themeColor="accent5" w:themeShade="BF"/>
-          <w:lang w:val="en-US"/>
-        </w:rPr>
-        <w:t>the</w:t>
-      </w:r>
-      <w:proofErr w:type="gramEnd"/>
-      <w:r>
-        <w:rPr>
-          <w:color w:val="2E74B5" w:themeColor="accent5" w:themeShade="BF"/>
-          <w:lang w:val="en-US"/>
-        </w:rPr>
-        <w:t xml:space="preserve"> shared online database.</w:t>
+        <w:t xml:space="preserve"> will be used as the shared online database.</w:t>
       </w:r>
     </w:p>
     <w:p>
@@ -2864,7 +3175,7 @@
           <w:lang w:val="en-US"/>
         </w:rPr>
       </w:pPr>
-      <w:bookmarkStart w:id="9" w:name="_Toc207787824"/>
+      <w:bookmarkStart w:id="10" w:name="_Toc207787824"/>
       <w:r>
         <w:rPr>
           <w:sz w:val="28"/>
@@ -2874,7 +3185,7 @@
         </w:rPr>
         <w:t>1.4.2 Hardware Requirements</w:t>
       </w:r>
-      <w:bookmarkEnd w:id="9"/>
+      <w:bookmarkEnd w:id="10"/>
     </w:p>
     <w:p>
       <w:pPr>
@@ -2991,7 +3302,7 @@
           <w:lang w:val="en-US"/>
         </w:rPr>
       </w:pPr>
-      <w:bookmarkStart w:id="10" w:name="_Toc207787825"/>
+      <w:bookmarkStart w:id="11" w:name="_Toc207787825"/>
       <w:r>
         <w:rPr>
           <w:sz w:val="36"/>
@@ -3010,7 +3321,7 @@
         </w:rPr>
         <w:t>Design constraints</w:t>
       </w:r>
-      <w:bookmarkEnd w:id="10"/>
+      <w:bookmarkEnd w:id="11"/>
     </w:p>
     <w:p>
       <w:pPr>
@@ -3034,7 +3345,6 @@
           <w:color w:val="2E74B5" w:themeColor="accent5" w:themeShade="BF"/>
           <w:lang w:val="en-US"/>
         </w:rPr>
-        <w:lastRenderedPageBreak/>
         <w:t>In this section, discuss any constraints that there might be on the system development and / or deployment process.  This can include things such as security, interface and performance constraints.</w:t>
       </w:r>
     </w:p>
@@ -3055,7 +3365,7 @@
           <w:lang w:val="en-US"/>
         </w:rPr>
       </w:pPr>
-      <w:bookmarkStart w:id="11" w:name="_Toc207787826"/>
+      <w:bookmarkStart w:id="12" w:name="_Toc207787826"/>
       <w:r>
         <w:rPr>
           <w:sz w:val="28"/>
@@ -3065,7 +3375,7 @@
         </w:rPr>
         <w:t>1.5.1 Security constraints</w:t>
       </w:r>
-      <w:bookmarkEnd w:id="11"/>
+      <w:bookmarkEnd w:id="12"/>
     </w:p>
     <w:p>
       <w:pPr>
@@ -3190,7 +3500,7 @@
           <w:lang w:val="en-US"/>
         </w:rPr>
       </w:pPr>
-      <w:bookmarkStart w:id="12" w:name="_Toc207787827"/>
+      <w:bookmarkStart w:id="13" w:name="_Toc207787827"/>
       <w:r>
         <w:rPr>
           <w:sz w:val="28"/>
@@ -3200,7 +3510,7 @@
         </w:rPr>
         <w:t>1.5.2 Interface constraints</w:t>
       </w:r>
-      <w:bookmarkEnd w:id="12"/>
+      <w:bookmarkEnd w:id="13"/>
     </w:p>
     <w:p>
       <w:pPr>
@@ -3266,7 +3576,7 @@
           <w:lang w:val="en-US"/>
         </w:rPr>
       </w:pPr>
-      <w:bookmarkStart w:id="13" w:name="_Toc207787828"/>
+      <w:bookmarkStart w:id="14" w:name="_Toc207787828"/>
       <w:r>
         <w:rPr>
           <w:sz w:val="28"/>
@@ -3276,7 +3586,7 @@
         </w:rPr>
         <w:t>1.5.3 Performance constraints</w:t>
       </w:r>
-      <w:bookmarkEnd w:id="13"/>
+      <w:bookmarkEnd w:id="14"/>
     </w:p>
     <w:p>
       <w:pPr>
@@ -3298,23 +3608,7 @@
           <w:color w:val="2E74B5" w:themeColor="accent5" w:themeShade="BF"/>
           <w:lang w:val="en-US"/>
         </w:rPr>
-        <w:t xml:space="preserve">The system should be optimized to ensure that searches through the web interface are fast and efficient.  The mobile application should be optimized for use on </w:t>
-      </w:r>
-      <w:proofErr w:type="gramStart"/>
-      <w:r>
-        <w:rPr>
-          <w:color w:val="2E74B5" w:themeColor="accent5" w:themeShade="BF"/>
-          <w:lang w:val="en-US"/>
-        </w:rPr>
-        <w:t>low end</w:t>
-      </w:r>
-      <w:proofErr w:type="gramEnd"/>
-      <w:r>
-        <w:rPr>
-          <w:color w:val="2E74B5" w:themeColor="accent5" w:themeShade="BF"/>
-          <w:lang w:val="en-US"/>
-        </w:rPr>
-        <w:t xml:space="preserve"> mobile devices with low memory capacity and older processors.</w:t>
+        <w:t>The system should be optimized to ensure that searches through the web interface are fast and efficient.  The mobile application should be optimized for use on low end mobile devices with low memory capacity and older processors.</w:t>
       </w:r>
     </w:p>
     <w:p>
@@ -3333,7 +3627,7 @@
           <w:lang w:val="en-US"/>
         </w:rPr>
       </w:pPr>
-      <w:bookmarkStart w:id="14" w:name="_Toc207787829"/>
+      <w:bookmarkStart w:id="15" w:name="_Toc207787829"/>
       <w:r>
         <w:rPr>
           <w:sz w:val="36"/>
@@ -3341,29 +3635,9 @@
           <w:u w:val="single"/>
           <w:lang w:val="en-US"/>
         </w:rPr>
-        <w:t>1.6 High-</w:t>
-      </w:r>
-      <w:proofErr w:type="gramStart"/>
-      <w:r>
-        <w:rPr>
-          <w:sz w:val="36"/>
-          <w:szCs w:val="36"/>
-          <w:u w:val="single"/>
-          <w:lang w:val="en-US"/>
-        </w:rPr>
-        <w:t>level use</w:t>
-      </w:r>
-      <w:proofErr w:type="gramEnd"/>
-      <w:r>
-        <w:rPr>
-          <w:sz w:val="36"/>
-          <w:szCs w:val="36"/>
-          <w:u w:val="single"/>
-          <w:lang w:val="en-US"/>
-        </w:rPr>
-        <w:t xml:space="preserve"> case diagram</w:t>
-      </w:r>
-      <w:bookmarkEnd w:id="14"/>
+        <w:t>1.6 High-level use case diagram</w:t>
+      </w:r>
+      <w:bookmarkEnd w:id="15"/>
     </w:p>
     <w:p>
       <w:pPr>
@@ -3386,39 +3660,7 @@
           <w:color w:val="2E74B5" w:themeColor="accent5" w:themeShade="BF"/>
           <w:lang w:val="en-US"/>
         </w:rPr>
-        <w:t xml:space="preserve">The purpose of </w:t>
-      </w:r>
-      <w:proofErr w:type="gramStart"/>
-      <w:r>
-        <w:rPr>
-          <w:color w:val="2E74B5" w:themeColor="accent5" w:themeShade="BF"/>
-          <w:lang w:val="en-US"/>
-        </w:rPr>
-        <w:t>a use</w:t>
-      </w:r>
-      <w:proofErr w:type="gramEnd"/>
-      <w:r>
-        <w:rPr>
-          <w:color w:val="2E74B5" w:themeColor="accent5" w:themeShade="BF"/>
-          <w:lang w:val="en-US"/>
-        </w:rPr>
-        <w:t xml:space="preserve"> case diagram in UML is to demonstrate the different ways that a user might interact with a system.  </w:t>
-      </w:r>
-      <w:proofErr w:type="gramStart"/>
-      <w:r>
-        <w:rPr>
-          <w:color w:val="2E74B5" w:themeColor="accent5" w:themeShade="BF"/>
-          <w:lang w:val="en-US"/>
-        </w:rPr>
-        <w:t>A use</w:t>
-      </w:r>
-      <w:proofErr w:type="gramEnd"/>
-      <w:r>
-        <w:rPr>
-          <w:color w:val="2E74B5" w:themeColor="accent5" w:themeShade="BF"/>
-          <w:lang w:val="en-US"/>
-        </w:rPr>
-        <w:t xml:space="preserve"> case diagram can summarize the details of your system's users (also known as actors) and their interactions with the system.  </w:t>
+        <w:t xml:space="preserve">The purpose of a use case diagram in UML is to demonstrate the different ways that a user might interact with a system.  A use case diagram can summarize the details of your system's users (also known as actors) and their interactions with the system.  </w:t>
       </w:r>
     </w:p>
     <w:p>
@@ -3489,23 +3731,7 @@
           <w:color w:val="2E74B5" w:themeColor="accent5" w:themeShade="BF"/>
           <w:lang w:val="en-US"/>
         </w:rPr>
-        <w:t xml:space="preserve"> presents a high-</w:t>
-      </w:r>
-      <w:proofErr w:type="gramStart"/>
-      <w:r>
-        <w:rPr>
-          <w:color w:val="2E74B5" w:themeColor="accent5" w:themeShade="BF"/>
-          <w:lang w:val="en-US"/>
-        </w:rPr>
-        <w:t>level use</w:t>
-      </w:r>
-      <w:proofErr w:type="gramEnd"/>
-      <w:r>
-        <w:rPr>
-          <w:color w:val="2E74B5" w:themeColor="accent5" w:themeShade="BF"/>
-          <w:lang w:val="en-US"/>
-        </w:rPr>
-        <w:t xml:space="preserve"> case diagram of the proposed system and its users.</w:t>
+        <w:t xml:space="preserve"> presents a high-level use case diagram of the proposed system and its users.</w:t>
       </w:r>
     </w:p>
     <w:p>
@@ -3578,14 +3804,27 @@
       <w:r>
         <w:t xml:space="preserve">Figure </w:t>
       </w:r>
-      <w:fldSimple w:instr=" SEQ Figure \* ARABIC ">
-        <w:r>
-          <w:rPr>
-            <w:noProof/>
-          </w:rPr>
-          <w:t>1</w:t>
-        </w:r>
-      </w:fldSimple>
+      <w:r>
+        <w:fldChar w:fldCharType="begin"/>
+      </w:r>
+      <w:r>
+        <w:instrText xml:space="preserve"> SEQ Figure \* ARABIC </w:instrText>
+      </w:r>
+      <w:r>
+        <w:fldChar w:fldCharType="separate"/>
+      </w:r>
+      <w:r>
+        <w:rPr>
+          <w:noProof/>
+        </w:rPr>
+        <w:t>1</w:t>
+      </w:r>
+      <w:r>
+        <w:rPr>
+          <w:noProof/>
+        </w:rPr>
+        <w:fldChar w:fldCharType="end"/>
+      </w:r>
       <w:r>
         <w:rPr>
           <w:noProof/>
@@ -3607,7 +3846,7 @@
           <w:lang w:val="en-US"/>
         </w:rPr>
       </w:pPr>
-      <w:bookmarkStart w:id="15" w:name="_Toc207787830"/>
+      <w:bookmarkStart w:id="16" w:name="_Toc207787830"/>
       <w:r>
         <w:rPr>
           <w:sz w:val="36"/>
@@ -3626,7 +3865,7 @@
         </w:rPr>
         <w:t>UML Class Model / Diagram</w:t>
       </w:r>
-      <w:bookmarkEnd w:id="15"/>
+      <w:bookmarkEnd w:id="16"/>
     </w:p>
     <w:p>
       <w:pPr>
@@ -3888,14 +4127,27 @@
       <w:r>
         <w:fldChar w:fldCharType="end"/>
       </w:r>
-      <w:fldSimple w:instr=" SEQ Figure \* ARABIC \s 1 ">
-        <w:r>
-          <w:rPr>
-            <w:noProof/>
-          </w:rPr>
-          <w:t>1</w:t>
-        </w:r>
-      </w:fldSimple>
+      <w:r>
+        <w:fldChar w:fldCharType="begin"/>
+      </w:r>
+      <w:r>
+        <w:instrText xml:space="preserve"> SEQ Figure \* ARABIC \s 1 </w:instrText>
+      </w:r>
+      <w:r>
+        <w:fldChar w:fldCharType="separate"/>
+      </w:r>
+      <w:r>
+        <w:rPr>
+          <w:noProof/>
+        </w:rPr>
+        <w:t>1</w:t>
+      </w:r>
+      <w:r>
+        <w:rPr>
+          <w:noProof/>
+        </w:rPr>
+        <w:fldChar w:fldCharType="end"/>
+      </w:r>
       <w:r>
         <w:t>.</w:t>
       </w:r>
@@ -3930,7 +4182,7 @@
           <w:lang w:val="en-US"/>
         </w:rPr>
       </w:pPr>
-      <w:bookmarkStart w:id="16" w:name="_Toc207787831"/>
+      <w:bookmarkStart w:id="17" w:name="_Toc207787831"/>
       <w:r>
         <w:rPr>
           <w:sz w:val="36"/>
@@ -3958,7 +4210,7 @@
         </w:rPr>
         <w:t xml:space="preserve"> Relational Database Model Diagram</w:t>
       </w:r>
-      <w:bookmarkEnd w:id="16"/>
+      <w:bookmarkEnd w:id="17"/>
     </w:p>
     <w:p>
       <w:pPr>
@@ -4266,7 +4518,7 @@
           <w:lang w:val="en-US"/>
         </w:rPr>
       </w:pPr>
-      <w:bookmarkStart w:id="17" w:name="_Toc207787832"/>
+      <w:bookmarkStart w:id="18" w:name="_Toc207787832"/>
       <w:r>
         <w:rPr>
           <w:sz w:val="36"/>
@@ -4294,7 +4546,7 @@
         </w:rPr>
         <w:t xml:space="preserve"> User Interface Design</w:t>
       </w:r>
-      <w:bookmarkEnd w:id="17"/>
+      <w:bookmarkEnd w:id="18"/>
       <w:r>
         <w:rPr>
           <w:sz w:val="36"/>
@@ -4555,55 +4807,7 @@
           <w:color w:val="2E74B5" w:themeColor="accent5" w:themeShade="BF"/>
           <w:lang w:val="en-US"/>
         </w:rPr>
-        <w:t xml:space="preserve">NAME system.  The screen </w:t>
-      </w:r>
-      <w:proofErr w:type="gramStart"/>
-      <w:r>
-        <w:rPr>
-          <w:color w:val="2E74B5" w:themeColor="accent5" w:themeShade="BF"/>
-          <w:lang w:val="en-US"/>
-        </w:rPr>
-        <w:t>requires that</w:t>
-      </w:r>
-      <w:proofErr w:type="gramEnd"/>
-      <w:r>
-        <w:rPr>
-          <w:color w:val="2E74B5" w:themeColor="accent5" w:themeShade="BF"/>
-          <w:lang w:val="en-US"/>
-        </w:rPr>
-        <w:t xml:space="preserve"> a user </w:t>
-      </w:r>
-      <w:proofErr w:type="gramStart"/>
-      <w:r>
-        <w:rPr>
-          <w:color w:val="2E74B5" w:themeColor="accent5" w:themeShade="BF"/>
-          <w:lang w:val="en-US"/>
-        </w:rPr>
-        <w:t>enter</w:t>
-      </w:r>
-      <w:proofErr w:type="gramEnd"/>
-      <w:r>
-        <w:rPr>
-          <w:color w:val="2E74B5" w:themeColor="accent5" w:themeShade="BF"/>
-          <w:lang w:val="en-US"/>
-        </w:rPr>
-        <w:t xml:space="preserve"> their email address (as a username) and a password.  Upon successful login, the user will be redirected to the system’s landing page.  The screen also provides the user with an option to use </w:t>
-      </w:r>
-      <w:proofErr w:type="gramStart"/>
-      <w:r>
-        <w:rPr>
-          <w:color w:val="2E74B5" w:themeColor="accent5" w:themeShade="BF"/>
-          <w:lang w:val="en-US"/>
-        </w:rPr>
-        <w:t>in the event that</w:t>
-      </w:r>
-      <w:proofErr w:type="gramEnd"/>
-      <w:r>
-        <w:rPr>
-          <w:color w:val="2E74B5" w:themeColor="accent5" w:themeShade="BF"/>
-          <w:lang w:val="en-US"/>
-        </w:rPr>
-        <w:t xml:space="preserve"> they have forgotten their password.</w:t>
+        <w:t>NAME system.  The screen requires that a user enter their email address (as a username) and a password.  Upon successful login, the user will be redirected to the system’s landing page.  The screen also provides the user with an option to use in the event that they have forgotten their password.</w:t>
       </w:r>
     </w:p>
     <w:p>
@@ -4739,7 +4943,7 @@
 </file>
 
 <file path=word/endnotes.xml><?xml version="1.0" encoding="utf-8"?>
-<w:endnotes xmlns:wpc="http://schemas.microsoft.com/office/word/2010/wordprocessingCanvas" xmlns:cx="http://schemas.microsoft.com/office/drawing/2014/chartex" xmlns:cx1="http://schemas.microsoft.com/office/drawing/2015/9/8/chartex" xmlns:cx2="http://schemas.microsoft.com/office/drawing/2015/10/21/chartex" xmlns:cx3="http://schemas.microsoft.com/office/drawing/2016/5/9/chartex" xmlns:cx4="http://schemas.microsoft.com/office/drawing/2016/5/10/chartex" xmlns:cx5="http://schemas.microsoft.com/office/drawing/2016/5/11/chartex" xmlns:cx6="http://schemas.microsoft.com/office/drawing/2016/5/12/chartex" xmlns:cx7="http://schemas.microsoft.com/office/drawing/2016/5/13/chartex" xmlns:cx8="http://schemas.microsoft.com/office/drawing/2016/5/14/chartex" xmlns:mc="http://schemas.openxmlformats.org/markup-compatibility/2006" xmlns:aink="http://schemas.microsoft.com/office/drawing/2016/ink" xmlns:am3d="http://schemas.microsoft.com/office/drawing/2017/model3d" xmlns:o="urn:schemas-microsoft-com:office:office" xmlns:oel="http://schemas.microsoft.com/office/2019/extlst" xmlns:r="http://schemas.openxmlformats.org/officeDocument/2006/relationships" xmlns:m="http://schemas.openxmlformats.org/officeDocument/2006/math" xmlns:v="urn:schemas-microsoft-com:vml" xmlns:wp14="http://schemas.microsoft.com/office/word/2010/wordprocessingDrawing" xmlns:wp="http://schemas.openxmlformats.org/drawingml/2006/wordprocessingDrawing" xmlns:w10="urn:schemas-microsoft-com:office:word" xmlns:w="http://schemas.openxmlformats.org/wordprocessingml/2006/main" xmlns:w14="http://schemas.microsoft.com/office/word/2010/wordml" xmlns:w15="http://schemas.microsoft.com/office/word/2012/wordml" xmlns:w16cex="http://schemas.microsoft.com/office/word/2018/wordml/cex" xmlns:w16cid="http://schemas.microsoft.com/office/word/2016/wordml/cid" xmlns:w16="http://schemas.microsoft.com/office/word/2018/wordml" xmlns:w16du="http://schemas.microsoft.com/office/word/2023/wordml/word16du" xmlns:w16sdtdh="http://schemas.microsoft.com/office/word/2020/wordml/sdtdatahash" xmlns:w16sdtfl="http://schemas.microsoft.com/office/word/2024/wordml/sdtformatlock" xmlns:w16se="http://schemas.microsoft.com/office/word/2015/wordml/symex" xmlns:wpg="http://schemas.microsoft.com/office/word/2010/wordprocessingGroup" xmlns:wpi="http://schemas.microsoft.com/office/word/2010/wordprocessingInk" xmlns:wne="http://schemas.microsoft.com/office/word/2006/wordml" xmlns:wps="http://schemas.microsoft.com/office/word/2010/wordprocessingShape" mc:Ignorable="w14 w15 w16se w16cid w16 w16cex w16sdtdh w16sdtfl w16du wp14">
+<w:endnotes xmlns:wpc="http://schemas.microsoft.com/office/word/2010/wordprocessingCanvas" xmlns:cx="http://schemas.microsoft.com/office/drawing/2014/chartex" xmlns:cx1="http://schemas.microsoft.com/office/drawing/2015/9/8/chartex" xmlns:cx2="http://schemas.microsoft.com/office/drawing/2015/10/21/chartex" xmlns:cx3="http://schemas.microsoft.com/office/drawing/2016/5/9/chartex" xmlns:cx4="http://schemas.microsoft.com/office/drawing/2016/5/10/chartex" xmlns:cx5="http://schemas.microsoft.com/office/drawing/2016/5/11/chartex" xmlns:cx6="http://schemas.microsoft.com/office/drawing/2016/5/12/chartex" xmlns:cx7="http://schemas.microsoft.com/office/drawing/2016/5/13/chartex" xmlns:cx8="http://schemas.microsoft.com/office/drawing/2016/5/14/chartex" xmlns:mc="http://schemas.openxmlformats.org/markup-compatibility/2006" xmlns:aink="http://schemas.microsoft.com/office/drawing/2016/ink" xmlns:am3d="http://schemas.microsoft.com/office/drawing/2017/model3d" xmlns:o="urn:schemas-microsoft-com:office:office" xmlns:r="http://schemas.openxmlformats.org/officeDocument/2006/relationships" xmlns:m="http://schemas.openxmlformats.org/officeDocument/2006/math" xmlns:v="urn:schemas-microsoft-com:vml" xmlns:wp14="http://schemas.microsoft.com/office/word/2010/wordprocessingDrawing" xmlns:wp="http://schemas.openxmlformats.org/drawingml/2006/wordprocessingDrawing" xmlns:w10="urn:schemas-microsoft-com:office:word" xmlns:w="http://schemas.openxmlformats.org/wordprocessingml/2006/main" xmlns:w14="http://schemas.microsoft.com/office/word/2010/wordml" xmlns:w15="http://schemas.microsoft.com/office/word/2012/wordml" xmlns:w16cid="http://schemas.microsoft.com/office/word/2016/wordml/cid" xmlns:w16se="http://schemas.microsoft.com/office/word/2015/wordml/symex" xmlns:wpg="http://schemas.microsoft.com/office/word/2010/wordprocessingGroup" xmlns:wpi="http://schemas.microsoft.com/office/word/2010/wordprocessingInk" xmlns:wne="http://schemas.microsoft.com/office/word/2006/wordml" xmlns:wps="http://schemas.microsoft.com/office/word/2010/wordprocessingShape" mc:Ignorable="w14 w15 w16se w16cid wp14">
   <w:endnote w:type="separator" w:id="-1">
     <w:p>
       <w:r>
@@ -4758,7 +4962,7 @@
 </file>
 
 <file path=word/footer1.xml><?xml version="1.0" encoding="utf-8"?>
-<w:ftr xmlns:wpc="http://schemas.microsoft.com/office/word/2010/wordprocessingCanvas" xmlns:cx="http://schemas.microsoft.com/office/drawing/2014/chartex" xmlns:cx1="http://schemas.microsoft.com/office/drawing/2015/9/8/chartex" xmlns:cx2="http://schemas.microsoft.com/office/drawing/2015/10/21/chartex" xmlns:cx3="http://schemas.microsoft.com/office/drawing/2016/5/9/chartex" xmlns:cx4="http://schemas.microsoft.com/office/drawing/2016/5/10/chartex" xmlns:cx5="http://schemas.microsoft.com/office/drawing/2016/5/11/chartex" xmlns:cx6="http://schemas.microsoft.com/office/drawing/2016/5/12/chartex" xmlns:cx7="http://schemas.microsoft.com/office/drawing/2016/5/13/chartex" xmlns:cx8="http://schemas.microsoft.com/office/drawing/2016/5/14/chartex" xmlns:mc="http://schemas.openxmlformats.org/markup-compatibility/2006" xmlns:aink="http://schemas.microsoft.com/office/drawing/2016/ink" xmlns:am3d="http://schemas.microsoft.com/office/drawing/2017/model3d" xmlns:o="urn:schemas-microsoft-com:office:office" xmlns:oel="http://schemas.microsoft.com/office/2019/extlst" xmlns:r="http://schemas.openxmlformats.org/officeDocument/2006/relationships" xmlns:m="http://schemas.openxmlformats.org/officeDocument/2006/math" xmlns:v="urn:schemas-microsoft-com:vml" xmlns:wp14="http://schemas.microsoft.com/office/word/2010/wordprocessingDrawing" xmlns:wp="http://schemas.openxmlformats.org/drawingml/2006/wordprocessingDrawing" xmlns:w10="urn:schemas-microsoft-com:office:word" xmlns:w="http://schemas.openxmlformats.org/wordprocessingml/2006/main" xmlns:w14="http://schemas.microsoft.com/office/word/2010/wordml" xmlns:w15="http://schemas.microsoft.com/office/word/2012/wordml" xmlns:w16cex="http://schemas.microsoft.com/office/word/2018/wordml/cex" xmlns:w16cid="http://schemas.microsoft.com/office/word/2016/wordml/cid" xmlns:w16="http://schemas.microsoft.com/office/word/2018/wordml" xmlns:w16du="http://schemas.microsoft.com/office/word/2023/wordml/word16du" xmlns:w16sdtdh="http://schemas.microsoft.com/office/word/2020/wordml/sdtdatahash" xmlns:w16sdtfl="http://schemas.microsoft.com/office/word/2024/wordml/sdtformatlock" xmlns:w16se="http://schemas.microsoft.com/office/word/2015/wordml/symex" xmlns:wpg="http://schemas.microsoft.com/office/word/2010/wordprocessingGroup" xmlns:wpi="http://schemas.microsoft.com/office/word/2010/wordprocessingInk" xmlns:wne="http://schemas.microsoft.com/office/word/2006/wordml" xmlns:wps="http://schemas.microsoft.com/office/word/2010/wordprocessingShape" mc:Ignorable="w14 w15 w16se w16cid w16 w16cex w16sdtdh w16sdtfl w16du wp14">
+<w:ftr xmlns:wpc="http://schemas.microsoft.com/office/word/2010/wordprocessingCanvas" xmlns:cx="http://schemas.microsoft.com/office/drawing/2014/chartex" xmlns:cx1="http://schemas.microsoft.com/office/drawing/2015/9/8/chartex" xmlns:cx2="http://schemas.microsoft.com/office/drawing/2015/10/21/chartex" xmlns:cx3="http://schemas.microsoft.com/office/drawing/2016/5/9/chartex" xmlns:cx4="http://schemas.microsoft.com/office/drawing/2016/5/10/chartex" xmlns:cx5="http://schemas.microsoft.com/office/drawing/2016/5/11/chartex" xmlns:cx6="http://schemas.microsoft.com/office/drawing/2016/5/12/chartex" xmlns:cx7="http://schemas.microsoft.com/office/drawing/2016/5/13/chartex" xmlns:cx8="http://schemas.microsoft.com/office/drawing/2016/5/14/chartex" xmlns:mc="http://schemas.openxmlformats.org/markup-compatibility/2006" xmlns:aink="http://schemas.microsoft.com/office/drawing/2016/ink" xmlns:am3d="http://schemas.microsoft.com/office/drawing/2017/model3d" xmlns:o="urn:schemas-microsoft-com:office:office" xmlns:r="http://schemas.openxmlformats.org/officeDocument/2006/relationships" xmlns:m="http://schemas.openxmlformats.org/officeDocument/2006/math" xmlns:v="urn:schemas-microsoft-com:vml" xmlns:wp14="http://schemas.microsoft.com/office/word/2010/wordprocessingDrawing" xmlns:wp="http://schemas.openxmlformats.org/drawingml/2006/wordprocessingDrawing" xmlns:w10="urn:schemas-microsoft-com:office:word" xmlns:w="http://schemas.openxmlformats.org/wordprocessingml/2006/main" xmlns:w14="http://schemas.microsoft.com/office/word/2010/wordml" xmlns:w15="http://schemas.microsoft.com/office/word/2012/wordml" xmlns:w16cid="http://schemas.microsoft.com/office/word/2016/wordml/cid" xmlns:w16se="http://schemas.microsoft.com/office/word/2015/wordml/symex" xmlns:wpg="http://schemas.microsoft.com/office/word/2010/wordprocessingGroup" xmlns:wpi="http://schemas.microsoft.com/office/word/2010/wordprocessingInk" xmlns:wne="http://schemas.microsoft.com/office/word/2006/wordml" xmlns:wps="http://schemas.microsoft.com/office/word/2010/wordprocessingShape" mc:Ignorable="w14 w15 w16se w16cid wp14">
   <w:p>
     <w:pPr>
       <w:pStyle w:val="Footer"/>
@@ -4776,7 +4980,7 @@
 </file>
 
 <file path=word/footnotes.xml><?xml version="1.0" encoding="utf-8"?>
-<w:footnotes xmlns:wpc="http://schemas.microsoft.com/office/word/2010/wordprocessingCanvas" xmlns:cx="http://schemas.microsoft.com/office/drawing/2014/chartex" xmlns:cx1="http://schemas.microsoft.com/office/drawing/2015/9/8/chartex" xmlns:cx2="http://schemas.microsoft.com/office/drawing/2015/10/21/chartex" xmlns:cx3="http://schemas.microsoft.com/office/drawing/2016/5/9/chartex" xmlns:cx4="http://schemas.microsoft.com/office/drawing/2016/5/10/chartex" xmlns:cx5="http://schemas.microsoft.com/office/drawing/2016/5/11/chartex" xmlns:cx6="http://schemas.microsoft.com/office/drawing/2016/5/12/chartex" xmlns:cx7="http://schemas.microsoft.com/office/drawing/2016/5/13/chartex" xmlns:cx8="http://schemas.microsoft.com/office/drawing/2016/5/14/chartex" xmlns:mc="http://schemas.openxmlformats.org/markup-compatibility/2006" xmlns:aink="http://schemas.microsoft.com/office/drawing/2016/ink" xmlns:am3d="http://schemas.microsoft.com/office/drawing/2017/model3d" xmlns:o="urn:schemas-microsoft-com:office:office" xmlns:oel="http://schemas.microsoft.com/office/2019/extlst" xmlns:r="http://schemas.openxmlformats.org/officeDocument/2006/relationships" xmlns:m="http://schemas.openxmlformats.org/officeDocument/2006/math" xmlns:v="urn:schemas-microsoft-com:vml" xmlns:wp14="http://schemas.microsoft.com/office/word/2010/wordprocessingDrawing" xmlns:wp="http://schemas.openxmlformats.org/drawingml/2006/wordprocessingDrawing" xmlns:w10="urn:schemas-microsoft-com:office:word" xmlns:w="http://schemas.openxmlformats.org/wordprocessingml/2006/main" xmlns:w14="http://schemas.microsoft.com/office/word/2010/wordml" xmlns:w15="http://schemas.microsoft.com/office/word/2012/wordml" xmlns:w16cex="http://schemas.microsoft.com/office/word/2018/wordml/cex" xmlns:w16cid="http://schemas.microsoft.com/office/word/2016/wordml/cid" xmlns:w16="http://schemas.microsoft.com/office/word/2018/wordml" xmlns:w16du="http://schemas.microsoft.com/office/word/2023/wordml/word16du" xmlns:w16sdtdh="http://schemas.microsoft.com/office/word/2020/wordml/sdtdatahash" xmlns:w16sdtfl="http://schemas.microsoft.com/office/word/2024/wordml/sdtformatlock" xmlns:w16se="http://schemas.microsoft.com/office/word/2015/wordml/symex" xmlns:wpg="http://schemas.microsoft.com/office/word/2010/wordprocessingGroup" xmlns:wpi="http://schemas.microsoft.com/office/word/2010/wordprocessingInk" xmlns:wne="http://schemas.microsoft.com/office/word/2006/wordml" xmlns:wps="http://schemas.microsoft.com/office/word/2010/wordprocessingShape" mc:Ignorable="w14 w15 w16se w16cid w16 w16cex w16sdtdh w16sdtfl w16du wp14">
+<w:footnotes xmlns:wpc="http://schemas.microsoft.com/office/word/2010/wordprocessingCanvas" xmlns:cx="http://schemas.microsoft.com/office/drawing/2014/chartex" xmlns:cx1="http://schemas.microsoft.com/office/drawing/2015/9/8/chartex" xmlns:cx2="http://schemas.microsoft.com/office/drawing/2015/10/21/chartex" xmlns:cx3="http://schemas.microsoft.com/office/drawing/2016/5/9/chartex" xmlns:cx4="http://schemas.microsoft.com/office/drawing/2016/5/10/chartex" xmlns:cx5="http://schemas.microsoft.com/office/drawing/2016/5/11/chartex" xmlns:cx6="http://schemas.microsoft.com/office/drawing/2016/5/12/chartex" xmlns:cx7="http://schemas.microsoft.com/office/drawing/2016/5/13/chartex" xmlns:cx8="http://schemas.microsoft.com/office/drawing/2016/5/14/chartex" xmlns:mc="http://schemas.openxmlformats.org/markup-compatibility/2006" xmlns:aink="http://schemas.microsoft.com/office/drawing/2016/ink" xmlns:am3d="http://schemas.microsoft.com/office/drawing/2017/model3d" xmlns:o="urn:schemas-microsoft-com:office:office" xmlns:r="http://schemas.openxmlformats.org/officeDocument/2006/relationships" xmlns:m="http://schemas.openxmlformats.org/officeDocument/2006/math" xmlns:v="urn:schemas-microsoft-com:vml" xmlns:wp14="http://schemas.microsoft.com/office/word/2010/wordprocessingDrawing" xmlns:wp="http://schemas.openxmlformats.org/drawingml/2006/wordprocessingDrawing" xmlns:w10="urn:schemas-microsoft-com:office:word" xmlns:w="http://schemas.openxmlformats.org/wordprocessingml/2006/main" xmlns:w14="http://schemas.microsoft.com/office/word/2010/wordml" xmlns:w15="http://schemas.microsoft.com/office/word/2012/wordml" xmlns:w16cid="http://schemas.microsoft.com/office/word/2016/wordml/cid" xmlns:w16se="http://schemas.microsoft.com/office/word/2015/wordml/symex" xmlns:wpg="http://schemas.microsoft.com/office/word/2010/wordprocessingGroup" xmlns:wpi="http://schemas.microsoft.com/office/word/2010/wordprocessingInk" xmlns:wne="http://schemas.microsoft.com/office/word/2006/wordml" xmlns:wps="http://schemas.microsoft.com/office/word/2010/wordprocessingShape" mc:Ignorable="w14 w15 w16se w16cid wp14">
   <w:footnote w:type="separator" w:id="-1">
     <w:p>
       <w:r>
@@ -4795,7 +4999,7 @@
 </file>
 
 <file path=word/header1.xml><?xml version="1.0" encoding="utf-8"?>
-<w:hdr xmlns:wpc="http://schemas.microsoft.com/office/word/2010/wordprocessingCanvas" xmlns:cx="http://schemas.microsoft.com/office/drawing/2014/chartex" xmlns:cx1="http://schemas.microsoft.com/office/drawing/2015/9/8/chartex" xmlns:cx2="http://schemas.microsoft.com/office/drawing/2015/10/21/chartex" xmlns:cx3="http://schemas.microsoft.com/office/drawing/2016/5/9/chartex" xmlns:cx4="http://schemas.microsoft.com/office/drawing/2016/5/10/chartex" xmlns:cx5="http://schemas.microsoft.com/office/drawing/2016/5/11/chartex" xmlns:cx6="http://schemas.microsoft.com/office/drawing/2016/5/12/chartex" xmlns:cx7="http://schemas.microsoft.com/office/drawing/2016/5/13/chartex" xmlns:cx8="http://schemas.microsoft.com/office/drawing/2016/5/14/chartex" xmlns:mc="http://schemas.openxmlformats.org/markup-compatibility/2006" xmlns:aink="http://schemas.microsoft.com/office/drawing/2016/ink" xmlns:am3d="http://schemas.microsoft.com/office/drawing/2017/model3d" xmlns:o="urn:schemas-microsoft-com:office:office" xmlns:oel="http://schemas.microsoft.com/office/2019/extlst" xmlns:r="http://schemas.openxmlformats.org/officeDocument/2006/relationships" xmlns:m="http://schemas.openxmlformats.org/officeDocument/2006/math" xmlns:v="urn:schemas-microsoft-com:vml" xmlns:wp14="http://schemas.microsoft.com/office/word/2010/wordprocessingDrawing" xmlns:wp="http://schemas.openxmlformats.org/drawingml/2006/wordprocessingDrawing" xmlns:w10="urn:schemas-microsoft-com:office:word" xmlns:w="http://schemas.openxmlformats.org/wordprocessingml/2006/main" xmlns:w14="http://schemas.microsoft.com/office/word/2010/wordml" xmlns:w15="http://schemas.microsoft.com/office/word/2012/wordml" xmlns:w16cex="http://schemas.microsoft.com/office/word/2018/wordml/cex" xmlns:w16cid="http://schemas.microsoft.com/office/word/2016/wordml/cid" xmlns:w16="http://schemas.microsoft.com/office/word/2018/wordml" xmlns:w16du="http://schemas.microsoft.com/office/word/2023/wordml/word16du" xmlns:w16sdtdh="http://schemas.microsoft.com/office/word/2020/wordml/sdtdatahash" xmlns:w16sdtfl="http://schemas.microsoft.com/office/word/2024/wordml/sdtformatlock" xmlns:w16se="http://schemas.microsoft.com/office/word/2015/wordml/symex" xmlns:wpg="http://schemas.microsoft.com/office/word/2010/wordprocessingGroup" xmlns:wpi="http://schemas.microsoft.com/office/word/2010/wordprocessingInk" xmlns:wne="http://schemas.microsoft.com/office/word/2006/wordml" xmlns:wps="http://schemas.microsoft.com/office/word/2010/wordprocessingShape" mc:Ignorable="w14 w15 w16se w16cid w16 w16cex w16sdtdh w16sdtfl w16du wp14">
+<w:hdr xmlns:wpc="http://schemas.microsoft.com/office/word/2010/wordprocessingCanvas" xmlns:cx="http://schemas.microsoft.com/office/drawing/2014/chartex" xmlns:cx1="http://schemas.microsoft.com/office/drawing/2015/9/8/chartex" xmlns:cx2="http://schemas.microsoft.com/office/drawing/2015/10/21/chartex" xmlns:cx3="http://schemas.microsoft.com/office/drawing/2016/5/9/chartex" xmlns:cx4="http://schemas.microsoft.com/office/drawing/2016/5/10/chartex" xmlns:cx5="http://schemas.microsoft.com/office/drawing/2016/5/11/chartex" xmlns:cx6="http://schemas.microsoft.com/office/drawing/2016/5/12/chartex" xmlns:cx7="http://schemas.microsoft.com/office/drawing/2016/5/13/chartex" xmlns:cx8="http://schemas.microsoft.com/office/drawing/2016/5/14/chartex" xmlns:mc="http://schemas.openxmlformats.org/markup-compatibility/2006" xmlns:aink="http://schemas.microsoft.com/office/drawing/2016/ink" xmlns:am3d="http://schemas.microsoft.com/office/drawing/2017/model3d" xmlns:o="urn:schemas-microsoft-com:office:office" xmlns:r="http://schemas.openxmlformats.org/officeDocument/2006/relationships" xmlns:m="http://schemas.openxmlformats.org/officeDocument/2006/math" xmlns:v="urn:schemas-microsoft-com:vml" xmlns:wp14="http://schemas.microsoft.com/office/word/2010/wordprocessingDrawing" xmlns:wp="http://schemas.openxmlformats.org/drawingml/2006/wordprocessingDrawing" xmlns:w10="urn:schemas-microsoft-com:office:word" xmlns:w="http://schemas.openxmlformats.org/wordprocessingml/2006/main" xmlns:w14="http://schemas.microsoft.com/office/word/2010/wordml" xmlns:w15="http://schemas.microsoft.com/office/word/2012/wordml" xmlns:w16cid="http://schemas.microsoft.com/office/word/2016/wordml/cid" xmlns:w16se="http://schemas.microsoft.com/office/word/2015/wordml/symex" xmlns:wpg="http://schemas.microsoft.com/office/word/2010/wordprocessingGroup" xmlns:wpi="http://schemas.microsoft.com/office/word/2010/wordprocessingInk" xmlns:wne="http://schemas.microsoft.com/office/word/2006/wordml" xmlns:wps="http://schemas.microsoft.com/office/word/2010/wordprocessingShape" mc:Ignorable="w14 w15 w16se w16cid wp14">
   <w:p>
     <w:pPr>
       <w:pStyle w:val="Header"/>
@@ -5144,7 +5348,7 @@
         </mc:Choice>
         <mc:Fallback>
           <w:pict>
-            <v:group w14:anchorId="67D94630" id="Group 179" o:spid="_x0000_s1026" style="position:absolute;margin-left:82.7pt;margin-top:0;width:133.9pt;height:80.65pt;z-index:251659264;mso-top-percent:23;mso-position-horizontal:right;mso-position-horizontal-relative:page;mso-position-vertical-relative:page;mso-top-percent:23;mso-width-relative:margin;mso-height-relative:margin" coordsize="17007,10241" o:gfxdata="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">
+            <v:group w14:anchorId="67D94630" id="Group 179" o:spid="_x0000_s1026" style="position:absolute;margin-left:82.7pt;margin-top:0;width:133.9pt;height:80.65pt;z-index:251659264;mso-top-percent:23;mso-position-horizontal:right;mso-position-horizontal-relative:page;mso-position-vertical-relative:page;mso-top-percent:23;mso-width-relative:margin;mso-height-relative:margin" coordsize="17007,10241" o:gfxdata="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">
               <v:group id="Group 168" o:spid="_x0000_s1027" style="position:absolute;width:17007;height:10241" coordsize="17007,10241" o:gfxdata="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">
                 <v:rect id="Rectangle 169" o:spid="_x0000_s1028" style="position:absolute;width:17007;height:10241;visibility:visible;mso-wrap-style:square;v-text-anchor:middle" o:gfxdata="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" fillcolor="white [3212]" stroked="f" strokeweight="1pt">
                   <v:fill opacity="0"/>
@@ -5218,7 +5422,7 @@
 </file>
 
 <file path=word/numbering.xml><?xml version="1.0" encoding="utf-8"?>
-<w:numbering xmlns:wpc="http://schemas.microsoft.com/office/word/2010/wordprocessingCanvas" xmlns:cx="http://schemas.microsoft.com/office/drawing/2014/chartex" xmlns:cx1="http://schemas.microsoft.com/office/drawing/2015/9/8/chartex" xmlns:cx2="http://schemas.microsoft.com/office/drawing/2015/10/21/chartex" xmlns:cx3="http://schemas.microsoft.com/office/drawing/2016/5/9/chartex" xmlns:cx4="http://schemas.microsoft.com/office/drawing/2016/5/10/chartex" xmlns:cx5="http://schemas.microsoft.com/office/drawing/2016/5/11/chartex" xmlns:cx6="http://schemas.microsoft.com/office/drawing/2016/5/12/chartex" xmlns:cx7="http://schemas.microsoft.com/office/drawing/2016/5/13/chartex" xmlns:cx8="http://schemas.microsoft.com/office/drawing/2016/5/14/chartex" xmlns:mc="http://schemas.openxmlformats.org/markup-compatibility/2006" xmlns:aink="http://schemas.microsoft.com/office/drawing/2016/ink" xmlns:am3d="http://schemas.microsoft.com/office/drawing/2017/model3d" xmlns:o="urn:schemas-microsoft-com:office:office" xmlns:oel="http://schemas.microsoft.com/office/2019/extlst" xmlns:r="http://schemas.openxmlformats.org/officeDocument/2006/relationships" xmlns:m="http://schemas.openxmlformats.org/officeDocument/2006/math" xmlns:v="urn:schemas-microsoft-com:vml" xmlns:wp14="http://schemas.microsoft.com/office/word/2010/wordprocessingDrawing" xmlns:wp="http://schemas.openxmlformats.org/drawingml/2006/wordprocessingDrawing" xmlns:w10="urn:schemas-microsoft-com:office:word" xmlns:w="http://schemas.openxmlformats.org/wordprocessingml/2006/main" xmlns:w14="http://schemas.microsoft.com/office/word/2010/wordml" xmlns:w15="http://schemas.microsoft.com/office/word/2012/wordml" xmlns:w16cex="http://schemas.microsoft.com/office/word/2018/wordml/cex" xmlns:w16cid="http://schemas.microsoft.com/office/word/2016/wordml/cid" xmlns:w16="http://schemas.microsoft.com/office/word/2018/wordml" xmlns:w16du="http://schemas.microsoft.com/office/word/2023/wordml/word16du" xmlns:w16sdtdh="http://schemas.microsoft.com/office/word/2020/wordml/sdtdatahash" xmlns:w16sdtfl="http://schemas.microsoft.com/office/word/2024/wordml/sdtformatlock" xmlns:w16se="http://schemas.microsoft.com/office/word/2015/wordml/symex" xmlns:wpg="http://schemas.microsoft.com/office/word/2010/wordprocessingGroup" xmlns:wpi="http://schemas.microsoft.com/office/word/2010/wordprocessingInk" xmlns:wne="http://schemas.microsoft.com/office/word/2006/wordml" xmlns:wps="http://schemas.microsoft.com/office/word/2010/wordprocessingShape" mc:Ignorable="w14 w15 w16se w16cid w16 w16cex w16sdtdh w16sdtfl w16du wp14">
+<w:numbering xmlns:wpc="http://schemas.microsoft.com/office/word/2010/wordprocessingCanvas" xmlns:cx="http://schemas.microsoft.com/office/drawing/2014/chartex" xmlns:cx1="http://schemas.microsoft.com/office/drawing/2015/9/8/chartex" xmlns:cx2="http://schemas.microsoft.com/office/drawing/2015/10/21/chartex" xmlns:cx3="http://schemas.microsoft.com/office/drawing/2016/5/9/chartex" xmlns:cx4="http://schemas.microsoft.com/office/drawing/2016/5/10/chartex" xmlns:cx5="http://schemas.microsoft.com/office/drawing/2016/5/11/chartex" xmlns:cx6="http://schemas.microsoft.com/office/drawing/2016/5/12/chartex" xmlns:cx7="http://schemas.microsoft.com/office/drawing/2016/5/13/chartex" xmlns:cx8="http://schemas.microsoft.com/office/drawing/2016/5/14/chartex" xmlns:mc="http://schemas.openxmlformats.org/markup-compatibility/2006" xmlns:aink="http://schemas.microsoft.com/office/drawing/2016/ink" xmlns:am3d="http://schemas.microsoft.com/office/drawing/2017/model3d" xmlns:o="urn:schemas-microsoft-com:office:office" xmlns:r="http://schemas.openxmlformats.org/officeDocument/2006/relationships" xmlns:m="http://schemas.openxmlformats.org/officeDocument/2006/math" xmlns:v="urn:schemas-microsoft-com:vml" xmlns:wp14="http://schemas.microsoft.com/office/word/2010/wordprocessingDrawing" xmlns:wp="http://schemas.openxmlformats.org/drawingml/2006/wordprocessingDrawing" xmlns:w10="urn:schemas-microsoft-com:office:word" xmlns:w="http://schemas.openxmlformats.org/wordprocessingml/2006/main" xmlns:w14="http://schemas.microsoft.com/office/word/2010/wordml" xmlns:w15="http://schemas.microsoft.com/office/word/2012/wordml" xmlns:w16cid="http://schemas.microsoft.com/office/word/2016/wordml/cid" xmlns:w16se="http://schemas.microsoft.com/office/word/2015/wordml/symex" xmlns:wpg="http://schemas.microsoft.com/office/word/2010/wordprocessingGroup" xmlns:wpi="http://schemas.microsoft.com/office/word/2010/wordprocessingInk" xmlns:wne="http://schemas.microsoft.com/office/word/2006/wordml" xmlns:wps="http://schemas.microsoft.com/office/word/2010/wordprocessingShape" mc:Ignorable="w14 w15 w16se w16cid wp14">
   <w:abstractNum w:abstractNumId="0" w15:restartNumberingAfterBreak="0">
     <w:nsid w:val="07600B59"/>
     <w:multiLevelType w:val="hybridMultilevel"/>
@@ -5672,6 +5876,119 @@
     </w:lvl>
   </w:abstractNum>
   <w:abstractNum w:abstractNumId="4" w15:restartNumberingAfterBreak="0">
+    <w:nsid w:val="45336D93"/>
+    <w:multiLevelType w:val="hybridMultilevel"/>
+    <w:tmpl w:val="B9660E96"/>
+    <w:lvl w:ilvl="0" w:tplc="1C090001">
+      <w:start w:val="1"/>
+      <w:numFmt w:val="bullet"/>
+      <w:lvlText w:val=""/>
+      <w:lvlJc w:val="left"/>
+      <w:pPr>
+        <w:ind w:left="720" w:hanging="360"/>
+      </w:pPr>
+      <w:rPr>
+        <w:rFonts w:ascii="Symbol" w:hAnsi="Symbol" w:hint="default"/>
+      </w:rPr>
+    </w:lvl>
+    <w:lvl w:ilvl="1" w:tplc="1C090003" w:tentative="1">
+      <w:start w:val="1"/>
+      <w:numFmt w:val="bullet"/>
+      <w:lvlText w:val="o"/>
+      <w:lvlJc w:val="left"/>
+      <w:pPr>
+        <w:ind w:left="1440" w:hanging="360"/>
+      </w:pPr>
+      <w:rPr>
+        <w:rFonts w:ascii="Courier New" w:hAnsi="Courier New" w:cs="Courier New" w:hint="default"/>
+      </w:rPr>
+    </w:lvl>
+    <w:lvl w:ilvl="2" w:tplc="1C090005" w:tentative="1">
+      <w:start w:val="1"/>
+      <w:numFmt w:val="bullet"/>
+      <w:lvlText w:val=""/>
+      <w:lvlJc w:val="left"/>
+      <w:pPr>
+        <w:ind w:left="2160" w:hanging="360"/>
+      </w:pPr>
+      <w:rPr>
+        <w:rFonts w:ascii="Wingdings" w:hAnsi="Wingdings" w:hint="default"/>
+      </w:rPr>
+    </w:lvl>
+    <w:lvl w:ilvl="3" w:tplc="1C090001" w:tentative="1">
+      <w:start w:val="1"/>
+      <w:numFmt w:val="bullet"/>
+      <w:lvlText w:val=""/>
+      <w:lvlJc w:val="left"/>
+      <w:pPr>
+        <w:ind w:left="2880" w:hanging="360"/>
+      </w:pPr>
+      <w:rPr>
+        <w:rFonts w:ascii="Symbol" w:hAnsi="Symbol" w:hint="default"/>
+      </w:rPr>
+    </w:lvl>
+    <w:lvl w:ilvl="4" w:tplc="1C090003" w:tentative="1">
+      <w:start w:val="1"/>
+      <w:numFmt w:val="bullet"/>
+      <w:lvlText w:val="o"/>
+      <w:lvlJc w:val="left"/>
+      <w:pPr>
+        <w:ind w:left="3600" w:hanging="360"/>
+      </w:pPr>
+      <w:rPr>
+        <w:rFonts w:ascii="Courier New" w:hAnsi="Courier New" w:cs="Courier New" w:hint="default"/>
+      </w:rPr>
+    </w:lvl>
+    <w:lvl w:ilvl="5" w:tplc="1C090005" w:tentative="1">
+      <w:start w:val="1"/>
+      <w:numFmt w:val="bullet"/>
+      <w:lvlText w:val=""/>
+      <w:lvlJc w:val="left"/>
+      <w:pPr>
+        <w:ind w:left="4320" w:hanging="360"/>
+      </w:pPr>
+      <w:rPr>
+        <w:rFonts w:ascii="Wingdings" w:hAnsi="Wingdings" w:hint="default"/>
+      </w:rPr>
+    </w:lvl>
+    <w:lvl w:ilvl="6" w:tplc="1C090001" w:tentative="1">
+      <w:start w:val="1"/>
+      <w:numFmt w:val="bullet"/>
+      <w:lvlText w:val=""/>
+      <w:lvlJc w:val="left"/>
+      <w:pPr>
+        <w:ind w:left="5040" w:hanging="360"/>
+      </w:pPr>
+      <w:rPr>
+        <w:rFonts w:ascii="Symbol" w:hAnsi="Symbol" w:hint="default"/>
+      </w:rPr>
+    </w:lvl>
+    <w:lvl w:ilvl="7" w:tplc="1C090003" w:tentative="1">
+      <w:start w:val="1"/>
+      <w:numFmt w:val="bullet"/>
+      <w:lvlText w:val="o"/>
+      <w:lvlJc w:val="left"/>
+      <w:pPr>
+        <w:ind w:left="5760" w:hanging="360"/>
+      </w:pPr>
+      <w:rPr>
+        <w:rFonts w:ascii="Courier New" w:hAnsi="Courier New" w:cs="Courier New" w:hint="default"/>
+      </w:rPr>
+    </w:lvl>
+    <w:lvl w:ilvl="8" w:tplc="1C090005" w:tentative="1">
+      <w:start w:val="1"/>
+      <w:numFmt w:val="bullet"/>
+      <w:lvlText w:val=""/>
+      <w:lvlJc w:val="left"/>
+      <w:pPr>
+        <w:ind w:left="6480" w:hanging="360"/>
+      </w:pPr>
+      <w:rPr>
+        <w:rFonts w:ascii="Wingdings" w:hAnsi="Wingdings" w:hint="default"/>
+      </w:rPr>
+    </w:lvl>
+  </w:abstractNum>
+  <w:abstractNum w:abstractNumId="5" w15:restartNumberingAfterBreak="0">
     <w:nsid w:val="5BD015E4"/>
     <w:multiLevelType w:val="hybridMultilevel"/>
     <w:tmpl w:val="F642E738"/>
@@ -5784,7 +6101,7 @@
       </w:rPr>
     </w:lvl>
   </w:abstractNum>
-  <w:abstractNum w:abstractNumId="5" w15:restartNumberingAfterBreak="0">
+  <w:abstractNum w:abstractNumId="6" w15:restartNumberingAfterBreak="0">
     <w:nsid w:val="5C7F3F22"/>
     <w:multiLevelType w:val="hybridMultilevel"/>
     <w:tmpl w:val="704ECE46"/>
@@ -5897,7 +6214,209 @@
       </w:rPr>
     </w:lvl>
   </w:abstractNum>
-  <w:abstractNum w:abstractNumId="6" w15:restartNumberingAfterBreak="0">
+  <w:abstractNum w:abstractNumId="7" w15:restartNumberingAfterBreak="0">
+    <w:nsid w:val="5F841E9A"/>
+    <w:multiLevelType w:val="hybridMultilevel"/>
+    <w:tmpl w:val="53AC5B84"/>
+    <w:lvl w:ilvl="0" w:tplc="1C090001">
+      <w:start w:val="1"/>
+      <w:numFmt w:val="bullet"/>
+      <w:lvlText w:val=""/>
+      <w:lvlJc w:val="left"/>
+      <w:pPr>
+        <w:ind w:left="720" w:hanging="360"/>
+      </w:pPr>
+      <w:rPr>
+        <w:rFonts w:ascii="Symbol" w:hAnsi="Symbol" w:hint="default"/>
+      </w:rPr>
+    </w:lvl>
+    <w:lvl w:ilvl="1" w:tplc="1C090003" w:tentative="1">
+      <w:start w:val="1"/>
+      <w:numFmt w:val="bullet"/>
+      <w:lvlText w:val="o"/>
+      <w:lvlJc w:val="left"/>
+      <w:pPr>
+        <w:ind w:left="1440" w:hanging="360"/>
+      </w:pPr>
+      <w:rPr>
+        <w:rFonts w:ascii="Courier New" w:hAnsi="Courier New" w:cs="Courier New" w:hint="default"/>
+      </w:rPr>
+    </w:lvl>
+    <w:lvl w:ilvl="2" w:tplc="1C090005" w:tentative="1">
+      <w:start w:val="1"/>
+      <w:numFmt w:val="bullet"/>
+      <w:lvlText w:val=""/>
+      <w:lvlJc w:val="left"/>
+      <w:pPr>
+        <w:ind w:left="2160" w:hanging="360"/>
+      </w:pPr>
+      <w:rPr>
+        <w:rFonts w:ascii="Wingdings" w:hAnsi="Wingdings" w:hint="default"/>
+      </w:rPr>
+    </w:lvl>
+    <w:lvl w:ilvl="3" w:tplc="1C090001" w:tentative="1">
+      <w:start w:val="1"/>
+      <w:numFmt w:val="bullet"/>
+      <w:lvlText w:val=""/>
+      <w:lvlJc w:val="left"/>
+      <w:pPr>
+        <w:ind w:left="2880" w:hanging="360"/>
+      </w:pPr>
+      <w:rPr>
+        <w:rFonts w:ascii="Symbol" w:hAnsi="Symbol" w:hint="default"/>
+      </w:rPr>
+    </w:lvl>
+    <w:lvl w:ilvl="4" w:tplc="1C090003" w:tentative="1">
+      <w:start w:val="1"/>
+      <w:numFmt w:val="bullet"/>
+      <w:lvlText w:val="o"/>
+      <w:lvlJc w:val="left"/>
+      <w:pPr>
+        <w:ind w:left="3600" w:hanging="360"/>
+      </w:pPr>
+      <w:rPr>
+        <w:rFonts w:ascii="Courier New" w:hAnsi="Courier New" w:cs="Courier New" w:hint="default"/>
+      </w:rPr>
+    </w:lvl>
+    <w:lvl w:ilvl="5" w:tplc="1C090005" w:tentative="1">
+      <w:start w:val="1"/>
+      <w:numFmt w:val="bullet"/>
+      <w:lvlText w:val=""/>
+      <w:lvlJc w:val="left"/>
+      <w:pPr>
+        <w:ind w:left="4320" w:hanging="360"/>
+      </w:pPr>
+      <w:rPr>
+        <w:rFonts w:ascii="Wingdings" w:hAnsi="Wingdings" w:hint="default"/>
+      </w:rPr>
+    </w:lvl>
+    <w:lvl w:ilvl="6" w:tplc="1C090001" w:tentative="1">
+      <w:start w:val="1"/>
+      <w:numFmt w:val="bullet"/>
+      <w:lvlText w:val=""/>
+      <w:lvlJc w:val="left"/>
+      <w:pPr>
+        <w:ind w:left="5040" w:hanging="360"/>
+      </w:pPr>
+      <w:rPr>
+        <w:rFonts w:ascii="Symbol" w:hAnsi="Symbol" w:hint="default"/>
+      </w:rPr>
+    </w:lvl>
+    <w:lvl w:ilvl="7" w:tplc="1C090003" w:tentative="1">
+      <w:start w:val="1"/>
+      <w:numFmt w:val="bullet"/>
+      <w:lvlText w:val="o"/>
+      <w:lvlJc w:val="left"/>
+      <w:pPr>
+        <w:ind w:left="5760" w:hanging="360"/>
+      </w:pPr>
+      <w:rPr>
+        <w:rFonts w:ascii="Courier New" w:hAnsi="Courier New" w:cs="Courier New" w:hint="default"/>
+      </w:rPr>
+    </w:lvl>
+    <w:lvl w:ilvl="8" w:tplc="1C090005" w:tentative="1">
+      <w:start w:val="1"/>
+      <w:numFmt w:val="bullet"/>
+      <w:lvlText w:val=""/>
+      <w:lvlJc w:val="left"/>
+      <w:pPr>
+        <w:ind w:left="6480" w:hanging="360"/>
+      </w:pPr>
+      <w:rPr>
+        <w:rFonts w:ascii="Wingdings" w:hAnsi="Wingdings" w:hint="default"/>
+      </w:rPr>
+    </w:lvl>
+  </w:abstractNum>
+  <w:abstractNum w:abstractNumId="8" w15:restartNumberingAfterBreak="0">
+    <w:nsid w:val="6B823456"/>
+    <w:multiLevelType w:val="hybridMultilevel"/>
+    <w:tmpl w:val="81D8D93A"/>
+    <w:lvl w:ilvl="0" w:tplc="1C09000F">
+      <w:start w:val="1"/>
+      <w:numFmt w:val="decimal"/>
+      <w:lvlText w:val="%1."/>
+      <w:lvlJc w:val="left"/>
+      <w:pPr>
+        <w:ind w:left="720" w:hanging="360"/>
+      </w:pPr>
+      <w:rPr>
+        <w:rFonts w:hint="default"/>
+      </w:rPr>
+    </w:lvl>
+    <w:lvl w:ilvl="1" w:tplc="1C090019" w:tentative="1">
+      <w:start w:val="1"/>
+      <w:numFmt w:val="lowerLetter"/>
+      <w:lvlText w:val="%2."/>
+      <w:lvlJc w:val="left"/>
+      <w:pPr>
+        <w:ind w:left="1440" w:hanging="360"/>
+      </w:pPr>
+    </w:lvl>
+    <w:lvl w:ilvl="2" w:tplc="1C09001B" w:tentative="1">
+      <w:start w:val="1"/>
+      <w:numFmt w:val="lowerRoman"/>
+      <w:lvlText w:val="%3."/>
+      <w:lvlJc w:val="right"/>
+      <w:pPr>
+        <w:ind w:left="2160" w:hanging="180"/>
+      </w:pPr>
+    </w:lvl>
+    <w:lvl w:ilvl="3" w:tplc="1C09000F" w:tentative="1">
+      <w:start w:val="1"/>
+      <w:numFmt w:val="decimal"/>
+      <w:lvlText w:val="%4."/>
+      <w:lvlJc w:val="left"/>
+      <w:pPr>
+        <w:ind w:left="2880" w:hanging="360"/>
+      </w:pPr>
+    </w:lvl>
+    <w:lvl w:ilvl="4" w:tplc="1C090019" w:tentative="1">
+      <w:start w:val="1"/>
+      <w:numFmt w:val="lowerLetter"/>
+      <w:lvlText w:val="%5."/>
+      <w:lvlJc w:val="left"/>
+      <w:pPr>
+        <w:ind w:left="3600" w:hanging="360"/>
+      </w:pPr>
+    </w:lvl>
+    <w:lvl w:ilvl="5" w:tplc="1C09001B" w:tentative="1">
+      <w:start w:val="1"/>
+      <w:numFmt w:val="lowerRoman"/>
+      <w:lvlText w:val="%6."/>
+      <w:lvlJc w:val="right"/>
+      <w:pPr>
+        <w:ind w:left="4320" w:hanging="180"/>
+      </w:pPr>
+    </w:lvl>
+    <w:lvl w:ilvl="6" w:tplc="1C09000F" w:tentative="1">
+      <w:start w:val="1"/>
+      <w:numFmt w:val="decimal"/>
+      <w:lvlText w:val="%7."/>
+      <w:lvlJc w:val="left"/>
+      <w:pPr>
+        <w:ind w:left="5040" w:hanging="360"/>
+      </w:pPr>
+    </w:lvl>
+    <w:lvl w:ilvl="7" w:tplc="1C090019" w:tentative="1">
+      <w:start w:val="1"/>
+      <w:numFmt w:val="lowerLetter"/>
+      <w:lvlText w:val="%8."/>
+      <w:lvlJc w:val="left"/>
+      <w:pPr>
+        <w:ind w:left="5760" w:hanging="360"/>
+      </w:pPr>
+    </w:lvl>
+    <w:lvl w:ilvl="8" w:tplc="1C09001B" w:tentative="1">
+      <w:start w:val="1"/>
+      <w:numFmt w:val="lowerRoman"/>
+      <w:lvlText w:val="%9."/>
+      <w:lvlJc w:val="right"/>
+      <w:pPr>
+        <w:ind w:left="6480" w:hanging="180"/>
+      </w:pPr>
+    </w:lvl>
+  </w:abstractNum>
+  <w:abstractNum w:abstractNumId="9" w15:restartNumberingAfterBreak="0">
     <w:nsid w:val="6D952E44"/>
     <w:multiLevelType w:val="hybridMultilevel"/>
     <w:tmpl w:val="3D4AB7E0"/>
@@ -6010,32 +6529,41 @@
       </w:rPr>
     </w:lvl>
   </w:abstractNum>
-  <w:num w:numId="1" w16cid:durableId="215624933">
+  <w:num w:numId="1">
     <w:abstractNumId w:val="3"/>
   </w:num>
-  <w:num w:numId="2" w16cid:durableId="193465676">
+  <w:num w:numId="2">
     <w:abstractNumId w:val="1"/>
   </w:num>
-  <w:num w:numId="3" w16cid:durableId="2079210537">
+  <w:num w:numId="3">
+    <w:abstractNumId w:val="6"/>
+  </w:num>
+  <w:num w:numId="4">
     <w:abstractNumId w:val="5"/>
   </w:num>
-  <w:num w:numId="4" w16cid:durableId="1766417343">
+  <w:num w:numId="5">
+    <w:abstractNumId w:val="0"/>
+  </w:num>
+  <w:num w:numId="6">
+    <w:abstractNumId w:val="2"/>
+  </w:num>
+  <w:num w:numId="7">
+    <w:abstractNumId w:val="9"/>
+  </w:num>
+  <w:num w:numId="8">
     <w:abstractNumId w:val="4"/>
   </w:num>
-  <w:num w:numId="5" w16cid:durableId="2021081999">
-    <w:abstractNumId w:val="0"/>
+  <w:num w:numId="9">
+    <w:abstractNumId w:val="7"/>
   </w:num>
-  <w:num w:numId="6" w16cid:durableId="323902158">
-    <w:abstractNumId w:val="2"/>
-  </w:num>
-  <w:num w:numId="7" w16cid:durableId="25255447">
-    <w:abstractNumId w:val="6"/>
+  <w:num w:numId="10">
+    <w:abstractNumId w:val="8"/>
   </w:num>
 </w:numbering>
 </file>
 
 <file path=word/styles.xml><?xml version="1.0" encoding="utf-8"?>
-<w:styles xmlns:mc="http://schemas.openxmlformats.org/markup-compatibility/2006" xmlns:r="http://schemas.openxmlformats.org/officeDocument/2006/relationships" xmlns:w="http://schemas.openxmlformats.org/wordprocessingml/2006/main" xmlns:w14="http://schemas.microsoft.com/office/word/2010/wordml" xmlns:w15="http://schemas.microsoft.com/office/word/2012/wordml" xmlns:w16cex="http://schemas.microsoft.com/office/word/2018/wordml/cex" xmlns:w16cid="http://schemas.microsoft.com/office/word/2016/wordml/cid" xmlns:w16="http://schemas.microsoft.com/office/word/2018/wordml" xmlns:w16du="http://schemas.microsoft.com/office/word/2023/wordml/word16du" xmlns:w16sdtdh="http://schemas.microsoft.com/office/word/2020/wordml/sdtdatahash" xmlns:w16sdtfl="http://schemas.microsoft.com/office/word/2024/wordml/sdtformatlock" xmlns:w16se="http://schemas.microsoft.com/office/word/2015/wordml/symex" mc:Ignorable="w14 w15 w16se w16cid w16 w16cex w16sdtdh w16sdtfl w16du">
+<w:styles xmlns:mc="http://schemas.openxmlformats.org/markup-compatibility/2006" xmlns:r="http://schemas.openxmlformats.org/officeDocument/2006/relationships" xmlns:w="http://schemas.openxmlformats.org/wordprocessingml/2006/main" xmlns:w14="http://schemas.microsoft.com/office/word/2010/wordml" xmlns:w15="http://schemas.microsoft.com/office/word/2012/wordml" xmlns:w16cid="http://schemas.microsoft.com/office/word/2016/wordml/cid" xmlns:w16se="http://schemas.microsoft.com/office/word/2015/wordml/symex" mc:Ignorable="w14 w15 w16se w16cid">
   <w:docDefaults>
     <w:rPrDefault>
       <w:rPr>
@@ -6047,7 +6575,7 @@
     </w:rPrDefault>
     <w:pPrDefault/>
   </w:docDefaults>
-  <w:latentStyles w:defLockedState="0" w:defUIPriority="99" w:defSemiHidden="0" w:defUnhideWhenUsed="0" w:defQFormat="0" w:count="376">
+  <w:latentStyles w:defLockedState="0" w:defUIPriority="99" w:defSemiHidden="0" w:defUnhideWhenUsed="0" w:defQFormat="0" w:count="375">
     <w:lsdException w:name="Normal" w:uiPriority="0" w:qFormat="1"/>
     <w:lsdException w:name="heading 1" w:uiPriority="9" w:qFormat="1"/>
     <w:lsdException w:name="heading 2" w:semiHidden="1" w:uiPriority="9" w:unhideWhenUsed="1" w:qFormat="1"/>
@@ -6423,7 +6951,6 @@
     <w:lsdException w:name="Smart Hyperlink" w:semiHidden="1" w:unhideWhenUsed="1"/>
     <w:lsdException w:name="Hashtag" w:semiHidden="1" w:unhideWhenUsed="1"/>
     <w:lsdException w:name="Unresolved Mention" w:semiHidden="1" w:unhideWhenUsed="1"/>
-    <w:lsdException w:name="Smart Link" w:semiHidden="1" w:unhideWhenUsed="1"/>
   </w:latentStyles>
   <w:style w:type="paragraph" w:default="1" w:styleId="Normal">
     <w:name w:val="Normal"/>
@@ -6991,7 +7518,7 @@
 </file>
 
 <file path=customXml/itemProps1.xml><?xml version="1.0" encoding="utf-8"?>
-<ds:datastoreItem xmlns:ds="http://schemas.openxmlformats.org/officeDocument/2006/customXml" ds:itemID="{4B368388-377F-4180-96F3-A4E8EE300DCE}">
+<ds:datastoreItem xmlns:ds="http://schemas.openxmlformats.org/officeDocument/2006/customXml" ds:itemID="{4B35E199-1B37-44E5-8F75-D1B61525C2D5}">
   <ds:schemaRefs>
     <ds:schemaRef ds:uri="http://schemas.openxmlformats.org/officeDocument/2006/bibliography"/>
   </ds:schemaRefs>

</xml_diff>

<commit_message>
Working on UML + ERD
</commit_message>
<xml_diff>
--- a/Documentation/The Ripple Effect - SYSTEM REQUIREMENTS.docx
+++ b/Documentation/The Ripple Effect - SYSTEM REQUIREMENTS.docx
@@ -6056,6 +6056,7 @@
       <w:r>
         <w:rPr>
           <w:b/>
+          <w:noProof/>
           <w:sz w:val="28"/>
           <w:szCs w:val="28"/>
           <w:lang w:val="en-US"/>
@@ -6129,7 +6130,19 @@
         <w:rPr>
           <w:lang w:val="en-US"/>
         </w:rPr>
-        <w:t xml:space="preserve">As the weakest relationship, association is the bonding of two classes without direct ownership.  Figure 1.2 demonstrates the </w:t>
+        <w:t xml:space="preserve">As the weakest relationship, association is the bonding of two classes without direct ownership.  Figure 1.2 </w:t>
+      </w:r>
+      <w:r>
+        <w:rPr>
+          <w:lang w:val="en-US"/>
+        </w:rPr>
+        <w:t>shows</w:t>
+      </w:r>
+      <w:r>
+        <w:rPr>
+          <w:lang w:val="en-US"/>
+        </w:rPr>
+        <w:t xml:space="preserve"> the </w:t>
       </w:r>
       <w:r>
         <w:rPr>
@@ -6155,25 +6168,25 @@
         <w:rPr>
           <w:lang w:val="en-US"/>
         </w:rPr>
-        <w:t xml:space="preserve">connection where a pool has, or </w:t>
-      </w:r>
-      <w:r>
-        <w:rPr>
-          <w:lang w:val="en-US"/>
-        </w:rPr>
-        <w:t>more specifically</w:t>
-      </w:r>
-      <w:r>
-        <w:rPr>
-          <w:lang w:val="en-US"/>
-        </w:rPr>
-        <w:t>: is associated with, a load shedding schedule but is not entirely dependent on it to operate.</w:t>
-      </w:r>
-      <w:r>
-        <w:rPr>
-          <w:lang w:val="en-US"/>
-        </w:rPr>
-        <w:t xml:space="preserve"> We have used the keyword “uses” to differentiate this from the association relationship.</w:t>
+        <w:t>connection where a pool has, or more specifically: is associated with, a load shedding schedule but is not entirely dependent on it to operate.</w:t>
+      </w:r>
+      <w:r>
+        <w:rPr>
+          <w:lang w:val="en-US"/>
+        </w:rPr>
+        <w:t xml:space="preserve"> We have used the keyword “uses” to differentiate this from the </w:t>
+      </w:r>
+      <w:r>
+        <w:rPr>
+          <w:lang w:val="en-US"/>
+        </w:rPr>
+        <w:t xml:space="preserve">aggregation </w:t>
+      </w:r>
+      <w:r>
+        <w:rPr>
+          <w:lang w:val="en-US"/>
+        </w:rPr>
+        <w:t>relationship.</w:t>
       </w:r>
     </w:p>
     <w:p>
@@ -6394,6 +6407,7 @@
       <w:r>
         <w:rPr>
           <w:b/>
+          <w:noProof/>
           <w:sz w:val="28"/>
           <w:szCs w:val="28"/>
           <w:lang w:val="en-US"/>
@@ -6627,6 +6641,7 @@
       <w:r>
         <w:rPr>
           <w:b/>
+          <w:noProof/>
           <w:sz w:val="28"/>
           <w:szCs w:val="28"/>
           <w:lang w:val="en-US"/>
@@ -6924,6 +6939,7 @@
       </w:r>
       <w:r>
         <w:rPr>
+          <w:noProof/>
           <w:lang w:val="en-US"/>
         </w:rPr>
         <w:drawing>
@@ -7004,64 +7020,286 @@
         </w:rPr>
         <w:t xml:space="preserve">pool owner specific methods such as registering and managing pools. This object orientated principle allows for modular code that does not duplicate common properties and methods amongst the three user types: pool owners, service providers and the admin while also offering the ability to extend these subclasses for class-specific functionality. Our UML class diagram for </w:t>
       </w:r>
+      <w:r>
+        <w:rPr>
+          <w:i/>
+          <w:lang w:val="en-US"/>
+        </w:rPr>
+        <w:t xml:space="preserve">SplashScreen </w:t>
+      </w:r>
+      <w:r>
+        <w:rPr>
+          <w:lang w:val="en-US"/>
+        </w:rPr>
+        <w:t>demonstrates a</w:t>
+      </w:r>
+      <w:r>
+        <w:rPr>
+          <w:lang w:val="en-US"/>
+        </w:rPr>
+        <w:t>n</w:t>
+      </w:r>
+      <w:r>
+        <w:rPr>
+          <w:lang w:val="en-US"/>
+        </w:rPr>
+        <w:t xml:space="preserve"> </w:t>
+      </w:r>
       <w:proofErr w:type="spellStart"/>
       <w:r>
         <w:rPr>
-          <w:lang w:val="en-US"/>
-        </w:rPr>
-        <w:t>SplashScreen</w:t>
+          <w:b/>
+          <w:lang w:val="en-US"/>
+        </w:rPr>
+        <w:t>is</w:t>
       </w:r>
       <w:proofErr w:type="spellEnd"/>
       <w:r>
         <w:rPr>
-          <w:lang w:val="en-US"/>
-        </w:rPr>
-        <w:t xml:space="preserve"> demonstrates a </w:t>
+          <w:b/>
+          <w:lang w:val="en-US"/>
+        </w:rPr>
+        <w:t>-</w:t>
+      </w:r>
+      <w:r>
+        <w:rPr>
+          <w:b/>
+          <w:lang w:val="en-US"/>
+        </w:rPr>
+        <w:t>a</w:t>
+      </w:r>
+      <w:r>
+        <w:rPr>
+          <w:lang w:val="en-US"/>
+        </w:rPr>
+        <w:t xml:space="preserve"> relationship</w:t>
+      </w:r>
+      <w:r>
+        <w:rPr>
+          <w:lang w:val="en-US"/>
+        </w:rPr>
+        <w:t xml:space="preserve"> between a pool owner and the user class.</w:t>
+      </w:r>
+    </w:p>
+    <w:p>
+      <w:pPr>
+        <w:rPr>
+          <w:lang w:val="en-US"/>
+        </w:rPr>
+      </w:pPr>
+    </w:p>
+    <w:p>
+      <w:pPr>
+        <w:rPr>
+          <w:lang w:val="en-US"/>
+        </w:rPr>
+      </w:pPr>
+    </w:p>
+    <w:p>
+      <w:pPr>
+        <w:rPr>
+          <w:b/>
+          <w:sz w:val="28"/>
+          <w:szCs w:val="28"/>
+          <w:lang w:val="en-US"/>
+        </w:rPr>
+      </w:pPr>
+      <w:r>
+        <w:rPr>
+          <w:b/>
+          <w:sz w:val="28"/>
+          <w:szCs w:val="28"/>
+          <w:lang w:val="en-US"/>
+        </w:rPr>
+        <w:t>Multiplicity</w:t>
+      </w:r>
+    </w:p>
+    <w:p>
+      <w:pPr>
+        <w:rPr>
+          <w:rFonts w:cstheme="minorHAnsi"/>
+          <w:lang w:val="en-US"/>
+        </w:rPr>
+      </w:pPr>
+    </w:p>
+    <w:p>
+      <w:pPr>
+        <w:rPr>
+          <w:rFonts w:cstheme="minorHAnsi"/>
+          <w:lang w:val="en-US"/>
+        </w:rPr>
+      </w:pPr>
+      <w:r>
+        <w:rPr>
+          <w:rFonts w:cstheme="minorHAnsi"/>
+          <w:lang w:val="en-US"/>
+        </w:rPr>
+        <w:t xml:space="preserve">Multiplicity is the number of instances of a specific class that can be related </w:t>
+      </w:r>
+      <w:r>
+        <w:rPr>
+          <w:rFonts w:cstheme="minorHAnsi"/>
+          <w:lang w:val="en-US"/>
+        </w:rPr>
+        <w:t xml:space="preserve">to an instance of a different class, also known as cardinality. This quantitative relationship can be in the form of one-one, one-to-many and man-to-many, usually represented as </w:t>
+      </w:r>
+      <w:proofErr w:type="gramStart"/>
+      <w:r>
+        <w:rPr>
+          <w:rFonts w:cstheme="minorHAnsi"/>
+          <w:lang w:val="en-US"/>
+        </w:rPr>
+        <w:t>1..</w:t>
+      </w:r>
+      <w:proofErr w:type="gramEnd"/>
+      <w:r>
+        <w:rPr>
+          <w:rFonts w:cstheme="minorHAnsi"/>
+          <w:lang w:val="en-US"/>
+        </w:rPr>
+        <w:t>1, 0..*, *..* in a UML</w:t>
+      </w:r>
+      <w:r>
+        <w:rPr>
+          <w:rFonts w:cstheme="minorHAnsi"/>
+          <w:lang w:val="en-US"/>
+        </w:rPr>
+        <w:t>.</w:t>
+      </w:r>
+    </w:p>
+    <w:p>
+      <w:pPr>
+        <w:rPr>
+          <w:rFonts w:cstheme="minorHAnsi"/>
+          <w:lang w:val="en-US"/>
+        </w:rPr>
+      </w:pPr>
+    </w:p>
+    <w:p>
+      <w:pPr>
+        <w:rPr>
+          <w:rFonts w:cstheme="minorHAnsi"/>
+          <w:sz w:val="28"/>
+          <w:szCs w:val="28"/>
+          <w:lang w:val="en-US"/>
+        </w:rPr>
+      </w:pPr>
+      <w:r>
+        <w:rPr>
+          <w:b/>
+          <w:sz w:val="28"/>
+          <w:szCs w:val="28"/>
+          <w:lang w:val="en-US"/>
+        </w:rPr>
+        <w:t>Unused logic connections</w:t>
+      </w:r>
+    </w:p>
+    <w:p>
+      <w:pPr>
+        <w:rPr>
+          <w:b/>
+          <w:lang w:val="en-US"/>
+        </w:rPr>
+      </w:pPr>
+    </w:p>
+    <w:p>
+      <w:pPr>
+        <w:rPr>
+          <w:lang w:val="en-US"/>
+        </w:rPr>
+      </w:pPr>
+      <w:r>
+        <w:rPr>
+          <w:b/>
+          <w:lang w:val="en-US"/>
+        </w:rPr>
+        <w:t>Reflexive Association</w:t>
+      </w:r>
+      <w:r>
+        <w:rPr>
+          <w:b/>
+          <w:lang w:val="en-US"/>
+        </w:rPr>
+        <w:t xml:space="preserve"> </w:t>
+      </w:r>
+      <w:r>
+        <w:rPr>
+          <w:lang w:val="en-US"/>
+        </w:rPr>
+        <w:t>occurs when a class has a relationship with itself, a user may be a referrer for another user</w:t>
+      </w:r>
+      <w:r>
+        <w:rPr>
+          <w:lang w:val="en-US"/>
+        </w:rPr>
+        <w:t>. This connection is not present in our current UML class diagram as it would be redundant</w:t>
+      </w:r>
+    </w:p>
+    <w:p>
+      <w:pPr>
+        <w:rPr>
+          <w:b/>
+          <w:lang w:val="en-US"/>
+        </w:rPr>
+      </w:pPr>
+    </w:p>
+    <w:p>
+      <w:pPr>
+        <w:rPr>
+          <w:lang w:val="en-US"/>
+        </w:rPr>
+      </w:pPr>
+      <w:r>
+        <w:rPr>
+          <w:b/>
+          <w:lang w:val="en-US"/>
+        </w:rPr>
+        <w:t>Realization</w:t>
+      </w:r>
+      <w:r>
+        <w:rPr>
+          <w:b/>
+          <w:lang w:val="en-US"/>
+        </w:rPr>
+        <w:t xml:space="preserve"> </w:t>
+      </w:r>
+      <w:r>
+        <w:rPr>
+          <w:lang w:val="en-US"/>
+        </w:rPr>
+        <w:t xml:space="preserve">is the concept of a class implementing an interface. While we could create an </w:t>
       </w:r>
       <w:proofErr w:type="spellStart"/>
       <w:r>
         <w:rPr>
-          <w:b/>
-          <w:lang w:val="en-US"/>
-        </w:rPr>
-        <w:t>is</w:t>
+          <w:lang w:val="en-US"/>
+        </w:rPr>
+        <w:t>ISchedulable</w:t>
       </w:r>
       <w:proofErr w:type="spellEnd"/>
       <w:r>
         <w:rPr>
-          <w:b/>
-          <w:lang w:val="en-US"/>
-        </w:rPr>
-        <w:t>-a</w:t>
-      </w:r>
-      <w:r>
-        <w:rPr>
-          <w:lang w:val="en-US"/>
-        </w:rPr>
-        <w:t xml:space="preserve">  relationship between a pool owner and the user class.</w:t>
-      </w:r>
-      <w:bookmarkStart w:id="17" w:name="_GoBack"/>
-      <w:bookmarkEnd w:id="17"/>
-    </w:p>
-    <w:p>
-      <w:pPr>
-        <w:rPr>
-          <w:lang w:val="en-US"/>
-        </w:rPr>
-      </w:pPr>
-    </w:p>
-    <w:p>
-      <w:pPr>
-        <w:rPr>
-          <w:lang w:val="en-US"/>
-        </w:rPr>
-      </w:pPr>
-      <w:r>
-        <w:rPr>
-          <w:lang w:val="en-US"/>
-        </w:rPr>
-        <w:t>These relationships are interlinked, offering multiplicity such as one-to-one, one-to-many types which are discussed in section 1.8.</w:t>
-      </w:r>
+          <w:lang w:val="en-US"/>
+        </w:rPr>
+        <w:t xml:space="preserve"> interface that is implemented by both the Booking and the Service class to abstract the scheduling functionality but since these are concrete classes, there is no need to add this redundant behavior.</w:t>
+      </w:r>
+    </w:p>
+    <w:p>
+      <w:pPr>
+        <w:rPr>
+          <w:sz w:val="28"/>
+          <w:szCs w:val="28"/>
+          <w:lang w:val="en-US"/>
+        </w:rPr>
+      </w:pPr>
+    </w:p>
+    <w:p>
+      <w:pPr>
+        <w:rPr>
+          <w:rFonts w:cstheme="minorHAnsi"/>
+          <w:lang w:val="en-US"/>
+        </w:rPr>
+      </w:pPr>
     </w:p>
     <w:p>
       <w:pPr>
@@ -7073,7 +7311,7 @@
           <w:lang w:val="en-US"/>
         </w:rPr>
       </w:pPr>
-      <w:bookmarkStart w:id="18" w:name="_Toc207787831"/>
+      <w:bookmarkStart w:id="17" w:name="_Toc207787831"/>
       <w:r>
         <w:rPr>
           <w:sz w:val="36"/>
@@ -7081,6 +7319,7 @@
           <w:u w:val="single"/>
           <w:lang w:val="en-US"/>
         </w:rPr>
+        <w:lastRenderedPageBreak/>
         <w:t>1.</w:t>
       </w:r>
       <w:r>
@@ -7101,7 +7340,7 @@
         </w:rPr>
         <w:t xml:space="preserve"> Relational Database Model Diagram</w:t>
       </w:r>
-      <w:bookmarkEnd w:id="18"/>
+      <w:bookmarkEnd w:id="17"/>
     </w:p>
     <w:p>
       <w:pPr>
@@ -7298,7 +7537,6 @@
           <w:color w:val="2E74B5" w:themeColor="accent5" w:themeShade="BF"/>
           <w:lang w:val="en-US"/>
         </w:rPr>
-        <w:lastRenderedPageBreak/>
         <w:t>Figure 1.</w:t>
       </w:r>
       <w:r>
@@ -7330,6 +7568,7 @@
         <w:keepNext/>
         <w:jc w:val="center"/>
       </w:pPr>
+      <w:bookmarkStart w:id="18" w:name="_GoBack"/>
       <w:r>
         <w:rPr>
           <w:noProof/>
@@ -7372,6 +7611,7 @@
           </wp:inline>
         </w:drawing>
       </w:r>
+      <w:bookmarkEnd w:id="18"/>
     </w:p>
     <w:p>
       <w:pPr>
@@ -7417,6 +7657,7 @@
           <w:u w:val="single"/>
           <w:lang w:val="en-US"/>
         </w:rPr>
+        <w:lastRenderedPageBreak/>
         <w:t>1.</w:t>
       </w:r>
       <w:r>
@@ -7617,7 +7858,6 @@
           <w:color w:val="2E74B5" w:themeColor="accent5" w:themeShade="BF"/>
           <w:lang w:val="en-US"/>
         </w:rPr>
-        <w:lastRenderedPageBreak/>
         <w:t>Example:</w:t>
       </w:r>
     </w:p>
@@ -11367,6 +11607,27 @@
       <w:szCs w:val="26"/>
     </w:rPr>
   </w:style>
+  <w:style w:type="paragraph" w:styleId="Heading3">
+    <w:name w:val="heading 3"/>
+    <w:basedOn w:val="Normal"/>
+    <w:next w:val="Normal"/>
+    <w:link w:val="Heading3Char"/>
+    <w:uiPriority w:val="9"/>
+    <w:semiHidden/>
+    <w:unhideWhenUsed/>
+    <w:qFormat/>
+    <w:rsid w:val="00E93EF3"/>
+    <w:pPr>
+      <w:keepNext/>
+      <w:keepLines/>
+      <w:spacing w:before="40"/>
+      <w:outlineLvl w:val="2"/>
+    </w:pPr>
+    <w:rPr>
+      <w:rFonts w:asciiTheme="majorHAnsi" w:eastAsiaTheme="majorEastAsia" w:hAnsiTheme="majorHAnsi" w:cstheme="majorBidi"/>
+      <w:color w:val="1F3763" w:themeColor="accent1" w:themeShade="7F"/>
+    </w:rPr>
+  </w:style>
   <w:style w:type="character" w:default="1" w:styleId="DefaultParagraphFont">
     <w:name w:val="Default Paragraph Font"/>
     <w:uiPriority w:val="1"/>
@@ -11582,6 +11843,18 @@
     <w:link w:val="Footer"/>
     <w:uiPriority w:val="99"/>
     <w:rsid w:val="00A046EA"/>
+  </w:style>
+  <w:style w:type="character" w:customStyle="1" w:styleId="Heading3Char">
+    <w:name w:val="Heading 3 Char"/>
+    <w:basedOn w:val="DefaultParagraphFont"/>
+    <w:link w:val="Heading3"/>
+    <w:uiPriority w:val="9"/>
+    <w:semiHidden/>
+    <w:rsid w:val="00E93EF3"/>
+    <w:rPr>
+      <w:rFonts w:asciiTheme="majorHAnsi" w:eastAsiaTheme="majorEastAsia" w:hAnsiTheme="majorHAnsi" w:cstheme="majorBidi"/>
+      <w:color w:val="1F3763" w:themeColor="accent1" w:themeShade="7F"/>
+    </w:rPr>
   </w:style>
 </w:styles>
 </file>
@@ -11886,7 +12159,7 @@
 </file>
 
 <file path=customXml/itemProps1.xml><?xml version="1.0" encoding="utf-8"?>
-<ds:datastoreItem xmlns:ds="http://schemas.openxmlformats.org/officeDocument/2006/customXml" ds:itemID="{E364FF22-C667-4675-8485-63546EA57BC2}">
+<ds:datastoreItem xmlns:ds="http://schemas.openxmlformats.org/officeDocument/2006/customXml" ds:itemID="{8299A069-89EA-4F97-948C-33E7169E6C05}">
   <ds:schemaRefs>
     <ds:schemaRef ds:uri="http://schemas.openxmlformats.org/officeDocument/2006/bibliography"/>
   </ds:schemaRefs>

</xml_diff>

<commit_message>
Updated UML + ERD
Co-Authored-By: Juanette <93321503+JuanetteRViljoen@users.noreply.github.com>
</commit_message>
<xml_diff>
--- a/Documentation/The Ripple Effect - SYSTEM REQUIREMENTS.docx
+++ b/Documentation/The Ripple Effect - SYSTEM REQUIREMENTS.docx
@@ -5968,13 +5968,13 @@
         <mc:AlternateContent>
           <mc:Choice Requires="wps">
             <w:drawing>
-              <wp:anchor distT="0" distB="0" distL="114300" distR="114300" simplePos="0" relativeHeight="251668480" behindDoc="0" locked="0" layoutInCell="1" allowOverlap="1" wp14:anchorId="061879BA" wp14:editId="22D415EC">
+              <wp:anchor distT="0" distB="0" distL="114300" distR="114300" simplePos="0" relativeHeight="251668480" behindDoc="0" locked="0" layoutInCell="1" allowOverlap="1" wp14:anchorId="061879BA" wp14:editId="44DB870F">
                 <wp:simplePos x="0" y="0"/>
                 <wp:positionH relativeFrom="margin">
-                  <wp:align>left</wp:align>
+                  <wp:posOffset>-31750</wp:posOffset>
                 </wp:positionH>
                 <wp:positionV relativeFrom="paragraph">
-                  <wp:posOffset>1815675</wp:posOffset>
+                  <wp:posOffset>1148715</wp:posOffset>
                 </wp:positionV>
                 <wp:extent cx="398297" cy="241222"/>
                 <wp:effectExtent l="0" t="19050" r="40005" b="45085"/>
@@ -6030,7 +6030,7 @@
           </mc:Choice>
           <mc:Fallback>
             <w:pict>
-              <v:shapetype w14:anchorId="133677FF" id="_x0000_t93" coordsize="21600,21600" o:spt="93" adj="16200,5400" path="m@0,l@0@1,3375@1,3375@2@0@2@0,21600,21600,10800xem1350@1l1350@2,2700@2,2700@1xem0@1l0@2,675@2,675@1xe">
+              <v:shapetype w14:anchorId="50E6014B" id="_x0000_t93" coordsize="21600,21600" o:spt="93" adj="16200,5400" path="m@0,l@0@1,3375@1,3375@2@0@2@0,21600,21600,10800xem1350@1l1350@2,2700@2,2700@1xem0@1l0@2,675@2,675@1xe">
                 <v:stroke joinstyle="miter"/>
                 <v:formulas>
                   <v:f eqn="val #0"/>
@@ -6046,7 +6046,7 @@
                   <v:h position="#0,#1" xrange="3375,21600" yrange="0,10800"/>
                 </v:handles>
               </v:shapetype>
-              <v:shape id="Arrow: Striped Right 17" o:spid="_x0000_s1026" type="#_x0000_t93" style="position:absolute;margin-left:0;margin-top:142.95pt;width:31.35pt;height:19pt;z-index:251668480;visibility:visible;mso-wrap-style:square;mso-wrap-distance-left:9pt;mso-wrap-distance-top:0;mso-wrap-distance-right:9pt;mso-wrap-distance-bottom:0;mso-position-horizontal:left;mso-position-horizontal-relative:margin;mso-position-vertical:absolute;mso-position-vertical-relative:text;v-text-anchor:middle" o:gfxdata="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" adj="15059" filled="f" strokecolor="#00b0f0" strokeweight="1pt">
+              <v:shape id="Arrow: Striped Right 17" o:spid="_x0000_s1026" type="#_x0000_t93" style="position:absolute;margin-left:-2.5pt;margin-top:90.45pt;width:31.35pt;height:19pt;z-index:251668480;visibility:visible;mso-wrap-style:square;mso-wrap-distance-left:9pt;mso-wrap-distance-top:0;mso-wrap-distance-right:9pt;mso-wrap-distance-bottom:0;mso-position-horizontal:absolute;mso-position-horizontal-relative:margin;mso-position-vertical:absolute;mso-position-vertical-relative:text;v-text-anchor:middle" o:gfxdata="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" adj="15059" filled="f" strokecolor="#00b0f0" strokeweight="1pt">
                 <w10:wrap anchorx="margin"/>
               </v:shape>
             </w:pict>
@@ -6056,15 +6056,14 @@
       <w:r>
         <w:rPr>
           <w:b/>
-          <w:noProof/>
           <w:sz w:val="28"/>
           <w:szCs w:val="28"/>
           <w:lang w:val="en-US"/>
         </w:rPr>
         <w:drawing>
-          <wp:inline distT="0" distB="0" distL="0" distR="0" wp14:anchorId="17ACB5B9" wp14:editId="57C434E0">
-            <wp:extent cx="1533739" cy="3915321"/>
-            <wp:effectExtent l="0" t="0" r="9525" b="9525"/>
+          <wp:inline distT="0" distB="0" distL="0" distR="0" wp14:anchorId="4BF4CDA2" wp14:editId="779C80DC">
+            <wp:extent cx="1001397" cy="2622550"/>
+            <wp:effectExtent l="0" t="0" r="8255" b="6350"/>
             <wp:docPr id="1" name="Picture 1"/>
             <wp:cNvGraphicFramePr>
               <a:graphicFrameLocks xmlns:a="http://schemas.openxmlformats.org/drawingml/2006/main" noChangeAspect="1"/>
@@ -6085,7 +6084,7 @@
                   <pic:spPr>
                     <a:xfrm>
                       <a:off x="0" y="0"/>
-                      <a:ext cx="1533739" cy="3915321"/>
+                      <a:ext cx="1030880" cy="2699763"/>
                     </a:xfrm>
                     <a:prstGeom prst="rect">
                       <a:avLst/>
@@ -6298,13 +6297,64 @@
           <w:lang w:val="en-US"/>
         </w:rPr>
       </w:pPr>
-      <w:r>
+    </w:p>
+    <w:p>
+      <w:pPr>
         <w:rPr>
           <w:b/>
           <w:sz w:val="28"/>
           <w:szCs w:val="28"/>
           <w:lang w:val="en-US"/>
         </w:rPr>
+      </w:pPr>
+    </w:p>
+    <w:p>
+      <w:pPr>
+        <w:rPr>
+          <w:b/>
+          <w:sz w:val="28"/>
+          <w:szCs w:val="28"/>
+          <w:lang w:val="en-US"/>
+        </w:rPr>
+      </w:pPr>
+    </w:p>
+    <w:p>
+      <w:pPr>
+        <w:rPr>
+          <w:b/>
+          <w:sz w:val="28"/>
+          <w:szCs w:val="28"/>
+          <w:lang w:val="en-US"/>
+        </w:rPr>
+      </w:pPr>
+    </w:p>
+    <w:p>
+      <w:pPr>
+        <w:rPr>
+          <w:b/>
+          <w:sz w:val="28"/>
+          <w:szCs w:val="28"/>
+          <w:lang w:val="en-US"/>
+        </w:rPr>
+      </w:pPr>
+    </w:p>
+    <w:p>
+      <w:pPr>
+        <w:rPr>
+          <w:b/>
+          <w:sz w:val="28"/>
+          <w:szCs w:val="28"/>
+          <w:lang w:val="en-US"/>
+        </w:rPr>
+      </w:pPr>
+      <w:r>
+        <w:rPr>
+          <w:b/>
+          <w:sz w:val="28"/>
+          <w:szCs w:val="28"/>
+          <w:lang w:val="en-US"/>
+        </w:rPr>
+        <w:lastRenderedPageBreak/>
         <w:t>A</w:t>
       </w:r>
       <w:r>
@@ -6337,13 +6387,13 @@
         <mc:AlternateContent>
           <mc:Choice Requires="wps">
             <w:drawing>
-              <wp:anchor distT="0" distB="0" distL="114300" distR="114300" simplePos="0" relativeHeight="251662336" behindDoc="0" locked="0" layoutInCell="1" allowOverlap="1" wp14:anchorId="2B1ED321" wp14:editId="7D242796">
+              <wp:anchor distT="0" distB="0" distL="114300" distR="114300" simplePos="0" relativeHeight="251662336" behindDoc="0" locked="0" layoutInCell="1" allowOverlap="1" wp14:anchorId="2B1ED321" wp14:editId="53D2933F">
                 <wp:simplePos x="0" y="0"/>
-                <wp:positionH relativeFrom="column">
-                  <wp:posOffset>61358</wp:posOffset>
+                <wp:positionH relativeFrom="margin">
+                  <wp:posOffset>-50800</wp:posOffset>
                 </wp:positionH>
                 <wp:positionV relativeFrom="paragraph">
-                  <wp:posOffset>1297192</wp:posOffset>
+                  <wp:posOffset>947420</wp:posOffset>
                 </wp:positionV>
                 <wp:extent cx="398297" cy="241222"/>
                 <wp:effectExtent l="0" t="19050" r="40005" b="45085"/>
@@ -6399,7 +6449,9 @@
           </mc:Choice>
           <mc:Fallback>
             <w:pict>
-              <v:shape w14:anchorId="442F22F5" id="Arrow: Striped Right 14" o:spid="_x0000_s1026" type="#_x0000_t93" style="position:absolute;margin-left:4.85pt;margin-top:102.15pt;width:31.35pt;height:19pt;z-index:251662336;visibility:visible;mso-wrap-style:square;mso-wrap-distance-left:9pt;mso-wrap-distance-top:0;mso-wrap-distance-right:9pt;mso-wrap-distance-bottom:0;mso-position-horizontal:absolute;mso-position-horizontal-relative:text;mso-position-vertical:absolute;mso-position-vertical-relative:text;v-text-anchor:middle" o:gfxdata="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" adj="15059" filled="f" strokecolor="#00b0f0" strokeweight="1pt"/>
+              <v:shape w14:anchorId="60CC8391" id="Arrow: Striped Right 14" o:spid="_x0000_s1026" type="#_x0000_t93" style="position:absolute;margin-left:-4pt;margin-top:74.6pt;width:31.35pt;height:19pt;z-index:251662336;visibility:visible;mso-wrap-style:square;mso-wrap-distance-left:9pt;mso-wrap-distance-top:0;mso-wrap-distance-right:9pt;mso-wrap-distance-bottom:0;mso-position-horizontal:absolute;mso-position-horizontal-relative:margin;mso-position-vertical:absolute;mso-position-vertical-relative:text;v-text-anchor:middle" o:gfxdata="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" adj="15059" filled="f" strokecolor="#00b0f0" strokeweight="1pt">
+                <w10:wrap anchorx="margin"/>
+              </v:shape>
             </w:pict>
           </mc:Fallback>
         </mc:AlternateContent>
@@ -6407,16 +6459,15 @@
       <w:r>
         <w:rPr>
           <w:b/>
-          <w:noProof/>
           <w:sz w:val="28"/>
           <w:szCs w:val="28"/>
           <w:lang w:val="en-US"/>
         </w:rPr>
         <w:drawing>
-          <wp:inline distT="0" distB="0" distL="0" distR="0" wp14:anchorId="7DA1FAE6" wp14:editId="18D0AA56">
-            <wp:extent cx="1267002" cy="3134162"/>
-            <wp:effectExtent l="0" t="0" r="9525" b="0"/>
-            <wp:docPr id="7" name="Picture 7"/>
+          <wp:inline distT="0" distB="0" distL="0" distR="0" wp14:anchorId="5D757477" wp14:editId="0B8083B6">
+            <wp:extent cx="838524" cy="2355850"/>
+            <wp:effectExtent l="0" t="0" r="0" b="6350"/>
+            <wp:docPr id="39" name="Picture 39"/>
             <wp:cNvGraphicFramePr>
               <a:graphicFrameLocks xmlns:a="http://schemas.openxmlformats.org/drawingml/2006/main" noChangeAspect="1"/>
             </wp:cNvGraphicFramePr>
@@ -6436,7 +6487,7 @@
                   <pic:spPr>
                     <a:xfrm>
                       <a:off x="0" y="0"/>
-                      <a:ext cx="1267002" cy="3134162"/>
+                      <a:ext cx="883405" cy="2481945"/>
                     </a:xfrm>
                     <a:prstGeom prst="rect">
                       <a:avLst/>
@@ -6571,7 +6622,7 @@
         <mc:AlternateContent>
           <mc:Choice Requires="wps">
             <w:drawing>
-              <wp:anchor distT="0" distB="0" distL="114300" distR="114300" simplePos="0" relativeHeight="251664384" behindDoc="0" locked="0" layoutInCell="1" allowOverlap="1" wp14:anchorId="4952B886" wp14:editId="0595C4F3">
+              <wp:anchor distT="0" distB="0" distL="114300" distR="114300" simplePos="0" relativeHeight="251664384" behindDoc="0" locked="0" layoutInCell="1" allowOverlap="1" wp14:anchorId="4952B886" wp14:editId="6F1C3DB3">
                 <wp:simplePos x="0" y="0"/>
                 <wp:positionH relativeFrom="column">
                   <wp:posOffset>1054011</wp:posOffset>
@@ -6633,7 +6684,7 @@
           </mc:Choice>
           <mc:Fallback>
             <w:pict>
-              <v:shape w14:anchorId="5245235E" id="Arrow: Striped Right 15" o:spid="_x0000_s1026" type="#_x0000_t93" style="position:absolute;margin-left:83pt;margin-top:49.2pt;width:31.35pt;height:19pt;rotation:-90;z-index:251664384;visibility:visible;mso-wrap-style:square;mso-wrap-distance-left:9pt;mso-wrap-distance-top:0;mso-wrap-distance-right:9pt;mso-wrap-distance-bottom:0;mso-position-horizontal:absolute;mso-position-horizontal-relative:text;mso-position-vertical:absolute;mso-position-vertical-relative:text;v-text-anchor:middle" o:gfxdata="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" adj="15059" filled="f" strokecolor="#00b0f0" strokeweight="1pt"/>
+              <v:shape w14:anchorId="3DCF4C3D" id="Arrow: Striped Right 15" o:spid="_x0000_s1026" type="#_x0000_t93" style="position:absolute;margin-left:83pt;margin-top:49.2pt;width:31.35pt;height:19pt;rotation:-90;z-index:251664384;visibility:visible;mso-wrap-style:square;mso-wrap-distance-left:9pt;mso-wrap-distance-top:0;mso-wrap-distance-right:9pt;mso-wrap-distance-bottom:0;mso-position-horizontal:absolute;mso-position-horizontal-relative:text;mso-position-vertical:absolute;mso-position-vertical-relative:text;v-text-anchor:middle" o:gfxdata="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" adj="15059" filled="f" strokecolor="#00b0f0" strokeweight="1pt"/>
             </w:pict>
           </mc:Fallback>
         </mc:AlternateContent>
@@ -6641,16 +6692,15 @@
       <w:r>
         <w:rPr>
           <w:b/>
-          <w:noProof/>
           <w:sz w:val="28"/>
           <w:szCs w:val="28"/>
           <w:lang w:val="en-US"/>
         </w:rPr>
         <w:drawing>
-          <wp:inline distT="0" distB="0" distL="0" distR="0" wp14:anchorId="559D8C3A" wp14:editId="5C5717F4">
-            <wp:extent cx="2514951" cy="1162212"/>
-            <wp:effectExtent l="0" t="0" r="0" b="0"/>
-            <wp:docPr id="8" name="Picture 8"/>
+          <wp:inline distT="0" distB="0" distL="0" distR="0" wp14:anchorId="157371D3" wp14:editId="26DD563A">
+            <wp:extent cx="2241550" cy="1148608"/>
+            <wp:effectExtent l="0" t="0" r="6350" b="0"/>
+            <wp:docPr id="38" name="Picture 38"/>
             <wp:cNvGraphicFramePr>
               <a:graphicFrameLocks xmlns:a="http://schemas.openxmlformats.org/drawingml/2006/main" noChangeAspect="1"/>
             </wp:cNvGraphicFramePr>
@@ -6670,7 +6720,7 @@
                   <pic:spPr>
                     <a:xfrm>
                       <a:off x="0" y="0"/>
-                      <a:ext cx="2514951" cy="1162212"/>
+                      <a:ext cx="2288545" cy="1172689"/>
                     </a:xfrm>
                     <a:prstGeom prst="rect">
                       <a:avLst/>
@@ -6815,17 +6865,35 @@
           <w:szCs w:val="28"/>
           <w:lang w:val="en-US"/>
         </w:rPr>
-        <w:t xml:space="preserve"> This structure creates a concrete bond </w:t>
-      </w:r>
-      <w:r>
+        <w:t xml:space="preserve"> This structure creates a concrete bond between classes that would fail to function without the classes that they depend on.</w:t>
+      </w:r>
+    </w:p>
+    <w:p>
+      <w:pPr>
         <w:rPr>
           <w:sz w:val="28"/>
           <w:szCs w:val="28"/>
           <w:lang w:val="en-US"/>
         </w:rPr>
-        <w:lastRenderedPageBreak/>
-        <w:t>between classes that would fail to function without the classes that they depend on.</w:t>
-      </w:r>
+      </w:pPr>
+    </w:p>
+    <w:p>
+      <w:pPr>
+        <w:rPr>
+          <w:sz w:val="28"/>
+          <w:szCs w:val="28"/>
+          <w:lang w:val="en-US"/>
+        </w:rPr>
+      </w:pPr>
+    </w:p>
+    <w:p>
+      <w:pPr>
+        <w:rPr>
+          <w:sz w:val="28"/>
+          <w:szCs w:val="28"/>
+          <w:lang w:val="en-US"/>
+        </w:rPr>
+      </w:pPr>
     </w:p>
     <w:p>
       <w:pPr>
@@ -6843,15 +6911,9 @@
           <w:szCs w:val="28"/>
           <w:lang w:val="en-US"/>
         </w:rPr>
+        <w:lastRenderedPageBreak/>
         <w:t>Inheritance</w:t>
       </w:r>
-    </w:p>
-    <w:p>
-      <w:pPr>
-        <w:rPr>
-          <w:lang w:val="en-US"/>
-        </w:rPr>
-      </w:pPr>
     </w:p>
     <w:p>
       <w:pPr>
@@ -6870,13 +6932,13 @@
         <mc:AlternateContent>
           <mc:Choice Requires="wps">
             <w:drawing>
-              <wp:anchor distT="0" distB="0" distL="114300" distR="114300" simplePos="0" relativeHeight="251666432" behindDoc="0" locked="0" layoutInCell="1" allowOverlap="1" wp14:anchorId="0B6012C1" wp14:editId="63D1C678">
+              <wp:anchor distT="0" distB="0" distL="114300" distR="114300" simplePos="0" relativeHeight="251666432" behindDoc="0" locked="0" layoutInCell="1" allowOverlap="1" wp14:anchorId="0B6012C1" wp14:editId="3D9F1577">
                 <wp:simplePos x="0" y="0"/>
                 <wp:positionH relativeFrom="column">
-                  <wp:posOffset>1267183</wp:posOffset>
+                  <wp:posOffset>866775</wp:posOffset>
                 </wp:positionH>
                 <wp:positionV relativeFrom="paragraph">
-                  <wp:posOffset>141516</wp:posOffset>
+                  <wp:posOffset>86360</wp:posOffset>
                 </wp:positionV>
                 <wp:extent cx="398297" cy="241222"/>
                 <wp:effectExtent l="21590" t="0" r="42545" b="42545"/>
@@ -6932,21 +6994,27 @@
           </mc:Choice>
           <mc:Fallback>
             <w:pict>
-              <v:shape w14:anchorId="4222AAF0" id="Arrow: Striped Right 16" o:spid="_x0000_s1026" type="#_x0000_t93" style="position:absolute;margin-left:99.8pt;margin-top:11.15pt;width:31.35pt;height:19pt;rotation:90;z-index:251666432;visibility:visible;mso-wrap-style:square;mso-wrap-distance-left:9pt;mso-wrap-distance-top:0;mso-wrap-distance-right:9pt;mso-wrap-distance-bottom:0;mso-position-horizontal:absolute;mso-position-horizontal-relative:text;mso-position-vertical:absolute;mso-position-vertical-relative:text;v-text-anchor:middle" o:gfxdata="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" adj="15059" filled="f" strokecolor="#00b0f0" strokeweight="1pt"/>
+              <v:shape w14:anchorId="1F798EDC" id="Arrow: Striped Right 16" o:spid="_x0000_s1026" type="#_x0000_t93" style="position:absolute;margin-left:68.25pt;margin-top:6.8pt;width:31.35pt;height:19pt;rotation:90;z-index:251666432;visibility:visible;mso-wrap-style:square;mso-wrap-distance-left:9pt;mso-wrap-distance-top:0;mso-wrap-distance-right:9pt;mso-wrap-distance-bottom:0;mso-position-horizontal:absolute;mso-position-horizontal-relative:text;mso-position-vertical:absolute;mso-position-vertical-relative:text;v-text-anchor:middle" o:gfxdata="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" adj="15059" filled="f" strokecolor="#00b0f0" strokeweight="1pt"/>
             </w:pict>
           </mc:Fallback>
         </mc:AlternateContent>
       </w:r>
-      <w:r>
-        <w:rPr>
-          <w:noProof/>
+    </w:p>
+    <w:p>
+      <w:pPr>
+        <w:rPr>
+          <w:lang w:val="en-US"/>
+        </w:rPr>
+      </w:pPr>
+      <w:r>
+        <w:rPr>
           <w:lang w:val="en-US"/>
         </w:rPr>
         <w:drawing>
-          <wp:inline distT="0" distB="0" distL="0" distR="0" wp14:anchorId="1F2CC139" wp14:editId="77D65C8E">
-            <wp:extent cx="2943636" cy="2143424"/>
-            <wp:effectExtent l="0" t="0" r="9525" b="9525"/>
-            <wp:docPr id="9" name="Picture 9"/>
+          <wp:inline distT="0" distB="0" distL="0" distR="0" wp14:anchorId="239493B1" wp14:editId="76B0C96A">
+            <wp:extent cx="2055223" cy="1454150"/>
+            <wp:effectExtent l="0" t="0" r="2540" b="0"/>
+            <wp:docPr id="35" name="Picture 35"/>
             <wp:cNvGraphicFramePr>
               <a:graphicFrameLocks xmlns:a="http://schemas.openxmlformats.org/drawingml/2006/main" noChangeAspect="1"/>
             </wp:cNvGraphicFramePr>
@@ -6966,7 +7034,7 @@
                   <pic:spPr>
                     <a:xfrm>
                       <a:off x="0" y="0"/>
-                      <a:ext cx="2943636" cy="2143424"/>
+                      <a:ext cx="2093254" cy="1481058"/>
                     </a:xfrm>
                     <a:prstGeom prst="rect">
                       <a:avLst/>
@@ -7303,6 +7371,30 @@
     </w:p>
     <w:p>
       <w:pPr>
+        <w:rPr>
+          <w:rFonts w:cstheme="minorHAnsi"/>
+          <w:lang w:val="en-US"/>
+        </w:rPr>
+      </w:pPr>
+    </w:p>
+    <w:p>
+      <w:pPr>
+        <w:rPr>
+          <w:rFonts w:cstheme="minorHAnsi"/>
+          <w:lang w:val="en-US"/>
+        </w:rPr>
+      </w:pPr>
+    </w:p>
+    <w:p>
+      <w:pPr>
+        <w:rPr>
+          <w:rFonts w:cstheme="minorHAnsi"/>
+          <w:lang w:val="en-US"/>
+        </w:rPr>
+      </w:pPr>
+    </w:p>
+    <w:p>
+      <w:pPr>
         <w:pStyle w:val="Heading1"/>
         <w:rPr>
           <w:sz w:val="36"/>
@@ -7467,15 +7559,6 @@
       <w:pPr>
         <w:jc w:val="both"/>
         <w:rPr>
-          <w:lang w:val="en-US"/>
-        </w:rPr>
-      </w:pPr>
-    </w:p>
-    <w:p>
-      <w:pPr>
-        <w:rPr>
-          <w:sz w:val="28"/>
-          <w:szCs w:val="28"/>
           <w:lang w:val="en-US"/>
         </w:rPr>
       </w:pPr>
@@ -7568,7 +7651,6 @@
         <w:keepNext/>
         <w:jc w:val="center"/>
       </w:pPr>
-      <w:bookmarkStart w:id="18" w:name="_GoBack"/>
       <w:r>
         <w:rPr>
           <w:noProof/>
@@ -7611,7 +7693,6 @@
           </wp:inline>
         </w:drawing>
       </w:r>
-      <w:bookmarkEnd w:id="18"/>
     </w:p>
     <w:p>
       <w:pPr>
@@ -7631,6 +7712,1199 @@
       <w:r>
         <w:t xml:space="preserve"> ER Diagram</w:t>
       </w:r>
+    </w:p>
+    <w:p>
+      <w:pPr>
+        <w:rPr>
+          <w:lang w:val="en-US"/>
+        </w:rPr>
+      </w:pPr>
+    </w:p>
+    <w:p>
+      <w:pPr>
+        <w:rPr>
+          <w:lang w:val="en-US"/>
+        </w:rPr>
+      </w:pPr>
+    </w:p>
+    <w:p>
+      <w:pPr>
+        <w:rPr>
+          <w:lang w:val="en-US"/>
+        </w:rPr>
+      </w:pPr>
+      <w:r>
+        <w:rPr>
+          <w:noProof/>
+          <w:lang w:val="en-US"/>
+        </w:rPr>
+        <w:lastRenderedPageBreak/>
+        <w:drawing>
+          <wp:inline distT="0" distB="0" distL="0" distR="0" wp14:anchorId="190DB1EC" wp14:editId="3E7801FE">
+            <wp:extent cx="5727700" cy="4549775"/>
+            <wp:effectExtent l="0" t="0" r="6350" b="3175"/>
+            <wp:docPr id="13" name="Picture 13"/>
+            <wp:cNvGraphicFramePr>
+              <a:graphicFrameLocks xmlns:a="http://schemas.openxmlformats.org/drawingml/2006/main" noChangeAspect="1"/>
+            </wp:cNvGraphicFramePr>
+            <a:graphic xmlns:a="http://schemas.openxmlformats.org/drawingml/2006/main">
+              <a:graphicData uri="http://schemas.openxmlformats.org/drawingml/2006/picture">
+                <pic:pic xmlns:pic="http://schemas.openxmlformats.org/drawingml/2006/picture">
+                  <pic:nvPicPr>
+                    <pic:cNvPr id="13" name="ERD Diagram.drawio.png"/>
+                    <pic:cNvPicPr/>
+                  </pic:nvPicPr>
+                  <pic:blipFill>
+                    <a:blip r:embed="rId16" cstate="print">
+                      <a:extLst>
+                        <a:ext uri="{28A0092B-C50C-407E-A947-70E740481C1C}">
+                          <a14:useLocalDpi xmlns:a14="http://schemas.microsoft.com/office/drawing/2010/main" val="0"/>
+                        </a:ext>
+                      </a:extLst>
+                    </a:blip>
+                    <a:stretch>
+                      <a:fillRect/>
+                    </a:stretch>
+                  </pic:blipFill>
+                  <pic:spPr>
+                    <a:xfrm>
+                      <a:off x="0" y="0"/>
+                      <a:ext cx="5727700" cy="4549775"/>
+                    </a:xfrm>
+                    <a:prstGeom prst="rect">
+                      <a:avLst/>
+                    </a:prstGeom>
+                  </pic:spPr>
+                </pic:pic>
+              </a:graphicData>
+            </a:graphic>
+          </wp:inline>
+        </w:drawing>
+      </w:r>
+    </w:p>
+    <w:p>
+      <w:pPr>
+        <w:rPr>
+          <w:i/>
+          <w:lang w:val="en-US"/>
+        </w:rPr>
+      </w:pPr>
+      <w:r>
+        <w:rPr>
+          <w:lang w:val="en-US"/>
+        </w:rPr>
+        <w:tab/>
+      </w:r>
+      <w:r>
+        <w:rPr>
+          <w:lang w:val="en-US"/>
+        </w:rPr>
+        <w:tab/>
+      </w:r>
+      <w:r>
+        <w:rPr>
+          <w:lang w:val="en-US"/>
+        </w:rPr>
+        <w:tab/>
+      </w:r>
+      <w:r>
+        <w:rPr>
+          <w:lang w:val="en-US"/>
+        </w:rPr>
+        <w:tab/>
+      </w:r>
+      <w:r>
+        <w:rPr>
+          <w:lang w:val="en-US"/>
+        </w:rPr>
+        <w:tab/>
+      </w:r>
+      <w:r>
+        <w:rPr>
+          <w:lang w:val="en-US"/>
+        </w:rPr>
+        <w:tab/>
+      </w:r>
+      <w:r>
+        <w:rPr>
+          <w:i/>
+          <w:lang w:val="en-US"/>
+        </w:rPr>
+        <w:t>Figure 1.6</w:t>
+      </w:r>
+    </w:p>
+    <w:p>
+      <w:pPr>
+        <w:rPr>
+          <w:lang w:val="en-US"/>
+        </w:rPr>
+      </w:pPr>
+    </w:p>
+    <w:p>
+      <w:pPr>
+        <w:rPr>
+          <w:lang w:val="en-US"/>
+        </w:rPr>
+      </w:pPr>
+      <w:r>
+        <w:rPr>
+          <w:lang w:val="en-US"/>
+        </w:rPr>
+        <w:t>The Entity Relational Diagram (</w:t>
+      </w:r>
+      <w:proofErr w:type="spellStart"/>
+      <w:r>
+        <w:rPr>
+          <w:lang w:val="en-US"/>
+        </w:rPr>
+        <w:t>ERD</w:t>
+      </w:r>
+      <w:proofErr w:type="spellEnd"/>
+      <w:r>
+        <w:rPr>
+          <w:lang w:val="en-US"/>
+        </w:rPr>
+        <w:t xml:space="preserve">) above represents the physical connection of the </w:t>
+      </w:r>
+      <w:r>
+        <w:rPr>
+          <w:i/>
+          <w:lang w:val="en-US"/>
+        </w:rPr>
+        <w:t>SplashScreen</w:t>
+      </w:r>
+      <w:r>
+        <w:rPr>
+          <w:lang w:val="en-US"/>
+        </w:rPr>
+        <w:t xml:space="preserve"> database.  Building on the UML class diagram, this illustration models the different entity relationships, one-to-one, one-to-many and many-to-many</w:t>
+      </w:r>
+      <w:r>
+        <w:rPr>
+          <w:lang w:val="en-US"/>
+        </w:rPr>
+        <w:t>, viewed as multiplicity in our UML class diagram. We analyze how our data is stored and how it will interact with different components:</w:t>
+      </w:r>
+    </w:p>
+    <w:p>
+      <w:pPr>
+        <w:rPr>
+          <w:lang w:val="en-US"/>
+        </w:rPr>
+      </w:pPr>
+    </w:p>
+    <w:p>
+      <w:pPr>
+        <w:rPr>
+          <w:b/>
+          <w:lang w:val="en-US"/>
+        </w:rPr>
+      </w:pPr>
+      <w:r>
+        <w:rPr>
+          <w:b/>
+          <w:noProof/>
+          <w:sz w:val="28"/>
+          <w:szCs w:val="28"/>
+          <w:lang w:val="en-US"/>
+        </w:rPr>
+        <mc:AlternateContent>
+          <mc:Choice Requires="wps">
+            <w:drawing>
+              <wp:anchor distT="0" distB="0" distL="114300" distR="114300" simplePos="0" relativeHeight="251684864" behindDoc="0" locked="0" layoutInCell="1" allowOverlap="1" wp14:anchorId="545E1E7E" wp14:editId="7A45CA9D">
+                <wp:simplePos x="0" y="0"/>
+                <wp:positionH relativeFrom="column">
+                  <wp:posOffset>963559</wp:posOffset>
+                </wp:positionH>
+                <wp:positionV relativeFrom="paragraph">
+                  <wp:posOffset>83845</wp:posOffset>
+                </wp:positionV>
+                <wp:extent cx="398297" cy="241222"/>
+                <wp:effectExtent l="21590" t="0" r="42545" b="42545"/>
+                <wp:wrapNone/>
+                <wp:docPr id="21" name="Arrow: Striped Right 21"/>
+                <wp:cNvGraphicFramePr/>
+                <a:graphic xmlns:a="http://schemas.openxmlformats.org/drawingml/2006/main">
+                  <a:graphicData uri="http://schemas.microsoft.com/office/word/2010/wordprocessingShape">
+                    <wps:wsp>
+                      <wps:cNvSpPr/>
+                      <wps:spPr>
+                        <a:xfrm rot="5400000">
+                          <a:off x="0" y="0"/>
+                          <a:ext cx="398297" cy="241222"/>
+                        </a:xfrm>
+                        <a:prstGeom prst="stripedRightArrow">
+                          <a:avLst/>
+                        </a:prstGeom>
+                        <a:noFill/>
+                        <a:ln>
+                          <a:solidFill>
+                            <a:srgbClr val="00B0F0"/>
+                          </a:solidFill>
+                        </a:ln>
+                      </wps:spPr>
+                      <wps:style>
+                        <a:lnRef idx="2">
+                          <a:schemeClr val="accent1">
+                            <a:shade val="50000"/>
+                          </a:schemeClr>
+                        </a:lnRef>
+                        <a:fillRef idx="1">
+                          <a:schemeClr val="accent1"/>
+                        </a:fillRef>
+                        <a:effectRef idx="0">
+                          <a:schemeClr val="accent1"/>
+                        </a:effectRef>
+                        <a:fontRef idx="minor">
+                          <a:schemeClr val="lt1"/>
+                        </a:fontRef>
+                      </wps:style>
+                      <wps:bodyPr rot="0" spcFirstLastPara="0" vertOverflow="overflow" horzOverflow="overflow" vert="horz" wrap="square" lIns="91440" tIns="45720" rIns="91440" bIns="45720" numCol="1" spcCol="0" rtlCol="0" fromWordArt="0" anchor="ctr" anchorCtr="0" forceAA="0" compatLnSpc="1">
+                        <a:prstTxWarp prst="textNoShape">
+                          <a:avLst/>
+                        </a:prstTxWarp>
+                        <a:noAutofit/>
+                      </wps:bodyPr>
+                    </wps:wsp>
+                  </a:graphicData>
+                </a:graphic>
+              </wp:anchor>
+            </w:drawing>
+          </mc:Choice>
+          <mc:Fallback>
+            <w:pict>
+              <v:shape w14:anchorId="6DF01FD3" id="Arrow: Striped Right 21" o:spid="_x0000_s1026" type="#_x0000_t93" style="position:absolute;margin-left:75.85pt;margin-top:6.6pt;width:31.35pt;height:19pt;rotation:90;z-index:251684864;visibility:visible;mso-wrap-style:square;mso-wrap-distance-left:9pt;mso-wrap-distance-top:0;mso-wrap-distance-right:9pt;mso-wrap-distance-bottom:0;mso-position-horizontal:absolute;mso-position-horizontal-relative:text;mso-position-vertical:absolute;mso-position-vertical-relative:text;v-text-anchor:middle" o:gfxdata="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" adj="15059" filled="f" strokecolor="#00b0f0" strokeweight="1pt"/>
+            </w:pict>
+          </mc:Fallback>
+        </mc:AlternateContent>
+      </w:r>
+      <w:r>
+        <w:rPr>
+          <w:b/>
+          <w:lang w:val="en-US"/>
+        </w:rPr>
+        <w:t>One-to-One</w:t>
+      </w:r>
+    </w:p>
+    <w:p>
+      <w:pPr>
+        <w:rPr>
+          <w:b/>
+          <w:lang w:val="en-US"/>
+        </w:rPr>
+      </w:pPr>
+      <w:r>
+        <w:rPr>
+          <w:lang w:val="en-US"/>
+        </w:rPr>
+        <w:drawing>
+          <wp:anchor distT="0" distB="0" distL="114300" distR="114300" simplePos="0" relativeHeight="251683840" behindDoc="0" locked="0" layoutInCell="1" allowOverlap="1" wp14:anchorId="3F1B2762" wp14:editId="22C054A4">
+            <wp:simplePos x="0" y="0"/>
+            <wp:positionH relativeFrom="column">
+              <wp:posOffset>3097001</wp:posOffset>
+            </wp:positionH>
+            <wp:positionV relativeFrom="paragraph">
+              <wp:posOffset>69989</wp:posOffset>
+            </wp:positionV>
+            <wp:extent cx="1718310" cy="183515"/>
+            <wp:effectExtent l="0" t="0" r="0" b="6985"/>
+            <wp:wrapSquare wrapText="bothSides"/>
+            <wp:docPr id="27" name="Picture 27"/>
+            <wp:cNvGraphicFramePr>
+              <a:graphicFrameLocks xmlns:a="http://schemas.openxmlformats.org/drawingml/2006/main" noChangeAspect="1"/>
+            </wp:cNvGraphicFramePr>
+            <a:graphic xmlns:a="http://schemas.openxmlformats.org/drawingml/2006/main">
+              <a:graphicData uri="http://schemas.openxmlformats.org/drawingml/2006/picture">
+                <pic:pic xmlns:pic="http://schemas.openxmlformats.org/drawingml/2006/picture">
+                  <pic:nvPicPr>
+                    <pic:cNvPr id="1" name=""/>
+                    <pic:cNvPicPr/>
+                  </pic:nvPicPr>
+                  <pic:blipFill>
+                    <a:blip r:embed="rId17" cstate="print">
+                      <a:extLst>
+                        <a:ext uri="{28A0092B-C50C-407E-A947-70E740481C1C}">
+                          <a14:useLocalDpi xmlns:a14="http://schemas.microsoft.com/office/drawing/2010/main" val="0"/>
+                        </a:ext>
+                      </a:extLst>
+                    </a:blip>
+                    <a:stretch>
+                      <a:fillRect/>
+                    </a:stretch>
+                  </pic:blipFill>
+                  <pic:spPr>
+                    <a:xfrm>
+                      <a:off x="0" y="0"/>
+                      <a:ext cx="1718310" cy="183515"/>
+                    </a:xfrm>
+                    <a:prstGeom prst="rect">
+                      <a:avLst/>
+                    </a:prstGeom>
+                  </pic:spPr>
+                </pic:pic>
+              </a:graphicData>
+            </a:graphic>
+            <wp14:sizeRelH relativeFrom="page">
+              <wp14:pctWidth>0</wp14:pctWidth>
+            </wp14:sizeRelH>
+            <wp14:sizeRelV relativeFrom="page">
+              <wp14:pctHeight>0</wp14:pctHeight>
+            </wp14:sizeRelV>
+          </wp:anchor>
+        </w:drawing>
+      </w:r>
+      <w:r>
+        <w:rPr>
+          <w:b/>
+          <w:lang w:val="en-US"/>
+        </w:rPr>
+        <w:drawing>
+          <wp:anchor distT="0" distB="0" distL="114300" distR="114300" simplePos="0" relativeHeight="251681792" behindDoc="0" locked="0" layoutInCell="1" allowOverlap="1" wp14:anchorId="059326A1" wp14:editId="196DEE2E">
+            <wp:simplePos x="914400" y="7140575"/>
+            <wp:positionH relativeFrom="column">
+              <wp:align>left</wp:align>
+            </wp:positionH>
+            <wp:positionV relativeFrom="paragraph">
+              <wp:align>top</wp:align>
+            </wp:positionV>
+            <wp:extent cx="2335530" cy="1095375"/>
+            <wp:effectExtent l="0" t="0" r="7620" b="9525"/>
+            <wp:wrapSquare wrapText="bothSides"/>
+            <wp:docPr id="19" name="Picture 19"/>
+            <wp:cNvGraphicFramePr>
+              <a:graphicFrameLocks xmlns:a="http://schemas.openxmlformats.org/drawingml/2006/main" noChangeAspect="1"/>
+            </wp:cNvGraphicFramePr>
+            <a:graphic xmlns:a="http://schemas.openxmlformats.org/drawingml/2006/main">
+              <a:graphicData uri="http://schemas.openxmlformats.org/drawingml/2006/picture">
+                <pic:pic xmlns:pic="http://schemas.openxmlformats.org/drawingml/2006/picture">
+                  <pic:nvPicPr>
+                    <pic:cNvPr id="1" name=""/>
+                    <pic:cNvPicPr/>
+                  </pic:nvPicPr>
+                  <pic:blipFill>
+                    <a:blip r:embed="rId18">
+                      <a:extLst>
+                        <a:ext uri="{28A0092B-C50C-407E-A947-70E740481C1C}">
+                          <a14:useLocalDpi xmlns:a14="http://schemas.microsoft.com/office/drawing/2010/main" val="0"/>
+                        </a:ext>
+                      </a:extLst>
+                    </a:blip>
+                    <a:stretch>
+                      <a:fillRect/>
+                    </a:stretch>
+                  </pic:blipFill>
+                  <pic:spPr>
+                    <a:xfrm>
+                      <a:off x="0" y="0"/>
+                      <a:ext cx="2335530" cy="1095375"/>
+                    </a:xfrm>
+                    <a:prstGeom prst="rect">
+                      <a:avLst/>
+                    </a:prstGeom>
+                  </pic:spPr>
+                </pic:pic>
+              </a:graphicData>
+            </a:graphic>
+          </wp:anchor>
+        </w:drawing>
+      </w:r>
+    </w:p>
+    <w:p>
+      <w:pPr>
+        <w:rPr>
+          <w:b/>
+          <w:lang w:val="en-US"/>
+        </w:rPr>
+      </w:pPr>
+    </w:p>
+    <w:p>
+      <w:pPr>
+        <w:tabs>
+          <w:tab w:val="left" w:pos="1390"/>
+        </w:tabs>
+        <w:rPr>
+          <w:i/>
+          <w:lang w:val="en-US"/>
+        </w:rPr>
+      </w:pPr>
+      <w:r>
+        <w:rPr>
+          <w:b/>
+          <w:lang w:val="en-US"/>
+        </w:rPr>
+        <w:tab/>
+      </w:r>
+      <w:r>
+        <w:rPr>
+          <w:b/>
+          <w:lang w:val="en-US"/>
+        </w:rPr>
+        <w:tab/>
+      </w:r>
+      <w:r>
+        <w:rPr>
+          <w:b/>
+          <w:lang w:val="en-US"/>
+        </w:rPr>
+        <w:tab/>
+      </w:r>
+      <w:r>
+        <w:rPr>
+          <w:i/>
+          <w:lang w:val="en-US"/>
+        </w:rPr>
+        <w:t>Figure 1.8</w:t>
+      </w:r>
+      <w:r>
+        <w:rPr>
+          <w:i/>
+          <w:lang w:val="en-US"/>
+        </w:rPr>
+        <w:br w:type="textWrapping" w:clear="all"/>
+      </w:r>
+    </w:p>
+    <w:p>
+      <w:pPr>
+        <w:rPr>
+          <w:i/>
+          <w:lang w:val="en-US"/>
+        </w:rPr>
+      </w:pPr>
+      <w:r>
+        <w:rPr>
+          <w:i/>
+          <w:lang w:val="en-US"/>
+        </w:rPr>
+        <w:t>Figure 1.7</w:t>
+      </w:r>
+    </w:p>
+    <w:p>
+      <w:pPr>
+        <w:rPr>
+          <w:lang w:val="en-US"/>
+        </w:rPr>
+      </w:pPr>
+    </w:p>
+    <w:p>
+      <w:pPr>
+        <w:rPr>
+          <w:lang w:val="en-US"/>
+        </w:rPr>
+      </w:pPr>
+      <w:r>
+        <w:rPr>
+          <w:lang w:val="en-US"/>
+        </w:rPr>
+        <w:t xml:space="preserve">This physical connection occurs when one entity such as </w:t>
+      </w:r>
+      <w:r>
+        <w:rPr>
+          <w:lang w:val="en-US"/>
+        </w:rPr>
+        <w:t>pool owner</w:t>
+      </w:r>
+      <w:r>
+        <w:rPr>
+          <w:lang w:val="en-US"/>
+        </w:rPr>
+        <w:t xml:space="preserve"> only has only one relational mapping to another entity, </w:t>
+      </w:r>
+      <w:r>
+        <w:rPr>
+          <w:lang w:val="en-US"/>
+        </w:rPr>
+        <w:t>u</w:t>
+      </w:r>
+      <w:r>
+        <w:rPr>
+          <w:lang w:val="en-US"/>
+        </w:rPr>
+        <w:t xml:space="preserve">ser. As we explained in our UML class diagram, a </w:t>
+      </w:r>
+      <w:r>
+        <w:rPr>
+          <w:lang w:val="en-US"/>
+        </w:rPr>
+        <w:t>pool owner</w:t>
+      </w:r>
+      <w:r>
+        <w:rPr>
+          <w:lang w:val="en-US"/>
+        </w:rPr>
+        <w:t xml:space="preserve"> can only have one account under that specific User account with the related inherited information thus this physical connection was used based on inheritance. Another </w:t>
+      </w:r>
+      <w:r>
+        <w:rPr>
+          <w:lang w:val="en-US"/>
+        </w:rPr>
+        <w:lastRenderedPageBreak/>
+        <w:t xml:space="preserve">instance is </w:t>
+      </w:r>
+      <w:r>
+        <w:rPr>
+          <w:lang w:val="en-US"/>
+        </w:rPr>
+        <w:t>the relationship between the system and the marketplace. The system utilizes marketplace data. This model is also an example of the Singleton design pattern.</w:t>
+      </w:r>
+    </w:p>
+    <w:p>
+      <w:pPr>
+        <w:rPr>
+          <w:lang w:val="en-US"/>
+        </w:rPr>
+      </w:pPr>
+    </w:p>
+    <w:p>
+      <w:pPr>
+        <w:rPr>
+          <w:b/>
+          <w:lang w:val="en-US"/>
+        </w:rPr>
+      </w:pPr>
+      <w:r>
+        <w:rPr>
+          <w:b/>
+          <w:noProof/>
+          <w:sz w:val="28"/>
+          <w:szCs w:val="28"/>
+          <w:lang w:val="en-US"/>
+        </w:rPr>
+        <mc:AlternateContent>
+          <mc:Choice Requires="wps">
+            <w:drawing>
+              <wp:anchor distT="0" distB="0" distL="114300" distR="114300" simplePos="0" relativeHeight="251680768" behindDoc="0" locked="0" layoutInCell="1" allowOverlap="1" wp14:anchorId="47B7C0DC" wp14:editId="52995952">
+                <wp:simplePos x="0" y="0"/>
+                <wp:positionH relativeFrom="column">
+                  <wp:posOffset>1184275</wp:posOffset>
+                </wp:positionH>
+                <wp:positionV relativeFrom="paragraph">
+                  <wp:posOffset>84455</wp:posOffset>
+                </wp:positionV>
+                <wp:extent cx="398297" cy="241222"/>
+                <wp:effectExtent l="21590" t="0" r="42545" b="42545"/>
+                <wp:wrapNone/>
+                <wp:docPr id="28" name="Arrow: Striped Right 28"/>
+                <wp:cNvGraphicFramePr/>
+                <a:graphic xmlns:a="http://schemas.openxmlformats.org/drawingml/2006/main">
+                  <a:graphicData uri="http://schemas.microsoft.com/office/word/2010/wordprocessingShape">
+                    <wps:wsp>
+                      <wps:cNvSpPr/>
+                      <wps:spPr>
+                        <a:xfrm rot="5400000">
+                          <a:off x="0" y="0"/>
+                          <a:ext cx="398297" cy="241222"/>
+                        </a:xfrm>
+                        <a:prstGeom prst="stripedRightArrow">
+                          <a:avLst/>
+                        </a:prstGeom>
+                        <a:noFill/>
+                        <a:ln>
+                          <a:solidFill>
+                            <a:srgbClr val="00B0F0"/>
+                          </a:solidFill>
+                        </a:ln>
+                      </wps:spPr>
+                      <wps:style>
+                        <a:lnRef idx="2">
+                          <a:schemeClr val="accent1">
+                            <a:shade val="50000"/>
+                          </a:schemeClr>
+                        </a:lnRef>
+                        <a:fillRef idx="1">
+                          <a:schemeClr val="accent1"/>
+                        </a:fillRef>
+                        <a:effectRef idx="0">
+                          <a:schemeClr val="accent1"/>
+                        </a:effectRef>
+                        <a:fontRef idx="minor">
+                          <a:schemeClr val="lt1"/>
+                        </a:fontRef>
+                      </wps:style>
+                      <wps:bodyPr rot="0" spcFirstLastPara="0" vertOverflow="overflow" horzOverflow="overflow" vert="horz" wrap="square" lIns="91440" tIns="45720" rIns="91440" bIns="45720" numCol="1" spcCol="0" rtlCol="0" fromWordArt="0" anchor="ctr" anchorCtr="0" forceAA="0" compatLnSpc="1">
+                        <a:prstTxWarp prst="textNoShape">
+                          <a:avLst/>
+                        </a:prstTxWarp>
+                        <a:noAutofit/>
+                      </wps:bodyPr>
+                    </wps:wsp>
+                  </a:graphicData>
+                </a:graphic>
+              </wp:anchor>
+            </w:drawing>
+          </mc:Choice>
+          <mc:Fallback>
+            <w:pict>
+              <v:shape w14:anchorId="5C8883BE" id="Arrow: Striped Right 28" o:spid="_x0000_s1026" type="#_x0000_t93" style="position:absolute;margin-left:93.25pt;margin-top:6.65pt;width:31.35pt;height:19pt;rotation:90;z-index:251680768;visibility:visible;mso-wrap-style:square;mso-wrap-distance-left:9pt;mso-wrap-distance-top:0;mso-wrap-distance-right:9pt;mso-wrap-distance-bottom:0;mso-position-horizontal:absolute;mso-position-horizontal-relative:text;mso-position-vertical:absolute;mso-position-vertical-relative:text;v-text-anchor:middle" o:gfxdata="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" adj="15059" filled="f" strokecolor="#00b0f0" strokeweight="1pt"/>
+            </w:pict>
+          </mc:Fallback>
+        </mc:AlternateContent>
+      </w:r>
+      <w:r>
+        <w:rPr>
+          <w:b/>
+          <w:lang w:val="en-US"/>
+        </w:rPr>
+        <w:t>One-to-</w:t>
+      </w:r>
+      <w:r>
+        <w:rPr>
+          <w:b/>
+          <w:lang w:val="en-US"/>
+        </w:rPr>
+        <w:t>Many</w:t>
+      </w:r>
+    </w:p>
+    <w:p>
+      <w:pPr>
+        <w:rPr>
+          <w:i/>
+          <w:lang w:val="en-US"/>
+        </w:rPr>
+      </w:pPr>
+      <w:r>
+        <w:rPr>
+          <w:lang w:val="en-US"/>
+        </w:rPr>
+        <w:drawing>
+          <wp:anchor distT="0" distB="0" distL="114300" distR="114300" simplePos="0" relativeHeight="251678720" behindDoc="0" locked="0" layoutInCell="1" allowOverlap="1" wp14:anchorId="2758F43D" wp14:editId="4D4AECD6">
+            <wp:simplePos x="0" y="0"/>
+            <wp:positionH relativeFrom="column">
+              <wp:posOffset>3035300</wp:posOffset>
+            </wp:positionH>
+            <wp:positionV relativeFrom="paragraph">
+              <wp:posOffset>123190</wp:posOffset>
+            </wp:positionV>
+            <wp:extent cx="1755252" cy="231569"/>
+            <wp:effectExtent l="0" t="0" r="0" b="0"/>
+            <wp:wrapSquare wrapText="bothSides"/>
+            <wp:docPr id="25" name="Picture 25"/>
+            <wp:cNvGraphicFramePr>
+              <a:graphicFrameLocks xmlns:a="http://schemas.openxmlformats.org/drawingml/2006/main" noChangeAspect="1"/>
+            </wp:cNvGraphicFramePr>
+            <a:graphic xmlns:a="http://schemas.openxmlformats.org/drawingml/2006/main">
+              <a:graphicData uri="http://schemas.openxmlformats.org/drawingml/2006/picture">
+                <pic:pic xmlns:pic="http://schemas.openxmlformats.org/drawingml/2006/picture">
+                  <pic:nvPicPr>
+                    <pic:cNvPr id="1" name=""/>
+                    <pic:cNvPicPr/>
+                  </pic:nvPicPr>
+                  <pic:blipFill>
+                    <a:blip r:embed="rId19" cstate="print">
+                      <a:extLst>
+                        <a:ext uri="{28A0092B-C50C-407E-A947-70E740481C1C}">
+                          <a14:useLocalDpi xmlns:a14="http://schemas.microsoft.com/office/drawing/2010/main" val="0"/>
+                        </a:ext>
+                      </a:extLst>
+                    </a:blip>
+                    <a:stretch>
+                      <a:fillRect/>
+                    </a:stretch>
+                  </pic:blipFill>
+                  <pic:spPr>
+                    <a:xfrm>
+                      <a:off x="0" y="0"/>
+                      <a:ext cx="1755252" cy="231569"/>
+                    </a:xfrm>
+                    <a:prstGeom prst="rect">
+                      <a:avLst/>
+                    </a:prstGeom>
+                  </pic:spPr>
+                </pic:pic>
+              </a:graphicData>
+            </a:graphic>
+          </wp:anchor>
+        </w:drawing>
+      </w:r>
+      <w:r>
+        <w:rPr>
+          <w:lang w:val="en-US"/>
+        </w:rPr>
+        <w:drawing>
+          <wp:anchor distT="0" distB="0" distL="114300" distR="114300" simplePos="0" relativeHeight="251679744" behindDoc="0" locked="0" layoutInCell="1" allowOverlap="1" wp14:anchorId="6E5A6009" wp14:editId="3F5BF359">
+            <wp:simplePos x="0" y="0"/>
+            <wp:positionH relativeFrom="column">
+              <wp:posOffset>0</wp:posOffset>
+            </wp:positionH>
+            <wp:positionV relativeFrom="paragraph">
+              <wp:posOffset>2540</wp:posOffset>
+            </wp:positionV>
+            <wp:extent cx="2764155" cy="942340"/>
+            <wp:effectExtent l="0" t="0" r="0" b="0"/>
+            <wp:wrapSquare wrapText="bothSides"/>
+            <wp:docPr id="34" name="Picture 34"/>
+            <wp:cNvGraphicFramePr>
+              <a:graphicFrameLocks xmlns:a="http://schemas.openxmlformats.org/drawingml/2006/main" noChangeAspect="1"/>
+            </wp:cNvGraphicFramePr>
+            <a:graphic xmlns:a="http://schemas.openxmlformats.org/drawingml/2006/main">
+              <a:graphicData uri="http://schemas.openxmlformats.org/drawingml/2006/picture">
+                <pic:pic xmlns:pic="http://schemas.openxmlformats.org/drawingml/2006/picture">
+                  <pic:nvPicPr>
+                    <pic:cNvPr id="1" name=""/>
+                    <pic:cNvPicPr/>
+                  </pic:nvPicPr>
+                  <pic:blipFill>
+                    <a:blip r:embed="rId20" cstate="print">
+                      <a:extLst>
+                        <a:ext uri="{28A0092B-C50C-407E-A947-70E740481C1C}">
+                          <a14:useLocalDpi xmlns:a14="http://schemas.microsoft.com/office/drawing/2010/main" val="0"/>
+                        </a:ext>
+                      </a:extLst>
+                    </a:blip>
+                    <a:stretch>
+                      <a:fillRect/>
+                    </a:stretch>
+                  </pic:blipFill>
+                  <pic:spPr>
+                    <a:xfrm>
+                      <a:off x="0" y="0"/>
+                      <a:ext cx="2764155" cy="942340"/>
+                    </a:xfrm>
+                    <a:prstGeom prst="rect">
+                      <a:avLst/>
+                    </a:prstGeom>
+                  </pic:spPr>
+                </pic:pic>
+              </a:graphicData>
+            </a:graphic>
+          </wp:anchor>
+        </w:drawing>
+      </w:r>
+    </w:p>
+    <w:p>
+      <w:pPr>
+        <w:rPr>
+          <w:lang w:val="en-US"/>
+        </w:rPr>
+      </w:pPr>
+    </w:p>
+    <w:p>
+      <w:pPr>
+        <w:ind w:left="720" w:firstLine="720"/>
+        <w:rPr>
+          <w:i/>
+          <w:lang w:val="en-US"/>
+        </w:rPr>
+      </w:pPr>
+      <w:r>
+        <w:rPr>
+          <w:i/>
+          <w:lang w:val="en-US"/>
+        </w:rPr>
+        <w:t xml:space="preserve">      F</w:t>
+      </w:r>
+      <w:r>
+        <w:rPr>
+          <w:i/>
+          <w:lang w:val="en-US"/>
+        </w:rPr>
+        <w:t>igure 1.</w:t>
+      </w:r>
+      <w:r>
+        <w:rPr>
+          <w:i/>
+          <w:lang w:val="en-US"/>
+        </w:rPr>
+        <w:t>10</w:t>
+      </w:r>
+    </w:p>
+    <w:p>
+      <w:pPr>
+        <w:rPr>
+          <w:lang w:val="en-US"/>
+        </w:rPr>
+      </w:pPr>
+    </w:p>
+    <w:p>
+      <w:pPr>
+        <w:rPr>
+          <w:lang w:val="en-US"/>
+        </w:rPr>
+      </w:pPr>
+    </w:p>
+    <w:p>
+      <w:pPr>
+        <w:rPr>
+          <w:lang w:val="en-US"/>
+        </w:rPr>
+      </w:pPr>
+    </w:p>
+    <w:p>
+      <w:pPr>
+        <w:rPr>
+          <w:i/>
+          <w:lang w:val="en-US"/>
+        </w:rPr>
+      </w:pPr>
+      <w:r>
+        <w:rPr>
+          <w:i/>
+          <w:lang w:val="en-US"/>
+        </w:rPr>
+        <w:t>Figure 1.</w:t>
+      </w:r>
+      <w:r>
+        <w:rPr>
+          <w:i/>
+          <w:lang w:val="en-US"/>
+        </w:rPr>
+        <w:t>9</w:t>
+      </w:r>
+    </w:p>
+    <w:p>
+      <w:pPr>
+        <w:rPr>
+          <w:i/>
+          <w:lang w:val="en-US"/>
+        </w:rPr>
+      </w:pPr>
+    </w:p>
+    <w:p>
+      <w:pPr>
+        <w:rPr>
+          <w:lang w:val="en-US"/>
+        </w:rPr>
+      </w:pPr>
+      <w:r>
+        <w:rPr>
+          <w:lang w:val="en-US"/>
+        </w:rPr>
+        <w:t xml:space="preserve">A one-to-many connection is defined as a single entity, pool owner, being linked to multiple entries of another entity, pool. This is implemented through adding the primary key of the single entity to another entity, which becomes a foreign key, allowing the database to distinguish which entry in the table belongs to which single entity. This physical connection corresponds to our association and aggregation logical connection types in the UML class diagram. Figure 1.8 shows that a pool owner can have zero or more pools but in strict instances, we implemented Figure 1.9 where an entity on the owning side has to own one or more of the owned </w:t>
+      </w:r>
+      <w:r>
+        <w:rPr>
+          <w:lang w:val="en-US"/>
+        </w:rPr>
+        <w:t>entities</w:t>
+      </w:r>
+      <w:r>
+        <w:rPr>
+          <w:lang w:val="en-US"/>
+        </w:rPr>
+        <w:t>.</w:t>
+      </w:r>
+    </w:p>
+    <w:p>
+      <w:pPr>
+        <w:rPr>
+          <w:lang w:val="en-US"/>
+        </w:rPr>
+      </w:pPr>
+    </w:p>
+    <w:p>
+      <w:pPr>
+        <w:rPr>
+          <w:b/>
+          <w:lang w:val="en-US"/>
+        </w:rPr>
+      </w:pPr>
+      <w:r>
+        <w:rPr>
+          <w:b/>
+          <w:lang w:val="en-US"/>
+        </w:rPr>
+        <w:t>Many</w:t>
+      </w:r>
+      <w:r>
+        <w:rPr>
+          <w:b/>
+          <w:lang w:val="en-US"/>
+        </w:rPr>
+        <w:t>-to-</w:t>
+      </w:r>
+      <w:r>
+        <w:rPr>
+          <w:b/>
+          <w:lang w:val="en-US"/>
+        </w:rPr>
+        <w:t>Many</w:t>
+      </w:r>
+    </w:p>
+    <w:p>
+      <w:pPr>
+        <w:rPr>
+          <w:lang w:val="en-US"/>
+        </w:rPr>
+      </w:pPr>
+    </w:p>
+    <w:p>
+      <w:pPr>
+        <w:rPr>
+          <w:lang w:val="en-US"/>
+        </w:rPr>
+      </w:pPr>
+      <w:r>
+        <w:rPr>
+          <w:b/>
+          <w:noProof/>
+          <w:sz w:val="28"/>
+          <w:szCs w:val="28"/>
+          <w:lang w:val="en-US"/>
+        </w:rPr>
+        <mc:AlternateContent>
+          <mc:Choice Requires="wps">
+            <w:drawing>
+              <wp:anchor distT="0" distB="0" distL="114300" distR="114300" simplePos="0" relativeHeight="251677696" behindDoc="0" locked="0" layoutInCell="1" allowOverlap="1" wp14:anchorId="76C12EE6" wp14:editId="282346EA">
+                <wp:simplePos x="0" y="0"/>
+                <wp:positionH relativeFrom="column">
+                  <wp:posOffset>622689</wp:posOffset>
+                </wp:positionH>
+                <wp:positionV relativeFrom="paragraph">
+                  <wp:posOffset>1824461</wp:posOffset>
+                </wp:positionV>
+                <wp:extent cx="398297" cy="241222"/>
+                <wp:effectExtent l="19050" t="19050" r="20955" b="45085"/>
+                <wp:wrapNone/>
+                <wp:docPr id="33" name="Arrow: Striped Right 33"/>
+                <wp:cNvGraphicFramePr/>
+                <a:graphic xmlns:a="http://schemas.openxmlformats.org/drawingml/2006/main">
+                  <a:graphicData uri="http://schemas.microsoft.com/office/word/2010/wordprocessingShape">
+                    <wps:wsp>
+                      <wps:cNvSpPr/>
+                      <wps:spPr>
+                        <a:xfrm rot="10800000">
+                          <a:off x="0" y="0"/>
+                          <a:ext cx="398297" cy="241222"/>
+                        </a:xfrm>
+                        <a:prstGeom prst="stripedRightArrow">
+                          <a:avLst/>
+                        </a:prstGeom>
+                        <a:noFill/>
+                        <a:ln>
+                          <a:solidFill>
+                            <a:srgbClr val="00B0F0"/>
+                          </a:solidFill>
+                        </a:ln>
+                      </wps:spPr>
+                      <wps:style>
+                        <a:lnRef idx="2">
+                          <a:schemeClr val="accent1">
+                            <a:shade val="50000"/>
+                          </a:schemeClr>
+                        </a:lnRef>
+                        <a:fillRef idx="1">
+                          <a:schemeClr val="accent1"/>
+                        </a:fillRef>
+                        <a:effectRef idx="0">
+                          <a:schemeClr val="accent1"/>
+                        </a:effectRef>
+                        <a:fontRef idx="minor">
+                          <a:schemeClr val="lt1"/>
+                        </a:fontRef>
+                      </wps:style>
+                      <wps:bodyPr rot="0" spcFirstLastPara="0" vertOverflow="overflow" horzOverflow="overflow" vert="horz" wrap="square" lIns="91440" tIns="45720" rIns="91440" bIns="45720" numCol="1" spcCol="0" rtlCol="0" fromWordArt="0" anchor="ctr" anchorCtr="0" forceAA="0" compatLnSpc="1">
+                        <a:prstTxWarp prst="textNoShape">
+                          <a:avLst/>
+                        </a:prstTxWarp>
+                        <a:noAutofit/>
+                      </wps:bodyPr>
+                    </wps:wsp>
+                  </a:graphicData>
+                </a:graphic>
+              </wp:anchor>
+            </w:drawing>
+          </mc:Choice>
+          <mc:Fallback>
+            <w:pict>
+              <v:shape w14:anchorId="615D75C9" id="Arrow: Striped Right 33" o:spid="_x0000_s1026" type="#_x0000_t93" style="position:absolute;margin-left:49.05pt;margin-top:143.65pt;width:31.35pt;height:19pt;rotation:180;z-index:251677696;visibility:visible;mso-wrap-style:square;mso-wrap-distance-left:9pt;mso-wrap-distance-top:0;mso-wrap-distance-right:9pt;mso-wrap-distance-bottom:0;mso-position-horizontal:absolute;mso-position-horizontal-relative:text;mso-position-vertical:absolute;mso-position-vertical-relative:text;v-text-anchor:middle" o:gfxdata="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" adj="15059" filled="f" strokecolor="#00b0f0" strokeweight="1pt"/>
+            </w:pict>
+          </mc:Fallback>
+        </mc:AlternateContent>
+      </w:r>
+      <w:r>
+        <w:rPr>
+          <w:b/>
+          <w:noProof/>
+          <w:sz w:val="28"/>
+          <w:szCs w:val="28"/>
+          <w:lang w:val="en-US"/>
+        </w:rPr>
+        <mc:AlternateContent>
+          <mc:Choice Requires="wps">
+            <w:drawing>
+              <wp:anchor distT="0" distB="0" distL="114300" distR="114300" simplePos="0" relativeHeight="251675648" behindDoc="0" locked="0" layoutInCell="1" allowOverlap="1" wp14:anchorId="694152BA" wp14:editId="2210F294">
+                <wp:simplePos x="0" y="0"/>
+                <wp:positionH relativeFrom="column">
+                  <wp:posOffset>162684</wp:posOffset>
+                </wp:positionH>
+                <wp:positionV relativeFrom="paragraph">
+                  <wp:posOffset>813423</wp:posOffset>
+                </wp:positionV>
+                <wp:extent cx="398297" cy="241222"/>
+                <wp:effectExtent l="0" t="19050" r="40005" b="45085"/>
+                <wp:wrapNone/>
+                <wp:docPr id="32" name="Arrow: Striped Right 32"/>
+                <wp:cNvGraphicFramePr/>
+                <a:graphic xmlns:a="http://schemas.openxmlformats.org/drawingml/2006/main">
+                  <a:graphicData uri="http://schemas.microsoft.com/office/word/2010/wordprocessingShape">
+                    <wps:wsp>
+                      <wps:cNvSpPr/>
+                      <wps:spPr>
+                        <a:xfrm>
+                          <a:off x="0" y="0"/>
+                          <a:ext cx="398297" cy="241222"/>
+                        </a:xfrm>
+                        <a:prstGeom prst="stripedRightArrow">
+                          <a:avLst/>
+                        </a:prstGeom>
+                        <a:noFill/>
+                        <a:ln>
+                          <a:solidFill>
+                            <a:srgbClr val="00B0F0"/>
+                          </a:solidFill>
+                        </a:ln>
+                      </wps:spPr>
+                      <wps:style>
+                        <a:lnRef idx="2">
+                          <a:schemeClr val="accent1">
+                            <a:shade val="50000"/>
+                          </a:schemeClr>
+                        </a:lnRef>
+                        <a:fillRef idx="1">
+                          <a:schemeClr val="accent1"/>
+                        </a:fillRef>
+                        <a:effectRef idx="0">
+                          <a:schemeClr val="accent1"/>
+                        </a:effectRef>
+                        <a:fontRef idx="minor">
+                          <a:schemeClr val="lt1"/>
+                        </a:fontRef>
+                      </wps:style>
+                      <wps:bodyPr rot="0" spcFirstLastPara="0" vertOverflow="overflow" horzOverflow="overflow" vert="horz" wrap="square" lIns="91440" tIns="45720" rIns="91440" bIns="45720" numCol="1" spcCol="0" rtlCol="0" fromWordArt="0" anchor="ctr" anchorCtr="0" forceAA="0" compatLnSpc="1">
+                        <a:prstTxWarp prst="textNoShape">
+                          <a:avLst/>
+                        </a:prstTxWarp>
+                        <a:noAutofit/>
+                      </wps:bodyPr>
+                    </wps:wsp>
+                  </a:graphicData>
+                </a:graphic>
+              </wp:anchor>
+            </w:drawing>
+          </mc:Choice>
+          <mc:Fallback>
+            <w:pict>
+              <v:shape w14:anchorId="4EE0715D" id="Arrow: Striped Right 32" o:spid="_x0000_s1026" type="#_x0000_t93" style="position:absolute;margin-left:12.8pt;margin-top:64.05pt;width:31.35pt;height:19pt;z-index:251675648;visibility:visible;mso-wrap-style:square;mso-wrap-distance-left:9pt;mso-wrap-distance-top:0;mso-wrap-distance-right:9pt;mso-wrap-distance-bottom:0;mso-position-horizontal:absolute;mso-position-horizontal-relative:text;mso-position-vertical:absolute;mso-position-vertical-relative:text;v-text-anchor:middle" o:gfxdata="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" adj="15059" filled="f" strokecolor="#00b0f0" strokeweight="1pt"/>
+            </w:pict>
+          </mc:Fallback>
+        </mc:AlternateContent>
+      </w:r>
+      <w:r>
+        <w:rPr>
+          <w:lang w:val="en-US"/>
+        </w:rPr>
+        <w:drawing>
+          <wp:inline distT="0" distB="0" distL="0" distR="0" wp14:anchorId="7F018036" wp14:editId="3638A773">
+            <wp:extent cx="1141171" cy="2984929"/>
+            <wp:effectExtent l="0" t="0" r="1905" b="6350"/>
+            <wp:docPr id="29" name="Picture 29"/>
+            <wp:cNvGraphicFramePr>
+              <a:graphicFrameLocks xmlns:a="http://schemas.openxmlformats.org/drawingml/2006/main" noChangeAspect="1"/>
+            </wp:cNvGraphicFramePr>
+            <a:graphic xmlns:a="http://schemas.openxmlformats.org/drawingml/2006/main">
+              <a:graphicData uri="http://schemas.openxmlformats.org/drawingml/2006/picture">
+                <pic:pic xmlns:pic="http://schemas.openxmlformats.org/drawingml/2006/picture">
+                  <pic:nvPicPr>
+                    <pic:cNvPr id="1" name=""/>
+                    <pic:cNvPicPr/>
+                  </pic:nvPicPr>
+                  <pic:blipFill>
+                    <a:blip r:embed="rId21"/>
+                    <a:stretch>
+                      <a:fillRect/>
+                    </a:stretch>
+                  </pic:blipFill>
+                  <pic:spPr>
+                    <a:xfrm>
+                      <a:off x="0" y="0"/>
+                      <a:ext cx="1170510" cy="3061670"/>
+                    </a:xfrm>
+                    <a:prstGeom prst="rect">
+                      <a:avLst/>
+                    </a:prstGeom>
+                  </pic:spPr>
+                </pic:pic>
+              </a:graphicData>
+            </a:graphic>
+          </wp:inline>
+        </w:drawing>
+      </w:r>
+    </w:p>
+    <w:p>
+      <w:pPr>
+        <w:rPr>
+          <w:lang w:val="en-US"/>
+        </w:rPr>
+      </w:pPr>
+      <w:r>
+        <w:rPr>
+          <w:lang w:val="en-US"/>
+        </w:rPr>
+        <w:t>Figure 1.1</w:t>
+      </w:r>
+      <w:r>
+        <w:rPr>
+          <w:lang w:val="en-US"/>
+        </w:rPr>
+        <w:t>1</w:t>
+      </w:r>
+    </w:p>
+    <w:p>
+      <w:pPr>
+        <w:rPr>
+          <w:lang w:val="en-US"/>
+        </w:rPr>
+      </w:pPr>
+    </w:p>
+    <w:p>
+      <w:pPr>
+        <w:rPr>
+          <w:lang w:val="en-US"/>
+        </w:rPr>
+      </w:pPr>
+      <w:bookmarkStart w:id="18" w:name="_GoBack"/>
+      <w:bookmarkEnd w:id="18"/>
+    </w:p>
+    <w:p>
+      <w:pPr>
+        <w:rPr>
+          <w:lang w:val="en-US"/>
+        </w:rPr>
+      </w:pPr>
+    </w:p>
+    <w:p>
+      <w:pPr>
+        <w:rPr>
+          <w:lang w:val="en-US"/>
+        </w:rPr>
+      </w:pPr>
+    </w:p>
+    <w:p>
+      <w:pPr>
+        <w:rPr>
+          <w:lang w:val="en-US"/>
+        </w:rPr>
+      </w:pPr>
+    </w:p>
+    <w:p>
+      <w:pPr>
+        <w:rPr>
+          <w:lang w:val="en-US"/>
+        </w:rPr>
+      </w:pPr>
+    </w:p>
+    <w:p>
+      <w:pPr>
+        <w:rPr>
+          <w:lang w:val="en-US"/>
+        </w:rPr>
+      </w:pPr>
+    </w:p>
+    <w:p>
+      <w:pPr>
+        <w:rPr>
+          <w:lang w:val="en-US"/>
+        </w:rPr>
+      </w:pPr>
     </w:p>
     <w:p>
       <w:pPr>
@@ -7657,7 +8931,6 @@
           <w:u w:val="single"/>
           <w:lang w:val="en-US"/>
         </w:rPr>
-        <w:lastRenderedPageBreak/>
         <w:t>1.</w:t>
       </w:r>
       <w:r>
@@ -7984,7 +9257,7 @@
                     <pic:cNvPicPr/>
                   </pic:nvPicPr>
                   <pic:blipFill>
-                    <a:blip r:embed="rId16">
+                    <a:blip r:embed="rId22">
                       <a:extLst>
                         <a:ext uri="{28A0092B-C50C-407E-A947-70E740481C1C}">
                           <a14:useLocalDpi xmlns:a14="http://schemas.microsoft.com/office/drawing/2010/main" val="0"/>
@@ -8061,8 +9334,8 @@
       </w:pPr>
     </w:p>
     <w:sectPr>
-      <w:headerReference w:type="default" r:id="rId17"/>
-      <w:footerReference w:type="first" r:id="rId18"/>
+      <w:headerReference w:type="default" r:id="rId23"/>
+      <w:footerReference w:type="first" r:id="rId24"/>
       <w:pgSz w:w="11900" w:h="16840"/>
       <w:pgMar w:top="1440" w:right="1440" w:bottom="1440" w:left="1440" w:header="708" w:footer="708" w:gutter="0"/>
       <w:cols w:space="708"/>
@@ -12159,7 +13432,7 @@
 </file>
 
 <file path=customXml/itemProps1.xml><?xml version="1.0" encoding="utf-8"?>
-<ds:datastoreItem xmlns:ds="http://schemas.openxmlformats.org/officeDocument/2006/customXml" ds:itemID="{8299A069-89EA-4F97-948C-33E7169E6C05}">
+<ds:datastoreItem xmlns:ds="http://schemas.openxmlformats.org/officeDocument/2006/customXml" ds:itemID="{B2DF8CED-E8AB-4B4A-A329-334B4AEDE09A}">
   <ds:schemaRefs>
     <ds:schemaRef ds:uri="http://schemas.openxmlformats.org/officeDocument/2006/bibliography"/>
   </ds:schemaRefs>

</xml_diff>